<commit_message>
Phrase d'accompagnement mise à jour par l'auteur
</commit_message>
<xml_diff>
--- a/L-art-brut-en-chiffres-et-en-tableaux.docx
+++ b/L-art-brut-en-chiffres-et-en-tableaux.docx
@@ -128,7 +128,7 @@
         <w:jc w:val="both"/>
       </w:pPr>
       <w:r>
-        <w:t xml:space="preserve">Pôle hospitalo-universitaire de santé mentale et de thérapeutique, Centre Hospitalier Sainte-Anne, GHU Paris Psychiatrie &amp; Neurosciences, Paris</w:t>
+        <w:t>Pôle hospitalo-universitaire de santé mentale et de thérapeutique, Centre Hospitalier Sainte-Anne, GHU Paris Psychiatrie &amp; Neurosciences, Paris</w:t>
       </w:r>
     </w:p>
     <w:p>
@@ -185,7 +185,7 @@
         <w:jc w:val="both"/>
       </w:pPr>
       <w:r>
-        <w:t xml:space="preserve">Ce document accompagne l’article ‘Humanités numériques et art brut : ce que la machine mesure dans le dessin’, et n’a pas été publié avec lui. Il en rassemble le volet technique en deux parties. La </w:t>
+        <w:t xml:space="preserve">Ce document accompagne l’article ‘Humanités numériques et art brut : ce que la machine mesure dans le dessin’. La </w:t>
       </w:r>
       <w:r>
         <w:rPr>
@@ -236,7 +236,7 @@
         <w:jc w:val="both"/>
       </w:pPr>
       <w:r>
-        <w:t xml:space="preserve">Comment affiner la description des caractéristiques formelles de l’image et constituer un vocabulaire de mesures suffisamment fin et reproductible pour entreprendre de le rattacher à des mécanismes cognitifs ? Le Data Challenge Outs[AI]der, qui sera lancé en automne 2027 s’inscrit dans cette perspective.</w:t>
+        <w:t>Comment affiner la description des caractéristiques formelles de l’image et constituer un vocabulaire de mesures suffisamment fin et reproductible pour entreprendre de le rattacher à des mécanismes cognitifs ? Le Data Challenge Outs[AI]der, qui sera lancé en automne 2027 s’inscrit dans cette perspective.</w:t>
       </w:r>
       <w:r>
         <w:rPr>
@@ -247,9 +247,11 @@
         <w:footnoteReference w:id="2"/>
       </w:r>
       <w:r>
-        <w:t xml:space="preserve"> Il s’agit d’une compétition internationale en science des données organisée par le Groupe hospitalo-universitaire Paris Psychiatrie et Neurosciences (GHU) et l’hôpital Necker - Enfants malades, avec pour objectif d’identifier des caractéristiques formelles d’œuvres produites par des artistes-patients issues de la collection du MAHHSA. Cette initiative vise, dans un second </w:t>
+        <w:t xml:space="preserve"> Il s’agit d’une compétition internationale en science des données organisée par le Groupe hospitalo-universitaire Paris Psychiatrie et Neurosciences (GHU) et l’hôpital Necker - Enfants malades, avec pour objectif d’identifier des caractéristiques formelles d’œuvres produites par des artistes-patients issues de la collection du MAHHSA. Cette initiative vise, dans un second temps, à évaluer des liens entre travaux d’art-thérapie et troubles psychiatriques. Des équipes du </w:t>
+      </w:r>
+      <w:r>
         <w:lastRenderedPageBreak/>
-        <w:t xml:space="preserve">temps, à évaluer des liens entre travaux d’art-thérapie et troubles psychiatriques. Des équipes du monde entier seront mises en concurrence pour développer le modèle le plus performant dans la caractérisation formelle des œuvres d’art brut et l’établissement de liens avec des diagnostics psychiatriques. Cette compétition prend pour premier terrain d’expérimentation un vaste corpus numérisé issu des collections du MAHHSA, constitué d’œuvres produites dans des contextes psychiatriques et hospitaliers variés. L’objectif de la première étape d’Outs[AI]der est volontairement indépendant de toute hypothèse clinique, puisqu’il s’agit de développer et de comparer des méthodes capables de décrire de manière reproductible les caractéristiques formelles des œuvres, à savoir, entre autres, la composition, la densité, la couleur, la texture, l’organisation spatiale ou la récurrence de motifs, de façon à interroger les caractéristiques permettant de structurer et de comparer de larges ensembles d’images. Dans un second temps, les modèles pourront être appliqués à un corpus distinct de productions picturales associé à des données cliniques anonymisées, afin d’examiner l’existence éventuelle de relations entre certaines propriétés formelles et des variables cliniques. Cette architecture en deux temps permet de dissocier la caractérisation des œuvres de l’hypothèse selon laquelle les images contiendraient une signature visuelle de la pathologie. Dans ce contexte, nous proposons ici une analyse critique des différentes approches computationnelles développées à ce jour pour explorer la forme et la signification clinique des œuvres des artistes-patients, avec pour perspective leur mise à l’épreuve lors du déroulement du Data Challenge Outs[AI]der.</w:t>
+        <w:t>monde entier seront mises en concurrence pour développer le modèle le plus performant dans la caractérisation formelle des œuvres d’art brut et l’établissement de liens avec des diagnostics psychiatriques. Cette compétition prend pour premier terrain d’expérimentation un vaste corpus numérisé issu des collections du MAHHSA, constitué d’œuvres produites dans des contextes psychiatriques et hospitaliers variés. L’objectif de la première étape d’Outs[AI]der est volontairement indépendant de toute hypothèse clinique, puisqu’il s’agit de développer et de comparer des méthodes capables de décrire de manière reproductible les caractéristiques formelles des œuvres, à savoir, entre autres, la composition, la densité, la couleur, la texture, l’organisation spatiale ou la récurrence de motifs, de façon à interroger les caractéristiques permettant de structurer et de comparer de larges ensembles d’images. Dans un second temps, les modèles pourront être appliqués à un corpus distinct de productions picturales associé à des données cliniques anonymisées, afin d’examiner l’existence éventuelle de relations entre certaines propriétés formelles et des variables cliniques. Cette architecture en deux temps permet de dissocier la caractérisation des œuvres de l’hypothèse selon laquelle les images contiendraient une signature visuelle de la pathologie. Dans ce contexte, nous proposons ici une analyse critique des différentes approches computationnelles développées à ce jour pour explorer la forme et la signification clinique des œuvres des artistes-patients, avec pour perspective leur mise à l’épreuve lors du déroulement du Data Challenge Outs[AI]der.</w:t>
       </w:r>
     </w:p>
     <w:p>
@@ -299,7 +301,7 @@
         <w:jc w:val="both"/>
       </w:pPr>
       <w:r>
-        <w:t xml:space="preserve">Rapidement après leurs premières applications, les méthodes computationnelles ont servi à affiner l’attribution d’œuvres d’art, avec l’objectif de repérer des contrefaçons, une démarche qui s’apparente par son principe aux questions posées par Outs[AI]der (§11 à §14) : distinguer les dessins authentiques de Bruegel des imitations ; identifier les van Gogh autographes parmi les copies tardives ; segmenter trois cents dessins de Picasso, Matisse et Schiele en traits individuels pour montrer que le trait porte une signature personnelle presque impossible à imiter.</w:t>
+        <w:t>Rapidement après leurs premières applications, les méthodes computationnelles ont servi à affiner l’attribution d’œuvres d’art, avec l’objectif de repérer des contrefaçons, une démarche qui s’apparente par son principe aux questions posées par Outs[AI]der (§11 à §14) : distinguer les dessins authentiques de Bruegel des imitations ; identifier les van Gogh autographes parmi les copies tardives ; segmenter trois cents dessins de Picasso, Matisse et Schiele en traits individuels pour montrer que le trait porte une signature personnelle presque impossible à imiter.</w:t>
       </w:r>
       <w:r>
         <w:rPr>
@@ -310,9 +312,11 @@
         <w:footnoteReference w:id="4"/>
       </w:r>
       <w:r>
-        <w:t xml:space="preserve"> Dans ces </w:t>
+        <w:t xml:space="preserve"> Dans ces approches, chaque œuvre prend position dans un espace de similarité construit sans a priori, </w:t>
+      </w:r>
+      <w:r>
         <w:lastRenderedPageBreak/>
-        <w:t>approches, chaque œuvre prend position dans un espace de similarité construit sans a priori, permettant de quantifier sa distance avec le corpus considéré comme authentique. Dans le domaine de l’art brut, cette approche rencontre d’emblée un obstacle : le corpus témoin peut contenir des œuvres d’artistes ayant présenté des troubles psychiatriques</w:t>
+        <w:t>permettant de quantifier sa distance avec le corpus considéré comme authentique. Dans le domaine de l’art brut, cette approche rencontre d’emblée un obstacle : le corpus témoin peut contenir des œuvres d’artistes ayant présenté des troubles psychiatriques</w:t>
       </w:r>
       <w:r>
         <w:rPr>
@@ -412,7 +416,7 @@
         <w:t>Figure S1</w:t>
       </w:r>
       <w:r>
-        <w:t xml:space="preserve">. Classification de l’Outsider Art parmi les styles de WikiArt. Réseau ResNet-18 entraîné à situer l’Outsider Art parmi neuf styles canoniques de WikiArt. (A) Exactitude de la classification pour chaque paire de styles, en pourcentage ; hors diagonale, les valeurs les plus basses de la ligne « Outsider » sont obtenues avec le cubisme (62,3 %) et l’expressionnisme (62,5 %), les deux styles dont l’art brut se distingue le moins bien, pour une exactitude moyenne de 72,49 %. (B) Exactitude en entraînement et en validation au fil des époques : le maximum atteint 85,0 % en entraînement contre 61,2 % en validation, écart qui signale un surapprentissage. D’après Roberto, Ortego &amp; Davis (2020), figs. 5-6.</w:t>
+        <w:t>. Classification de l’Outsider Art parmi les styles de WikiArt. Réseau ResNet-18 entraîné à situer l’Outsider Art parmi neuf styles canoniques de WikiArt. (A) Exactitude de la classification pour chaque paire de styles, en pourcentage ; hors diagonale, les valeurs les plus basses de la ligne « Outsider » sont obtenues avec le cubisme (62,3 %) et l’expressionnisme (62,5 %), les deux styles dont l’art brut se distingue le moins bien, pour une exactitude moyenne de 72,49 %. (B) Exactitude en entraînement et en validation au fil des époques : le maximum atteint 85,0 % en entraînement contre 61,2 % en validation, écart qui signale un surapprentissage. D’après Roberto, Ortego &amp; Davis (2020), figs. 5-6.</w:t>
       </w:r>
     </w:p>
     <w:p>
@@ -688,7 +692,7 @@
         <w:t>Tableau 1</w:t>
       </w:r>
       <w:r>
-        <w:t xml:space="preserve">. Les quatre familles de méthodes computationnelles d’analyse d’images mobilisables pour l’étude d’un corpus d’art brut. Certaines approches relèvent de deux groupes ou plus. Le détail de chaque famille est donné dans la partie II ; la colonne « Sections » renvoie à sa numérotation.</w:t>
+        <w:t>. Les quatre familles de méthodes computationnelles d’analyse d’images mobilisables pour l’étude d’un corpus d’art brut. Certaines approches relèvent de deux groupes ou plus. Le détail de chaque famille est donné dans la partie II ; la colonne « Sections » renvoie à sa numérotation.</w:t>
       </w:r>
     </w:p>
     <w:p>
@@ -708,7 +712,7 @@
         <w:jc w:val="both"/>
       </w:pPr>
       <w:r>
-        <w:t xml:space="preserve">Certains outils permettent de mesurer la matière du geste sans faire sens du sujet représenté, en quantifiant par exemple la pression, la répétition, la densité d’occupation, ou la régularité d’un hachurage (§3 à §6). Une image peut être décrite par la vitesse à laquelle ses valeurs varient dans l’espace - variations lentes pour un grand aplat, rapides pour des hachures fines, distinction ancrée dans la physiologie de la vision elle-même : le cortex visuel primaire code l’image selon des filtres sensibles à différentes échelles, classiquement décrits comme un gradient postéro-antérieur du plus concret au plus abstrait.</w:t>
+        <w:t>Certains outils permettent de mesurer la matière du geste sans faire sens du sujet représenté, en quantifiant par exemple la pression, la répétition, la densité d’occupation, ou la régularité d’un hachurage (§3 à §6). Une image peut être décrite par la vitesse à laquelle ses valeurs varient dans l’espace - variations lentes pour un grand aplat, rapides pour des hachures fines, distinction ancrée dans la physiologie de la vision elle-même : le cortex visuel primaire code l’image selon des filtres sensibles à différentes échelles, classiquement décrits comme un gradient postéro-antérieur du plus concret au plus abstrait.</w:t>
       </w:r>
       <w:r>
         <w:rPr>
@@ -728,7 +732,7 @@
         <w:jc w:val="both"/>
       </w:pPr>
       <w:r>
-        <w:t xml:space="preserve">Par exemple, dans l’une des rares études à confronter directement une mesure computationnelle à une catégorie clinique, Graham et Meng ont comparé des peintures de cinq artistes atteints de schizophrénie à un large corpus d’artistes sans diagnostic, et observé un contenu fréquentiel significativement différent.</w:t>
+        <w:t>Par exemple, dans l’une des rares études à confronter directement une mesure computationnelle à une catégorie clinique, Graham et Meng ont comparé des peintures de cinq artistes atteints de schizophrénie à un large corpus d’artistes sans diagnostic, et observé un contenu fréquentiel significativement différent.</w:t>
       </w:r>
       <w:r>
         <w:rPr>
@@ -808,7 +812,7 @@
         <w:t>Figure S2</w:t>
       </w:r>
       <w:r>
-        <w:t xml:space="preserve">. Détails de peintures ordonnés par la pente du spectre de Fourier. Douze détails de peintures présentés par pente décroissante du spectre de puissance de Fourier, dont la valeur est portée sous chaque vignette, de -1,16 à -1,74. La pente décrit la répartition de l’énergie entre basses et hautes fréquences spatiales, c’est-à-dire l’équilibre entre grandes masses et détails fins. Le contenu fréquentiel diffère significativement entre les peintures d’artistes atteints de schizophrénie ou de trouble schizo-affectif et celles d’artistes sans diagnostic. D’après Graham &amp; Meng (2011).</w:t>
+        <w:t>. Détails de peintures ordonnés par la pente du spectre de Fourier. Douze détails de peintures présentés par pente décroissante du spectre de puissance de Fourier, dont la valeur est portée sous chaque vignette, de -1,16 à -1,74. La pente décrit la répartition de l’énergie entre basses et hautes fréquences spatiales, c’est-à-dire l’équilibre entre grandes masses et détails fins. Le contenu fréquentiel diffère significativement entre les peintures d’artistes atteints de schizophrénie ou de trouble schizo-affectif et celles d’artistes sans diagnostic. D’après Graham &amp; Meng (2011).</w:t>
       </w:r>
     </w:p>
     <w:p>
@@ -851,6 +855,8 @@
       </w:r>
       <w:r>
         <w:t xml:space="preserve"> : un petit nombre de mesures statistiques peut faire émerger des </w:t>
+      </w:r>
+      <w:r>
         <w:lastRenderedPageBreak/>
         <w:t>regroupements compatibles (§14) avec des distinctions historiques et stylistiques établies de manière qualitative par les experts. Des notions psychanalytiques - l’horreur du vide, la prolifération ornementale, l’autonomisation du système formel décrite par Prinzhorn, la perte de la hiérarchie figure-fond - peuvent désormais être confrontées à des descriptions formelles quantifiables (§7, §9, §10). Ces mesures rendent compte de l’architecture d’ensemble : le rapport entre le plein et le vide, la présence ou l’absence de hiérarchies, la répétition de motifs à différentes échelles.</w:t>
       </w:r>
@@ -920,7 +926,7 @@
         <w:t>Figure S3</w:t>
       </w:r>
       <w:r>
-        <w:t xml:space="preserve">. Cartographie de l’histoire de l’art dans le plan complexité-entropie. Position moyenne des grandes périodes de la peinture occidentale dans le plan entropie de permutation (H) / complexité statistique (C), calculée sur près de cent quarante mille œuvres et reliée par ordre chronologique. Trois ensembles se détachent sans hypothèse a priori : Renaissance, néoclassicisme et romantisme (1031-1836) ; art moderne (1836-1952) ; art contemporain et postmoderne (1962-2016). La trajectoire n’est pas monotone : la complexité baisse et l’entropie monte de la Renaissance à l’art moderne, puis le mouvement s’inverse au XXᵉ siècle, l’art contemporain occupant la région de complexité élevée et d’entropie basse. D’après Sigaki, Perc &amp; Ribeiro (2018).</w:t>
+        <w:t>. Cartographie de l’histoire de l’art dans le plan complexité-entropie. Position moyenne des grandes périodes de la peinture occidentale dans le plan entropie de permutation (H) / complexité statistique (C), calculée sur près de cent quarante mille œuvres et reliée par ordre chronologique. Trois ensembles se détachent sans hypothèse a priori : Renaissance, néoclassicisme et romantisme (1031-1836) ; art moderne (1836-1952) ; art contemporain et postmoderne (1962-2016). La trajectoire n’est pas monotone : la complexité baisse et l’entropie monte de la Renaissance à l’art moderne, puis le mouvement s’inverse au XXᵉ siècle, l’art contemporain occupant la région de complexité élevée et d’entropie basse. D’après Sigaki, Perc &amp; Ribeiro (2018).</w:t>
       </w:r>
     </w:p>
     <w:p>
@@ -930,6 +936,8 @@
       </w:pPr>
       <w:r>
         <w:t xml:space="preserve">En suivant une logique similaire, plusieurs travaux récents ont cherché à prédire les évaluations humaines de la créativité d’une œuvre, c’est-à-dire les scores donnés par des évaluateurs sur des dimensions comme l’originalité, la richesse imaginative ou la charge symbolique. Spee et al. (2023) ont montré, sur un corpus de peintures occidentales, que des dimensions sémantiques annotées par des humains (symbolisme, émotionnalité, imagination) prédisent ces évaluations mieux que les seules cartes de saillance (§7.4.4), ce qui souligne que les propriétés bas niveau ne </w:t>
+      </w:r>
+      <w:r>
         <w:lastRenderedPageBreak/>
         <w:t>suffisent pas à rendre compte du jugement esthétique (§16).</w:t>
       </w:r>
@@ -953,7 +961,7 @@
         <w:footnoteReference w:id="12"/>
       </w:r>
       <w:r>
-        <w:t xml:space="preserve">, qui étendent ce type d’évaluation à grande échelle. Leur changement d’échelle ne doit cependant pas être confondu avec une objectivation de la créativité elle-même : il correspond avant tout à l’automatisation de critères d’évaluation préalablement définis ou appris à partir de la cognition humaine. Certaines équipes s’intéressent à décrire les processus cognitifs sous-tendant la pensée créative,</w:t>
+        <w:t>, qui étendent ce type d’évaluation à grande échelle. Leur changement d’échelle ne doit cependant pas être confondu avec une objectivation de la créativité elle-même : il correspond avant tout à l’automatisation de critères d’évaluation préalablement définis ou appris à partir de la cognition humaine. Certaines équipes s’intéressent à décrire les processus cognitifs sous-tendant la pensée créative,</w:t>
       </w:r>
       <w:r>
         <w:rPr>
@@ -1084,7 +1092,7 @@
         <w:jc w:val="both"/>
       </w:pPr>
       <w:r>
-        <w:t xml:space="preserve">Le suivi longitudinal est au cœur de la pratique psychiatrique : au bout d’un certain temps, chaque sujet devient son propre témoin, et les confusions liées à la formation artistique, à la culture ou au matériel disponible se neutralisent en partie. Il est possible de suivre dans le temps la palette, la densité, la composition, la complexité, ou mesurer la distance entre œuvres successives pour repérer ruptures brusques, dérives lentes et phases de stabilité (§15).</w:t>
+        <w:t>Le suivi longitudinal est au cœur de la pratique psychiatrique : au bout d’un certain temps, chaque sujet devient son propre témoin, et les confusions liées à la formation artistique, à la culture ou au matériel disponible se neutralisent en partie. Il est possible de suivre dans le temps la palette, la densité, la composition, la complexité, ou mesurer la distance entre œuvres successives pour repérer ruptures brusques, dérives lentes et phases de stabilité (§15).</w:t>
       </w:r>
     </w:p>
     <w:p>
@@ -1211,7 +1219,7 @@
         <w:t xml:space="preserve">. Alchemy, drip painting de Jackson Pollock (1947). </w:t>
       </w:r>
       <w:r>
-        <w:t xml:space="preserve">Œuvre sur laquelle a été estimée par comptage de boîtes une dimension fractale d’environ 1,5. La portée de cette mesure a été discutée par la suite, des tracés sans rapport avec l’œuvre produisant la même valeur. D’après Taylor, Micolich &amp; Jonas (1999).</w:t>
+        <w:t>Œuvre sur laquelle a été estimée par comptage de boîtes une dimension fractale d’environ 1,5. La portée de cette mesure a été discutée par la suite, des tracés sans rapport avec l’œuvre produisant la même valeur. D’après Taylor, Micolich &amp; Jonas (1999).</w:t>
       </w:r>
     </w:p>
     <w:p>
@@ -1222,7 +1230,7 @@
       <w:bookmarkStart w:id="10" w:name="Xbe1c47bb1c3fbbe3c604cf5aaf666b0de8386ac"/>
       <w:bookmarkEnd w:id="9"/>
       <w:r>
-        <w:t xml:space="preserve">I.8. L’analyse d’images en psychiatrie computationnelle : définir la question</w:t>
+        <w:t>I.8. L’analyse d’images en psychiatrie computationnelle : définir la question</w:t>
       </w:r>
     </w:p>
     <w:p>
@@ -1267,7 +1275,7 @@
       </w:pPr>
       <w:r>
         <w:lastRenderedPageBreak/>
-        <w:t xml:space="preserve">Reste la distinction entre réduction ontologique et réduction méthodologique. La première postule que la souffrance psychique correspond aux données qui la décrivent - aliénation contre laquelle la clinique a raison de se prémunir. La seconde utilise la quantification comme prisme heuristique, sans nier l’irréductibilité du vécu. Une clinique sans mesure reproductible condamne au particularisme, où chaque praticien impose une science incommunicable et incontestable. Une mesure peut être réfutée ; une intuition clinique opaque, beaucoup plus difficilement.</w:t>
+        <w:t>Reste la distinction entre réduction ontologique et réduction méthodologique. La première postule que la souffrance psychique correspond aux données qui la décrivent - aliénation contre laquelle la clinique a raison de se prémunir. La seconde utilise la quantification comme prisme heuristique, sans nier l’irréductibilité du vécu. Une clinique sans mesure reproductible condamne au particularisme, où chaque praticien impose une science incommunicable et incontestable. Une mesure peut être réfutée ; une intuition clinique opaque, beaucoup plus difficilement.</w:t>
       </w:r>
     </w:p>
     <w:p>
@@ -1279,7 +1287,7 @@
       <w:bookmarkEnd w:id="2"/>
       <w:bookmarkEnd w:id="10"/>
       <w:r>
-        <w:t xml:space="preserve">Partie II. Répertoire détaillé des méthodes d’analyse computationnelle</w:t>
+        <w:t>Partie II. Répertoire détaillé des méthodes d’analyse computationnelle</w:t>
       </w:r>
     </w:p>
     <w:p>
@@ -1308,7 +1316,7 @@
         <w:jc w:val="both"/>
       </w:pPr>
       <w:r>
-        <w:t xml:space="preserve">Le Descriptive Assessment for Psychiatric Art (Hacking, Foreman et Belcher, 1996 ; Hacking et Foreman, 2000) propose un protocole standardisé d’évaluation visuelle des peintures réalisées par des patients psychiatriques. L’observateur humain renseigne une série de paramètres descriptifs (proportion d’espace pictural occupée, surface colorée, intensité de pression du trait, présence ou non d’éléments figuratifs identifiables) selon une grille discrète. L’objectif est de produire des variables comparables entre patients et dans le temps, sans préjuger d’une signification clinique ni utiliser de traitement d’image au sens informatique.</w:t>
+        <w:t>Le Descriptive Assessment for Psychiatric Art (Hacking, Foreman et Belcher, 1996 ; Hacking et Foreman, 2000) propose un protocole standardisé d’évaluation visuelle des peintures réalisées par des patients psychiatriques. L’observateur humain renseigne une série de paramètres descriptifs (proportion d’espace pictural occupée, surface colorée, intensité de pression du trait, présence ou non d’éléments figuratifs identifiables) selon une grille discrète. L’objectif est de produire des variables comparables entre patients et dans le temps, sans préjuger d’une signification clinique ni utiliser de traitement d’image au sens informatique.</w:t>
       </w:r>
     </w:p>
     <w:p>
@@ -1369,6 +1377,8 @@
       </w:pPr>
       <w:r>
         <w:t xml:space="preserve">Sur un registre méthodologique distinct, Sigaki, Perc et Ribeiro (2018) ont placé près de cent quarante mille peintures dans un espace ordre-désordre / simplicité-complexité, à l’aide de l’entropie de permutation et de la complexité statistique (cf. §8). Sans hypothèse clinique, ils retrouvent les grandes transitions stylistiques de l’histoire de l’art (passage du figuratif à l’abstrait, </w:t>
+      </w:r>
+      <w:r>
         <w:lastRenderedPageBreak/>
         <w:t>ruptures du XXe siècle) (figure S3, partie I). Cette étude illustre qu’un petit nombre de descripteurs statistiques bien choisis peut suffire à reconstruire des distinctions historiquement et perceptuellement pertinentes, et fonde l’usage descriptif non diagnostique des mesures d’information sur de grands corpus picturaux.</w:t>
       </w:r>
@@ -1390,7 +1400,7 @@
         <w:jc w:val="both"/>
       </w:pPr>
       <w:r>
-        <w:t xml:space="preserve">Deux travaux publiés simultanément par Roberto, Ortego et Davis (2020) ont, à notre connaissance pour la première fois, entraîné un réseau de neurones convolutif (ResNet-18) à classifier des œuvres d’art brut en regard d’œuvres conventionnelles (issues de WikiArt). Sur la tâche binaire de classification, ces auteurs rapportent une précision de 84,3 %. Sur la tâche multi-classe (art brut positionné parmi vingt-six styles canoniques de WikiArt – cubisme, expressionnisme, surréalisme, baroque, romantisme entre autres), l’art brut se classifie avec une précision (≈72 %) comparable à celle des styles traditionnels. Ce résultat montre qu’un classifieur générique peut reconnaître l’art brut comme un style cohérent, ce qui suggère l’existence de régularités visuelles partageables ; d’autre part, la confusion la plus fréquente était observée avec le cubisme et l’expressionnisme, deux mouvements précisément ouverts à l’influence de l’art brut au XXe siècle. Roberto et Davis (2020) ont parallèlement proposé une ontologisation de l’art brut s’appuyant sur CIDOC-CRM</w:t>
+        <w:t>Deux travaux publiés simultanément par Roberto, Ortego et Davis (2020) ont, à notre connaissance pour la première fois, entraîné un réseau de neurones convolutif (ResNet-18) à classifier des œuvres d’art brut en regard d’œuvres conventionnelles (issues de WikiArt). Sur la tâche binaire de classification, ces auteurs rapportent une précision de 84,3 %. Sur la tâche multi-classe (art brut positionné parmi vingt-six styles canoniques de WikiArt – cubisme, expressionnisme, surréalisme, baroque, romantisme entre autres), l’art brut se classifie avec une précision (≈72 %) comparable à celle des styles traditionnels. Ce résultat montre qu’un classifieur générique peut reconnaître l’art brut comme un style cohérent, ce qui suggère l’existence de régularités visuelles partageables ; d’autre part, la confusion la plus fréquente était observée avec le cubisme et l’expressionnisme, deux mouvements précisément ouverts à l’influence de l’art brut au XXe siècle. Roberto et Davis (2020) ont parallèlement proposé une ontologisation de l’art brut s’appuyant sur CIDOC-CRM</w:t>
       </w:r>
       <w:r>
         <w:rPr>
@@ -1472,6 +1482,8 @@
       </w:pPr>
       <w:r>
         <w:t xml:space="preserve">L’analyse colorimétrique extrait, à partir d’une œuvre numérisée, des paramètres décrivant l’usage de la couleur. Elle repose sur un fait physiologique : la vision humaine des couleurs est trichromate. Trois types de photorécepteurs rétiniens, les cônes, sont sensibles chacun à une bande de longueurs d’onde dominante : cônes L (Long), pic vers 564 nm, perçu rouge ; cônes M (Medium), pic vers 534 nm, perçu vert ; cônes S (Short), pic vers 420 nm, perçu bleu. La colorimétrie cherche à formaliser cette perception trichromate dans un espace de couleurs, c’est-à-dire un système de </w:t>
+      </w:r>
+      <w:r>
         <w:lastRenderedPageBreak/>
         <w:t>coordonnées dans lequel chaque couleur correspond à un point, et où l’on peut calculer une distance entre deux couleurs (Wyszecki et Stiles, 1982 ; Fairchild, 2013).</w:t>
       </w:r>
@@ -1484,7 +1496,7 @@
       <w:bookmarkStart w:id="22" w:name="trois-espaces-de-couleur-usuels"/>
       <w:bookmarkEnd w:id="21"/>
       <w:r>
-        <w:t xml:space="preserve">3.2. Trois espaces de couleur usuels</w:t>
+        <w:t>3.2. Trois espaces de couleur usuels</w:t>
       </w:r>
     </w:p>
     <w:p>
@@ -1511,7 +1523,7 @@
         <w:jc w:val="both"/>
       </w:pPr>
       <w:r>
-        <w:t xml:space="preserve">Le système CIELAB, défini par la Commission Internationale de l’Éclairage (CIE, 1976) repose sur la définition d’un observateur standard (selon les principes établis par la CIE en 1931) et vise à rendre compte de la perception humaine. Chaque couleur est décrite par trois coordonnées : L* est la clarté perçue, du noir (L* = 0) au blanc (L* = 100) ; a* est la coordonnée sur un axe vert-rouge (négatif vers le vert, positif vers le rouge) ; b* est la coordonnée sur un axe bleu-jaune. Une propriété essentielle de CIELAB est sa quasi-uniformité perceptuelle : la distance euclidienne (ΔE) entre deux points de l’espace correspond, en première approximation, à la différence ressentie par un observateur humain (Sharma, Wu et Dalal, 2005).</w:t>
+        <w:t>Le système CIELAB, défini par la Commission Internationale de l’Éclairage (CIE, 1976) repose sur la définition d’un observateur standard (selon les principes établis par la CIE en 1931) et vise à rendre compte de la perception humaine. Chaque couleur est décrite par trois coordonnées : L* est la clarté perçue, du noir (L* = 0) au blanc (L* = 100) ; a* est la coordonnée sur un axe vert-rouge (négatif vers le vert, positif vers le rouge) ; b* est la coordonnée sur un axe bleu-jaune. Une propriété essentielle de CIELAB est sa quasi-uniformité perceptuelle : la distance euclidienne (ΔE) entre deux points de l’espace correspond, en première approximation, à la différence ressentie par un observateur humain (Sharma, Wu et Dalal, 2005).</w:t>
       </w:r>
     </w:p>
     <w:p>
@@ -1551,7 +1563,7 @@
       <w:bookmarkStart w:id="24" w:name="X578bff7590318e06becd3466f03a8d5d08d46f5"/>
       <w:bookmarkEnd w:id="23"/>
       <w:r>
-        <w:t xml:space="preserve">3.4. Apports et limites pour l’étude de l’art brut</w:t>
+        <w:t>3.4. Apports et limites pour l’étude de l’art brut</w:t>
       </w:r>
     </w:p>
     <w:p>
@@ -1561,6 +1573,8 @@
       </w:pPr>
       <w:r>
         <w:t xml:space="preserve">L’analyse colorimétrique permet d’objectiver des impressions formulées de manière qualitative (‘palette resserrée’, ‘couleurs saturées’, ‘aspect monochrome’, ‘contraste brutal’) et de produire des comparaisons statistiquement valides entre corpus. Sa principale limite tient à la chaîne de numérisation : la couleur mesurée sur un fichier numérique dépend de l’éclairage de la prise de vue, du capteur, de la balance des blancs, du vieillissement des pigments, du support et de la compression (Kim et al., 2014 ; Berns, 2019). Une étape de calibration colorimétrique, voire de </w:t>
+      </w:r>
+      <w:r>
         <w:lastRenderedPageBreak/>
         <w:t>comparaison sur des sous-corpus reproduits dans des conditions équivalentes, est indispensable pour appliquer les méthodes colorimétriques à l’étude d’un corpus d’art brut.</w:t>
       </w:r>
@@ -1593,7 +1607,7 @@
         <w:jc w:val="both"/>
       </w:pPr>
       <w:r>
-        <w:t xml:space="preserve">Une image peut être décrite non plus par la valeur de chaque pixel, mais par la vitesse à laquelle ces valeurs varient dans l’espace. Les variations lentes (un grand aplat sombre, un dégradé progressif) sont dites basse fréquence ; les variations rapides (hachures fines, contours nets, granulation du papier) sont dites haute fréquence. Cette distinction est ancrée dans la physiologie visuelle : la rétine et le cortex visuel primaire codent l’image selon des bancs de filtres sensibles à différentes échelles spatiales (Campbell et Robson, 1968 ; De Valois et De Valois, 1990).</w:t>
+        <w:t>Une image peut être décrite non plus par la valeur de chaque pixel, mais par la vitesse à laquelle ces valeurs varient dans l’espace. Les variations lentes (un grand aplat sombre, un dégradé progressif) sont dites basse fréquence ; les variations rapides (hachures fines, contours nets, granulation du papier) sont dites haute fréquence. Cette distinction est ancrée dans la physiologie visuelle : la rétine et le cortex visuel primaire codent l’image selon des bancs de filtres sensibles à différentes échelles spatiales (Campbell et Robson, 1968 ; De Valois et De Valois, 1990).</w:t>
       </w:r>
     </w:p>
     <w:p>
@@ -1613,7 +1627,7 @@
         <w:jc w:val="both"/>
       </w:pPr>
       <w:r>
-        <w:t xml:space="preserve">La transformée de Fourier est un outil mathématique qui permet d’écrire toute fonction (et donc toute image) comme une somme d’ondes simples (sinusoïdes) de différentes fréquences. Concrètement, on transforme une image (matrice de pixels) en une nouvelle matrice de la même taille, dans laquelle chaque case ne représente plus un point de l’espace, mais une fréquence spatiale (et une orientation). La valeur de chaque case mesure ‘combien’ cette fréquence est présente dans l’image. La transformée de Fourier est l’outil fondamental de l’analyse harmonique (Mallat, 2008 ; Bracewell, 1986).</w:t>
+        <w:t>La transformée de Fourier est un outil mathématique qui permet d’écrire toute fonction (et donc toute image) comme une somme d’ondes simples (sinusoïdes) de différentes fréquences. Concrètement, on transforme une image (matrice de pixels) en une nouvelle matrice de la même taille, dans laquelle chaque case ne représente plus un point de l’espace, mais une fréquence spatiale (et une orientation). La valeur de chaque case mesure ‘combien’ cette fréquence est présente dans l’image. La transformée de Fourier est l’outil fondamental de l’analyse harmonique (Mallat, 2008 ; Bracewell, 1986).</w:t>
       </w:r>
     </w:p>
     <w:p>
@@ -1642,7 +1656,7 @@
         <w:jc w:val="both"/>
       </w:pPr>
       <w:r>
-        <w:t xml:space="preserve">Une observation centrale en statistiques de l’image naturelle est que pour la plupart des images photographiques du monde réel, le spectre de puissance décroît avec la fréquence selon une loi proche de 1/fβ, avec β généralement compris entre 1,5 et 2,5. Lorsque β = 2, on parle de spectre ‘en 1/f²’ (Field, 1987 ; Ruderman, 1994 ; Tolhurst, Tadmor et Chao, 1992). Une telle loi signifie que l’image est statistiquement invariante par changement d’échelle : on retrouve la même structure de variations à toutes les tailles. Plusieurs études ont montré que les œuvres d’art, les cartoons, les comics et les mangas présentent une statistique en 1/f² assez stable (Graham et Field, 2007 ; Koch, Denzler et Redies, 2010 ; Redies, Hasenstein et Denzler, 2007). La pente du spectre constitue donc un invariant : une pente plus marquée signale une image dominée par les grandes formes et pauvre en détails ; une pente plus faible signale une image très chargée en détails fins. Dans le domaine de l’art brut, cette mesure permettrait, par exemple, de tester l’idée intuitive selon laquelle de nombreuses œuvres brutes sont ‘saturées de signes’ : on attendrait alors une pente moins marquée que dans les corpus témoins.</w:t>
+        <w:t>Une observation centrale en statistiques de l’image naturelle est que pour la plupart des images photographiques du monde réel, le spectre de puissance décroît avec la fréquence selon une loi proche de 1/fβ, avec β généralement compris entre 1,5 et 2,5. Lorsque β = 2, on parle de spectre ‘en 1/f²’ (Field, 1987 ; Ruderman, 1994 ; Tolhurst, Tadmor et Chao, 1992). Une telle loi signifie que l’image est statistiquement invariante par changement d’échelle : on retrouve la même structure de variations à toutes les tailles. Plusieurs études ont montré que les œuvres d’art, les cartoons, les comics et les mangas présentent une statistique en 1/f² assez stable (Graham et Field, 2007 ; Koch, Denzler et Redies, 2010 ; Redies, Hasenstein et Denzler, 2007). La pente du spectre constitue donc un invariant : une pente plus marquée signale une image dominée par les grandes formes et pauvre en détails ; une pente plus faible signale une image très chargée en détails fins. Dans le domaine de l’art brut, cette mesure permettrait, par exemple, de tester l’idée intuitive selon laquelle de nombreuses œuvres brutes sont ‘saturées de signes’ : on attendrait alors une pente moins marquée que dans les corpus témoins.</w:t>
       </w:r>
     </w:p>
     <w:p>
@@ -1663,8 +1677,10 @@
       </w:pPr>
       <w:r>
         <w:t xml:space="preserve">L’isotropie désigne le fait qu’une propriété soit semblable dans toutes les directions. Une image isotrope présente une distribution équilibrée des orientations de ses contours ; une image anisotrope présente une direction dominante (verticales, horizontales, obliques). Les œuvres brutes très </w:t>
+      </w:r>
+      <w:r>
         <w:lastRenderedPageBreak/>
-        <w:t xml:space="preserve">hachurées, écrites, ou organisées en grille peuvent présenter une anisotropie marquée, qui peut être quantifiée à partir du spectre de Fourier orienté ou par des bancs de filtres de Gabor (Koch et al., 2010 ; Henemann et al., 2017).</w:t>
+        <w:t>hachurées, écrites, ou organisées en grille peuvent présenter une anisotropie marquée, qui peut être quantifiée à partir du spectre de Fourier orienté ou par des bancs de filtres de Gabor (Koch et al., 2010 ; Henemann et al., 2017).</w:t>
       </w:r>
     </w:p>
     <w:p>
@@ -1684,7 +1700,7 @@
         <w:jc w:val="both"/>
       </w:pPr>
       <w:r>
-        <w:t xml:space="preserve">En effet, la transformée de Fourier classique fournit une description globale de l’image : elle indique quelles fréquences sont présentes mais pas où elles se trouvent. Pour des questions plus locales telles que ‘Les hautes fréquences sont-elles concentrées dans une bordure écrite et dans un fond uni au centre, ou dispersées sur toute la surface ?’ ou ’Les hachures sont-elles regroupées dans une zone précise ?’ plusieurs familles d’outils, dites d’analyse multi-échelles, répondent à ce besoin.</w:t>
+        <w:t>En effet, la transformée de Fourier classique fournit une description globale de l’image : elle indique quelles fréquences sont présentes mais pas où elles se trouvent. Pour des questions plus locales telles que ‘Les hautes fréquences sont-elles concentrées dans une bordure écrite et dans un fond uni au centre, ou dispersées sur toute la surface ?’ ou ’Les hachures sont-elles regroupées dans une zone précise ?’ plusieurs familles d’outils, dites d’analyse multi-échelles, répondent à ce besoin.</w:t>
       </w:r>
     </w:p>
     <w:p>
@@ -1764,6 +1780,8 @@
       </w:r>
       <w:r>
         <w:t xml:space="preserve"> des </w:t>
+      </w:r>
+      <w:r>
         <w:lastRenderedPageBreak/>
         <w:t>coefficients d’ondelettes pour distinguer dessins authentiques et imitations de Pieter Bruegel l’Ancien, l’un des premiers succès méthodologiques de la statistique d’image appliquée à l’art. Johnson et al. (2008) ont coordonné une comparaison de plusieurs équipes utilisant des décompositions en ondelettes sur un même corpus de van Gogh, afin d’identifier les œuvres autographes et les copies tardives. Polatkan et al. (2009) ont étendu l’approche à la détection de faux par apprentissage supervisé sur descripteurs d’ondelettes.</w:t>
       </w:r>
@@ -1817,7 +1835,7 @@
       <w:bookmarkEnd w:id="30"/>
       <w:bookmarkEnd w:id="34"/>
       <w:r>
-        <w:t xml:space="preserve">4.6. Limites générales de l’analyse fréquentielle</w:t>
+        <w:t>4.6. Limites générales de l’analyse fréquentielle</w:t>
       </w:r>
     </w:p>
     <w:p>
@@ -1878,7 +1896,7 @@
         <w:jc w:val="both"/>
       </w:pPr>
       <w:r>
-        <w:t xml:space="preserve">Les matrices de cooccurrence de niveaux de gris (GLCM, Gray-Level Co-occurrence Matrix, Haralick et al., 1973) comptent combien de fois deux niveaux de gris donnés apparaissent côte à côte (à une distance et selon une orientation fixées) ; à partir de cette matrice, on calcule des indices d’homogénéité (à quel point les pixels voisins se ressemblent), de contraste local, d’énergie (concentration des cooccurrences sur quelques valeurs) et de corrélation (régularité directionnelle). Les filtres de Gabor (Daugman, 1985) repèrent des motifs orientés à différentes échelles. Les motifs binaires locaux (Local Binary Patterns, LBP, Ojala, Pietikäinen et Mäenpää, 2002)</w:t>
+        <w:t>Les matrices de cooccurrence de niveaux de gris (GLCM, Gray-Level Co-occurrence Matrix, Haralick et al., 1973) comptent combien de fois deux niveaux de gris donnés apparaissent côte à côte (à une distance et selon une orientation fixées) ; à partir de cette matrice, on calcule des indices d’homogénéité (à quel point les pixels voisins se ressemblent), de contraste local, d’énergie (concentration des cooccurrences sur quelques valeurs) et de corrélation (régularité directionnelle). Les filtres de Gabor (Daugman, 1985) repèrent des motifs orientés à différentes échelles. Les motifs binaires locaux (Local Binary Patterns, LBP, Ojala, Pietikäinen et Mäenpää, 2002)</w:t>
       </w:r>
       <w:r>
         <w:rPr>
@@ -1930,7 +1948,7 @@
         <w:jc w:val="both"/>
       </w:pPr>
       <w:r>
-        <w:t xml:space="preserve">Une image est dite auto-similaire lorsque l’on retrouve, à l’intérieur de l’image, des structures qui ressemblent statistiquement à l’image entière. Si l’on extrait une petite zone dans une œuvre, la distribution des contrastes, des orientations ou des couleurs y ressemble à celle de l’œuvre globale. L’auto-similarité peut être quantifiée par la mesure de distances entre histogrammes de descripteurs (par exemple, histogrammes de gradients orientés ou réponses à un banc de filtres) calculés à différentes échelles : si les histogrammes restent semblables d’une échelle l’autre, l’image est auto-similaire (Amirshahi et al., 2014 ; Redies, Hasenstein et Denzler, 2007). Redies et son équipe ont montré que cette propriété distingue les œuvres d’art esthétiquement valorisées d’autres types d’images (publicités, photographies non artistiques), et c’est l’un des six descripteurs centraux retenus par Henemann, Brachmann et Redies (2017) pour la collection Prinzhorn. L’auto-similarité est conceptuellement distincte de la fractalité (qui implique en outre une décroissance en loi de puissance des descripteurs) mais lui est étroitement apparentée.</w:t>
+        <w:t>Une image est dite auto-similaire lorsque l’on retrouve, à l’intérieur de l’image, des structures qui ressemblent statistiquement à l’image entière. Si l’on extrait une petite zone dans une œuvre, la distribution des contrastes, des orientations ou des couleurs y ressemble à celle de l’œuvre globale. L’auto-similarité peut être quantifiée par la mesure de distances entre histogrammes de descripteurs (par exemple, histogrammes de gradients orientés ou réponses à un banc de filtres) calculés à différentes échelles : si les histogrammes restent semblables d’une échelle l’autre, l’image est auto-similaire (Amirshahi et al., 2014 ; Redies, Hasenstein et Denzler, 2007). Redies et son équipe ont montré que cette propriété distingue les œuvres d’art esthétiquement valorisées d’autres types d’images (publicités, photographies non artistiques), et c’est l’un des six descripteurs centraux retenus par Henemann, Brachmann et Redies (2017) pour la collection Prinzhorn. L’auto-similarité est conceptuellement distincte de la fractalité (qui implique en outre une décroissance en loi de puissance des descripteurs) mais lui est étroitement apparentée.</w:t>
       </w:r>
     </w:p>
     <w:p>
@@ -1950,7 +1968,7 @@
         <w:jc w:val="both"/>
       </w:pPr>
       <w:r>
-        <w:t xml:space="preserve">Une structure fractale est une structure dans laquelle des motifs semblables apparaissent à plusieurs échelles : la petite structure ressemble, statistiquement, à la grande structure (Mandelbrot, 1983).</w:t>
+        <w:t>Une structure fractale est une structure dans laquelle des motifs semblables apparaissent à plusieurs échelles : la petite structure ressemble, statistiquement, à la grande structure (Mandelbrot, 1983).</w:t>
       </w:r>
     </w:p>
     <w:p>
@@ -1960,6 +1978,8 @@
       </w:pPr>
       <w:r>
         <w:t xml:space="preserve">La dimension fractale est une généralisation de la dimension géométrique usuelle : une ligne droite a une dimension 1, une surface une dimension 2 ; un objet fractal possède une dimension non entière, généralement comprise entre 1 et 2 pour une figure plane. La méthode la plus simple pour l’estimer est le box-counting : on recouvre l’image d’un quadrillage de mailles de plus en plus fines, on compte le nombre N(ε) de mailles intersectant la forme à chaque résolution ε, et la </w:t>
+      </w:r>
+      <w:r>
         <w:lastRenderedPageBreak/>
         <w:t>dimension fractale D est définie par la pente de log N(ε) en fonction de log(1/ε). Plus D est grand, plus la forme remplit l’espace de manière complexe (Mandelbrot, 1983 ; Falconer, 2003).</w:t>
       </w:r>
@@ -2010,7 +2030,7 @@
         <w:jc w:val="both"/>
       </w:pPr>
       <w:r>
-        <w:t xml:space="preserve">Taylor, Micolich et Jonas (1999) avaient initialement proposé que les drip paintings de Pollock présentent une signature fractale stable (figure S5, partie I) (D ≈ 1,7) susceptible d’authentifier ses œuvres. Ces résultats ont été contestés : Jones-Smith et Mathur (2006) ont montré que de simples griffonnages d’enfants pouvaient reproduire les mêmes propriétés fractales, et que la fenêtre d’échelles disponible sur une peinture (typiquement deux à trois ordres de grandeur) était trop étroite pour établir une loi de puissance au sens strict. L’introduction de mesures multifractales par Mureika et collaborateurs a partiellement répondu à ces critiques, en montrant que la profondeur multifractale discrimine mieux les styles que la dimension fractale simple, mais ne suffit pas non plus à authentifier (Mureika et Taylor, 2013).</w:t>
+        <w:t>Taylor, Micolich et Jonas (1999) avaient initialement proposé que les drip paintings de Pollock présentent une signature fractale stable (figure S5, partie I) (D ≈ 1,7) susceptible d’authentifier ses œuvres. Ces résultats ont été contestés : Jones-Smith et Mathur (2006) ont montré que de simples griffonnages d’enfants pouvaient reproduire les mêmes propriétés fractales, et que la fenêtre d’échelles disponible sur une peinture (typiquement deux à trois ordres de grandeur) était trop étroite pour établir une loi de puissance au sens strict. L’introduction de mesures multifractales par Mureika et collaborateurs a partiellement répondu à ces critiques, en montrant que la profondeur multifractale discrimine mieux les styles que la dimension fractale simple, mais ne suffit pas non plus à authentifier (Mureika et Taylor, 2013).</w:t>
       </w:r>
     </w:p>
     <w:p>
@@ -2166,8 +2186,10 @@
       </w:r>
       <w:r>
         <w:t xml:space="preserve"> (variation d’accélération), profils de vitesse (Osu et al., 2011 ; Flash et Hogan, 1985). Lorsque l’on dispose d’une </w:t>
+      </w:r>
+      <w:r>
         <w:lastRenderedPageBreak/>
-        <w:t xml:space="preserve">numérisation à haute résolution, certains de ces invariants peuvent être estimés a posteriori à partir du trait laissé sur le papier, sans accès au geste lui-même. Cette piste est encore peu explorée pour des collections historiques mais ouverte par les travaux récents de stylométrie au niveau du trait.</w:t>
+        <w:t>numérisation à haute résolution, certains de ces invariants peuvent être estimés a posteriori à partir du trait laissé sur le papier, sans accès au geste lui-même. Cette piste est encore peu explorée pour des collections historiques mais ouverte par les travaux récents de stylométrie au niveau du trait.</w:t>
       </w:r>
     </w:p>
     <w:p>
@@ -2218,7 +2240,7 @@
         <w:jc w:val="both"/>
       </w:pPr>
       <w:r>
-        <w:t xml:space="preserve">Le rapport figure-fond désigne la capacité, pour un observateur, à distinguer un objet principal (la figure) d’un arrière-plan (le fond). Cette distinction perceptuelle, héritée de la psychologie de la forme (Rubin, 1915 ; Koffka, 1935), peut être plus ou moins claire selon les œuvres : fond saturé, figure noyée dans une texture, alternance possible des deux. Beaucoup d’œuvres d’art brut semblent perturber ces repères, ce qui justifie le recours à des descripteurs dédiés. Trois mesures sont couramment utilisées dans la littérature sur l’analyse computationnelle des images d’art (Aks et Sprott, 1996 ; Spehar et al., 2003 ; Brachmann et Redies, 2017). La proportion de surface non-fond correspond à la fraction de pixels appartenant aux objets segmentés (par seuillage automatique ou segmentation sémantique) plutôt qu’à l’arrière-plan ; elle quantifie le ‘taux de remplissage’ de l’œuvre. Le contraste figure-fond est la différence moyenne de luminance ou de couleur entre les pixels classés comme figure et ceux classés comme fond : un contraste élevé indique une figure nettement détachée, un contraste faible une œuvre où les frontières sont floues. La connexité du fond mesure si l’arrière-plan forme une région unique ou s’il est lui-même fragmenté – un fond fragmenté en de multiples îlots cessant fonctionnellement d’être un fond.</w:t>
+        <w:t>Le rapport figure-fond désigne la capacité, pour un observateur, à distinguer un objet principal (la figure) d’un arrière-plan (le fond). Cette distinction perceptuelle, héritée de la psychologie de la forme (Rubin, 1915 ; Koffka, 1935), peut être plus ou moins claire selon les œuvres : fond saturé, figure noyée dans une texture, alternance possible des deux. Beaucoup d’œuvres d’art brut semblent perturber ces repères, ce qui justifie le recours à des descripteurs dédiés. Trois mesures sont couramment utilisées dans la littérature sur l’analyse computationnelle des images d’art (Aks et Sprott, 1996 ; Spehar et al., 2003 ; Brachmann et Redies, 2017). La proportion de surface non-fond correspond à la fraction de pixels appartenant aux objets segmentés (par seuillage automatique ou segmentation sémantique) plutôt qu’à l’arrière-plan ; elle quantifie le ‘taux de remplissage’ de l’œuvre. Le contraste figure-fond est la différence moyenne de luminance ou de couleur entre les pixels classés comme figure et ceux classés comme fond : un contraste élevé indique une figure nettement détachée, un contraste faible une œuvre où les frontières sont floues. La connexité du fond mesure si l’arrière-plan forme une région unique ou s’il est lui-même fragmenté – un fond fragmenté en de multiples îlots cessant fonctionnellement d’être un fond.</w:t>
       </w:r>
     </w:p>
     <w:p>
@@ -2248,7 +2270,7 @@
         <w:jc w:val="both"/>
       </w:pPr>
       <w:r>
-        <w:t xml:space="preserve">La saillance visuelle est, en première approximation, ce qui attire spontanément l’attention : un contraste fort, une couleur vive, un visage, une forme isolée dans un champ régulier. Sa formalisation computationnelle remonte à Koch et Ullman (1985), dont la proposition d’architecture neuronale a été convertie en algorithme calculable sur n’importe quelle image par Itti, Koch et Niebur (1998 ; Itti et Koch, 2001). Dans leur modèle, l’image est décomposée en plusieurs cartes de caractéristiques (intensité, couleur, orientation), chacune calculée à plusieurs échelles à l’aide de filtres centre-périphérie (selon un mécanisme inspiré des champs récepteurs rétiniens). Ces cartes sont normalisées et combinées en une unique carte de saillance qui prédit, en chaque point, la probabilité que le regard d’un observateur s’y porte (figure S2). Ce modèle, dit bottom-up (piloté par le stimulus, sans information sémantique), a inspiré toute une génération de recherches (Borji et Itti, 2013).</w:t>
+        <w:t>La saillance visuelle est, en première approximation, ce qui attire spontanément l’attention : un contraste fort, une couleur vive, un visage, une forme isolée dans un champ régulier. Sa formalisation computationnelle remonte à Koch et Ullman (1985), dont la proposition d’architecture neuronale a été convertie en algorithme calculable sur n’importe quelle image par Itti, Koch et Niebur (1998 ; Itti et Koch, 2001). Dans leur modèle, l’image est décomposée en plusieurs cartes de caractéristiques (intensité, couleur, orientation), chacune calculée à plusieurs échelles à l’aide de filtres centre-périphérie (selon un mécanisme inspiré des champs récepteurs rétiniens). Ces cartes sont normalisées et combinées en une unique carte de saillance qui prédit, en chaque point, la probabilité que le regard d’un observateur s’y porte (figure S2). Ce modèle, dit bottom-up (piloté par le stimulus, sans information sémantique), a inspiré toute une génération de recherches (Borji et Itti, 2013).</w:t>
       </w:r>
     </w:p>
     <w:p>
@@ -2258,7 +2280,7 @@
       </w:pPr>
       <w:r>
         <w:lastRenderedPageBreak/>
-        <w:t xml:space="preserve">Figure S2. Architecture du modèle de saillance d’Itti, Koch &amp; Niebur. L’image d’entrée est décomposée par filtrage linéaire en trois canaux élémentaires (couleurs, intensité, orientations) analysés à plusieurs échelles. Des différences centre-pourtour normalisées produisent respectivement 12, 6 et 24 cartes de caractéristiques, combinées inter-échelles en trois cartes de proéminence, puis en une carte de saillance unique. Un mécanisme de compétition (winner-take-all) en extrait le lieu regardé, l’inhibition de retour permettant le passage au suivant. D’après Itti, Koch &amp; Niebur (1998).</w:t>
+        <w:t>Figure S2. Architecture du modèle de saillance d’Itti, Koch &amp; Niebur. L’image d’entrée est décomposée par filtrage linéaire en trois canaux élémentaires (couleurs, intensité, orientations) analysés à plusieurs échelles. Des différences centre-pourtour normalisées produisent respectivement 12, 6 et 24 cartes de caractéristiques, combinées inter-échelles en trois cartes de proéminence, puis en une carte de saillance unique. Un mécanisme de compétition (winner-take-all) en extrait le lieu regardé, l’inhibition de retour permettant le passage au suivant. D’après Itti, Koch &amp; Niebur (1998).</w:t>
       </w:r>
     </w:p>
     <w:p>
@@ -2278,7 +2300,7 @@
         <w:jc w:val="both"/>
       </w:pPr>
       <w:r>
-        <w:t xml:space="preserve">Le modèle classique ne tient pas compte des informations sémantiques (un visage est saillant pour des raisons cognitives) ni des objectifs de la tâche (lire une légende, chercher un détail). Des modèles plus récents (DeepGaze II (Kümmerer, Wallis et Bethge, 2017) en particulier) combinent saillance bottom-up et information apprise, et améliorent la prédiction des fixations oculaires humaines. Ces modèles supposent toutefois la disponibilité de données d’oculométrie, ressource rare et coûteuse à acquérir : leur usage pour caractériser un corpus d’art brut reste donc principalement prospectif. Une utilisation plus accessible consiste à dériver de la carte de saillance des indices synthétiques (l’entropie de la carte (faible si l’attention est concentrée sur un point, élevée si elle est dispersée), le rayon de gyration des points saillants (étendue spatiale du regard prédit), ou la position du barycentre de la saillance) qui permettent une description statistique des compositions sans recourir à des fixations mesurées.</w:t>
+        <w:t>Le modèle classique ne tient pas compte des informations sémantiques (un visage est saillant pour des raisons cognitives) ni des objectifs de la tâche (lire une légende, chercher un détail). Des modèles plus récents (DeepGaze II (Kümmerer, Wallis et Bethge, 2017) en particulier) combinent saillance bottom-up et information apprise, et améliorent la prédiction des fixations oculaires humaines. Ces modèles supposent toutefois la disponibilité de données d’oculométrie, ressource rare et coûteuse à acquérir : leur usage pour caractériser un corpus d’art brut reste donc principalement prospectif. Une utilisation plus accessible consiste à dériver de la carte de saillance des indices synthétiques (l’entropie de la carte (faible si l’attention est concentrée sur un point, élevée si elle est dispersée), le rayon de gyration des points saillants (étendue spatiale du regard prédit), ou la position du barycentre de la saillance) qui permettent une description statistique des compositions sans recourir à des fixations mesurées.</w:t>
       </w:r>
     </w:p>
     <w:p>
@@ -2290,7 +2312,7 @@
       <w:bookmarkEnd w:id="53"/>
       <w:bookmarkEnd w:id="55"/>
       <w:r>
-        <w:t xml:space="preserve">7.4. Organisation globale de l’image et propriétés statistiques d’ensemble</w:t>
+        <w:t>7.4. Organisation globale de l’image et propriétés statistiques d’ensemble</w:t>
       </w:r>
     </w:p>
     <w:p>
@@ -2359,7 +2381,7 @@
         <w:jc w:val="both"/>
       </w:pPr>
       <w:r>
-        <w:t xml:space="preserve">Une famille d’études (Graham et Field, 2007 ; Redies, Hasenstein et Denzler, 2007 ; Brachmann et Redies, 2017) a mis en évidence que les œuvres d’art partagent des propriétés statistiques d’ensemble qui les distinguent des images naturelles et des images non-artistiques : pente du spectre de Fourier proche de 1/f β avec β plus stable que dans les photographies (cf. §4.3), auto-similarité accrue (cf. §5.3.1), distribution d’intensité approximativement normale, anisotropie réduite. Hayn-Leichsenring et al. (2017) montrent que ces propriétés sont associées à des évaluations esthétiques humaines.</w:t>
+        <w:t>Une famille d’études (Graham et Field, 2007 ; Redies, Hasenstein et Denzler, 2007 ; Brachmann et Redies, 2017) a mis en évidence que les œuvres d’art partagent des propriétés statistiques d’ensemble qui les distinguent des images naturelles et des images non-artistiques : pente du spectre de Fourier proche de 1/f β avec β plus stable que dans les photographies (cf. §4.3), auto-similarité accrue (cf. §5.3.1), distribution d’intensité approximativement normale, anisotropie réduite. Hayn-Leichsenring et al. (2017) montrent que ces propriétés sont associées à des évaluations esthétiques humaines.</w:t>
       </w:r>
     </w:p>
     <w:p>
@@ -2379,7 +2401,7 @@
         <w:jc w:val="both"/>
       </w:pPr>
       <w:r>
-        <w:t xml:space="preserve">Plusieurs travaux récents ont cherché à prédire les évaluations humaines de la créativité d’une œuvre, c’est-à-dire les scores donnés par des évaluateurs sur des dimensions comme ‘originalité’, ‘richesse imaginative’, ‘charge symbolique’. Spee et al. (2023) ont montré, sur un corpus de peintures occidentales, que des dimensions sémantiques annotées par des humains (symbolisme, émotionnalité, imagination) prédisent ces évaluations mieux que les seules cartes de saillance, rappel que les propriétés bas niveau ne suffisent pas à rendre compte du jugement esthétique.</w:t>
+        <w:t>Plusieurs travaux récents ont cherché à prédire les évaluations humaines de la créativité d’une œuvre, c’est-à-dire les scores donnés par des évaluateurs sur des dimensions comme ‘originalité’, ‘richesse imaginative’, ‘charge symbolique’. Spee et al. (2023) ont montré, sur un corpus de peintures occidentales, que des dimensions sémantiques annotées par des humains (symbolisme, émotionnalité, imagination) prédisent ces évaluations mieux que les seules cartes de saillance, rappel que les propriétés bas niveau ne suffisent pas à rendre compte du jugement esthétique.</w:t>
       </w:r>
     </w:p>
     <w:p>
@@ -2399,7 +2421,7 @@
         <w:jc w:val="both"/>
       </w:pPr>
       <w:r>
-        <w:t xml:space="preserve">Les approches d’organisation globale sont, méthodologiquement, les plus immédiatement applicables à un corpus d’art brut : elles ne requièrent ni oculométrie, ni annotation sémantique fine, et fournissent des descripteurs interprétables (occupation, symétrie, équilibre, pente spectrale). Leur articulation avec une annotation experte du genre visuel (portrait, paysage, scène, page d’écriture) est indispensable, faute de quoi les différences mesurées refléteront essentiellement la distribution des genres et non des organisations compositionnelles distinctes.</w:t>
+        <w:t>Les approches d’organisation globale sont, méthodologiquement, les plus immédiatement applicables à un corpus d’art brut : elles ne requièrent ni oculométrie, ni annotation sémantique fine, et fournissent des descripteurs interprétables (occupation, symétrie, équilibre, pente spectrale). Leur articulation avec une annotation experte du genre visuel (portrait, paysage, scène, page d’écriture) est indispensable, faute de quoi les différences mesurées refléteront essentiellement la distribution des genres et non des organisations compositionnelles distinctes.</w:t>
       </w:r>
     </w:p>
     <w:p>
@@ -2423,7 +2445,7 @@
       </w:pPr>
       <w:bookmarkStart w:id="63" w:name="X6e870f05775396090077de08facb7fb0f796ddd"/>
       <w:r>
-        <w:t xml:space="preserve">8. Entropie, complexité et théorie de l’information</w:t>
+        <w:t>8. Entropie, complexité et théorie de l’information</w:t>
       </w:r>
     </w:p>
     <w:p>
@@ -2442,7 +2464,7 @@
         <w:jc w:val="both"/>
       </w:pPr>
       <w:r>
-        <w:t xml:space="preserve">L’entropie est un concept issu de la théorie de l’information (Shannon, 1948). Pour une variable aléatoire discrète X prenant les valeurs x1, x2, …, xn avec probabilités p(x1), p(x2), …, p(xn), l’entropie de Shannon est définie par H(X) = − Σ p(xi) log2 p(xi). Concrètement, H mesure la quantité d’incertitude associée à X, ou de manière équivalente le nombre moyen de bits nécessaire pour coder un tirage de X. Pour une image, on peut calculer l’entropie de la distribution des niveaux de gris (entropie d’ordre 1) ou celle des couples de pixels voisins (entropie d’ordre 2</w:t>
+        <w:t>L’entropie est un concept issu de la théorie de l’information (Shannon, 1948). Pour une variable aléatoire discrète X prenant les valeurs x1, x2, …, xn avec probabilités p(x1), p(x2), …, p(xn), l’entropie de Shannon est définie par H(X) = − Σ p(xi) log2 p(xi). Concrètement, H mesure la quantité d’incertitude associée à X, ou de manière équivalente le nombre moyen de bits nécessaire pour coder un tirage de X. Pour une image, on peut calculer l’entropie de la distribution des niveaux de gris (entropie d’ordre 1) ou celle des couples de pixels voisins (entropie d’ordre 2</w:t>
       </w:r>
       <w:r>
         <w:rPr>
@@ -2454,6 +2476,8 @@
       </w:r>
       <w:r>
         <w:t xml:space="preserve">). D’autres distributions peuvent être utilisées : distribution des gradients, des orientations locales, ou des ordres relatifs entre pixels voisins (cf. §8.3). Une image régulière, dans laquelle on peut prédire la valeur d’un pixel à partir de ses voisins, aura une entropie faible ; une image très variée aura une </w:t>
+      </w:r>
+      <w:r>
         <w:lastRenderedPageBreak/>
         <w:t>entropie élevée. Une entropie élevée n’implique cependant pas un désordre au sens psychiatrique ou esthétique du terme ; il s’agit d’une propriété strictement statistique.</w:t>
       </w:r>
@@ -2515,7 +2539,7 @@
         <w:jc w:val="both"/>
       </w:pPr>
       <w:r>
-        <w:t xml:space="preserve">L’entropie de permutation (Bandt et Pompe, 2002) repose sur une idée simple : décrire chaque petite zone de l’image non par les valeurs d’intensité de ses pixels, mais par leur ordre relatif. Pour une fenêtre glissante contenant trois pixels (gauche, centre, droite), on note simplement quel pixel a la plus grande valeur d’intensité, quel pixel a la plus petite, et quel est le rang du troisième. Cela donne six classements possibles (3! = 6). On parcourt l’ensemble de l’image en faisant glisser la fenêtre, on compte la fréquence d’apparition de chacun des six ordres, et on calcule l’entropie de Shannon de cette distribution. Cette mesure a l’avantage de ne dépendre ni du contraste global de l’image, ni d’une éventuelle transformation monotone des valeurs des pixels (changement d’éclairage, correction gamma), et de rester stable en présence de bruit modéré, parce que ces transformations préservent l’ordre relatif des intensités (Sigaki et al., 2018).</w:t>
+        <w:t>L’entropie de permutation (Bandt et Pompe, 2002) repose sur une idée simple : décrire chaque petite zone de l’image non par les valeurs d’intensité de ses pixels, mais par leur ordre relatif. Pour une fenêtre glissante contenant trois pixels (gauche, centre, droite), on note simplement quel pixel a la plus grande valeur d’intensité, quel pixel a la plus petite, et quel est le rang du troisième. Cela donne six classements possibles (3! = 6). On parcourt l’ensemble de l’image en faisant glisser la fenêtre, on compte la fréquence d’apparition de chacun des six ordres, et on calcule l’entropie de Shannon de cette distribution. Cette mesure a l’avantage de ne dépendre ni du contraste global de l’image, ni d’une éventuelle transformation monotone des valeurs des pixels (changement d’éclairage, correction gamma), et de rester stable en présence de bruit modéré, parce que ces transformations préservent l’ordre relatif des intensités (Sigaki et al., 2018).</w:t>
       </w:r>
     </w:p>
     <w:p>
@@ -2536,6 +2560,8 @@
       </w:pPr>
       <w:r>
         <w:t xml:space="preserve">Si une image peut être fortement compressée sans perdre beaucoup d’information (par exemple, par un algorithme générique comme PNG, JPEG-2000 ou ZIP), c’est qu’elle contient beaucoup de régularités. Si elle se compresse mal, c’est qu’elle contient beaucoup de variations difficiles à résumer. Cette idée trouve une formalisation théorique dans la complexité de Kolmogorov (Kolmogorov, 1965 ; Li et Vitányi, 2008), définie comme la longueur du plus court algorithme </w:t>
+      </w:r>
+      <w:r>
         <w:lastRenderedPageBreak/>
         <w:t>informatique</w:t>
       </w:r>
@@ -2568,7 +2594,7 @@
         <w:jc w:val="both"/>
       </w:pPr>
       <w:r>
-        <w:t xml:space="preserve">Les indices entropiques et de complexité permettent de placer chaque œuvre dans un plan ordre-désordre / simplicité-complexité, et donc de comparer des corpus de manière synthétique. Pour l’étude d’un corpus d’art brut, ces indices répondent partiellement aux trois objectifs définis en introduction : ils fournissent un indicateur global de différenciation entre corpus brut et corpus conventionnel (Comparer), permettent de positionner les œuvres dans un espace continu pour décrire les régimes visuels du corpus brut (Caractériser), et offrent des variables continues exploitables pour rechercher des corrélations avec les données cliniques disponibles (Corréler). Ces mesures sont toutefois abstraites : une œuvre à haute entropie peut être saturée de signes, riche en couleurs, pleine de texte ou simplement mal numérisée. Elles doivent toujours être couplées à des annotations explicites (densité, présence de texte, remplissage, symétrie) pour devenir interprétables (Lee et al., 2020 ; Sigaki et al., 2018).</w:t>
+        <w:t>Les indices entropiques et de complexité permettent de placer chaque œuvre dans un plan ordre-désordre / simplicité-complexité, et donc de comparer des corpus de manière synthétique. Pour l’étude d’un corpus d’art brut, ces indices répondent partiellement aux trois objectifs définis en introduction : ils fournissent un indicateur global de différenciation entre corpus brut et corpus conventionnel (Comparer), permettent de positionner les œuvres dans un espace continu pour décrire les régimes visuels du corpus brut (Caractériser), et offrent des variables continues exploitables pour rechercher des corrélations avec les données cliniques disponibles (Corréler). Ces mesures sont toutefois abstraites : une œuvre à haute entropie peut être saturée de signes, riche en couleurs, pleine de texte ou simplement mal numérisée. Elles doivent toujours être couplées à des annotations explicites (densité, présence de texte, remplissage, symétrie) pour devenir interprétables (Lee et al., 2020 ; Sigaki et al., 2018).</w:t>
       </w:r>
     </w:p>
     <w:p>
@@ -2599,7 +2625,7 @@
         <w:jc w:val="both"/>
       </w:pPr>
       <w:r>
-        <w:t xml:space="preserve">La topologie étudie les propriétés d’un objet qui se conservent par déformation continue : nombre de composantes connexes, nombre de trous, nombre de cavités. Une tasse à café et un donut sont topologiquement équivalents (chacun a un trou, celui de l’anse pour la tasse, celui central pour le donut) ; une boule et un cube sont topologiquement équivalents (aucun trou). Ces invariants sont robustes au bruit et aux petites variations métriques, ce qui en fait des descripteurs intéressants pour l’analyse de l’image (Edelsbrunner et Harer, 2010 ; Carlsson, 2009).</w:t>
+        <w:t>La topologie étudie les propriétés d’un objet qui se conservent par déformation continue : nombre de composantes connexes, nombre de trous, nombre de cavités. Une tasse à café et un donut sont topologiquement équivalents (chacun a un trou, celui de l’anse pour la tasse, celui central pour le donut) ; une boule et un cube sont topologiquement équivalents (aucun trou). Ces invariants sont robustes au bruit et aux petites variations métriques, ce qui en fait des descripteurs intéressants pour l’analyse de l’image (Edelsbrunner et Harer, 2010 ; Carlsson, 2009).</w:t>
       </w:r>
     </w:p>
     <w:p>
@@ -2619,7 +2645,7 @@
         <w:jc w:val="both"/>
       </w:pPr>
       <w:r>
-        <w:t xml:space="preserve">L’homologie persistante étend cette idée à une analyse multi-échelle. Pour une image en niveaux de gris, on construit une famille emboîtée d’ensembles : ε étant un seuil croissant, on garde les pixels d’intensité inférieure à ε (filtration en sur-niveaux). Au début (ε petit), peu de pixels sont retenus, il y a peu de composantes connexes ; à mesure que ε augmente, des composantes apparaissent (birth), fusionnent ou disparaissent (death). On enregistre, pour chaque composante connexe ou chaque trou, le couple (birth, death)</w:t>
+        <w:t>L’homologie persistante étend cette idée à une analyse multi-échelle. Pour une image en niveaux de gris, on construit une famille emboîtée d’ensembles : ε étant un seuil croissant, on garde les pixels d’intensité inférieure à ε (filtration en sur-niveaux). Au début (ε petit), peu de pixels sont retenus, il y a peu de composantes connexes ; à mesure que ε augmente, des composantes apparaissent (birth), fusionnent ou disparaissent (death). On enregistre, pour chaque composante connexe ou chaque trou, le couple (birth, death)</w:t>
       </w:r>
       <w:r>
         <w:rPr>
@@ -2631,8 +2657,10 @@
       </w:r>
       <w:r>
         <w:t xml:space="preserve">. L’écart death – birth est la persistance de la structure : une structure très persistante existe sur une large plage d’échelles et correspond à une </w:t>
+      </w:r>
+      <w:r>
         <w:lastRenderedPageBreak/>
-        <w:t xml:space="preserve">organisation forte de l’image ; une structure peu persistante est, en général, du bruit (Edelsbrunner et Harer, 2010 ; Otter et al., 2017).</w:t>
+        <w:t>organisation forte de l’image ; une structure peu persistante est, en général, du bruit (Edelsbrunner et Harer, 2010 ; Otter et al., 2017).</w:t>
       </w:r>
     </w:p>
     <w:p>
@@ -2672,7 +2700,7 @@
         <w:jc w:val="both"/>
       </w:pPr>
       <w:r>
-        <w:t xml:space="preserve">Figure S3. Homologie persistante appliquée à une œuvre picturale. Construction d’une filtration topologique sur une œuvre : à partir de l’œuvre (en haut à gauche) et de sa carte d’intensité (en haut à droite), l’image est binarisée pour une suite de seuils, (a) t = 100, (b) t = 150, (c) t = 200 ; les pixels se connectent en composantes puis en boucles, dont l’apparition (birth) et la disparition (death) le long du seuil définissent l’homologie persistante. Les intervalles les plus longs caractérisent l’organisation visuelle propre à l’artiste. D’après Munnangi &amp; Giunti (2025), figs. 2-3.</w:t>
+        <w:t>Figure S3. Homologie persistante appliquée à une œuvre picturale. Construction d’une filtration topologique sur une œuvre : à partir de l’œuvre (en haut à gauche) et de sa carte d’intensité (en haut à droite), l’image est binarisée pour une suite de seuils, (a) t = 100, (b) t = 150, (c) t = 200 ; les pixels se connectent en composantes puis en boucles, dont l’apparition (birth) et la disparition (death) le long du seuil définissent l’homologie persistante. Les intervalles les plus longs caractérisent l’organisation visuelle propre à l’artiste. D’après Munnangi &amp; Giunti (2025), figs. 2-3.</w:t>
       </w:r>
     </w:p>
     <w:p>
@@ -2692,7 +2720,7 @@
         <w:jc w:val="both"/>
       </w:pPr>
       <w:r>
-        <w:t xml:space="preserve">L’homologie persistante est robuste au bruit, invariante par rotation et translation et interprétable (les composantes et trous correspondent à des structures visuelles identifiables). Sa principale limite tient au coût calculatoire pour les grandes images, qui impose souvent un sous-échantillonnage, et à la difficulté d’intégrer plusieurs canaux de couleur (la littérature applique le plus souvent l’homologie persistante à des images en niveaux de gris ou à chaque canal séparément).</w:t>
+        <w:t>L’homologie persistante est robuste au bruit, invariante par rotation et translation et interprétable (les composantes et trous correspondent à des structures visuelles identifiables). Sa principale limite tient au coût calculatoire pour les grandes images, qui impose souvent un sous-échantillonnage, et à la difficulté d’intégrer plusieurs canaux de couleur (la littérature applique le plus souvent l’homologie persistante à des images en niveaux de gris ou à chaque canal séparément).</w:t>
       </w:r>
     </w:p>
     <w:p>
@@ -2744,8 +2772,10 @@
       </w:pPr>
       <w:r>
         <w:t xml:space="preserve">Une image peut être représentée comme un graphe : les nœuds sont des éléments visuels (régions homogènes, taches colorées (blobs), visages détectés, patches d’image) et les arêtes encodent leurs </w:t>
+      </w:r>
+      <w:r>
         <w:lastRenderedPageBreak/>
-        <w:t xml:space="preserve">relations (adjacence spatiale, similarité, encadrement). À partir de cette représentation, on peut calculer des mesures de réseau classiques : degré moyen (nombre de voisins par élément), coefficient de regroupement (les voisins d’un élément sont-ils voisins entre eux ?), centralité (quels sont les éléments les plus connectés au reste ?), longueur du chemin moyen, modularité</w:t>
+        <w:t>relations (adjacence spatiale, similarité, encadrement). À partir de cette représentation, on peut calculer des mesures de réseau classiques : degré moyen (nombre de voisins par élément), coefficient de regroupement (les voisins d’un élément sont-ils voisins entre eux ?), centralité (quels sont les éléments les plus connectés au reste ?), longueur du chemin moyen, modularité</w:t>
       </w:r>
       <w:r>
         <w:rPr>
@@ -2785,16 +2815,16 @@
         <w:jc w:val="both"/>
       </w:pPr>
       <w:r>
-        <w:t xml:space="preserve">Un second usage consiste à construire un graphe dans lequel les nœuds sont les œuvres (ou les artistes, ou les collections) et les arêtes encodent des proximités visuelles (calculées à partir d’embeddings, voir §11) ou des relations contextuelles (collaborations, expositions communes, mentions documentaires). Ce graphe peut ensuite être analysé pour identifier des communautés (groupes d’œuvres densément reliées entre elles) à l’aide d’algorithmes comme la modularité de Louvain (Blondel et al., 2008). Schich et al. (2014) ont ainsi appliqué cette logique à 150 000 personnages historiques pour reconstituer une cartographie de la mobilité culturelle européenne (figure S4) ; Lee et al. (2020) ont utilisé une approche apparentée pour l’étude du paysage en peinture.</w:t>
-      </w:r>
-    </w:p>
-    <w:p>
-      <w:pPr>
-        <w:pStyle w:val="Corpsdetexte"/>
-        <w:jc w:val="both"/>
-      </w:pPr>
-      <w:r>
-        <w:t xml:space="preserve">Figure S4. Cartographie réticulaire de la mobilité culturelle européenne. Trajectoires de personnages historiques reconstruites à partir de bases biographiques, chaque individu reliant un lieu de naissance à un lieu de décès. (A) Nombre d’individus vivants par année depuis l’an 1, comparé à la population mondiale ; (B) Distribution des âges de 1500 à 2000 ; (C) Lieux classés en sources de naissance (bleu) et attracteurs de décès (rouge) ; (D) Réseau des flux entre villes ; (E) Report géographique sur l’Europe, où Paris, Londres, Rome, Berlin, Munich et Vienne se détachent comme attracteurs persistants. D’après Schich et al. (2014).</w:t>
+        <w:t>Un second usage consiste à construire un graphe dans lequel les nœuds sont les œuvres (ou les artistes, ou les collections) et les arêtes encodent des proximités visuelles (calculées à partir d’embeddings, voir §11) ou des relations contextuelles (collaborations, expositions communes, mentions documentaires). Ce graphe peut ensuite être analysé pour identifier des communautés (groupes d’œuvres densément reliées entre elles) à l’aide d’algorithmes comme la modularité de Louvain (Blondel et al., 2008). Schich et al. (2014) ont ainsi appliqué cette logique à 150 000 personnages historiques pour reconstituer une cartographie de la mobilité culturelle européenne (figure S4) ; Lee et al. (2020) ont utilisé une approche apparentée pour l’étude du paysage en peinture.</w:t>
+      </w:r>
+    </w:p>
+    <w:p>
+      <w:pPr>
+        <w:pStyle w:val="Corpsdetexte"/>
+        <w:jc w:val="both"/>
+      </w:pPr>
+      <w:r>
+        <w:t>Figure S4. Cartographie réticulaire de la mobilité culturelle européenne. Trajectoires de personnages historiques reconstruites à partir de bases biographiques, chaque individu reliant un lieu de naissance à un lieu de décès. (A) Nombre d’individus vivants par année depuis l’an 1, comparé à la population mondiale ; (B) Distribution des âges de 1500 à 2000 ; (C) Lieux classés en sources de naissance (bleu) et attracteurs de décès (rouge) ; (D) Réseau des flux entre villes ; (E) Report géographique sur l’Europe, où Paris, Londres, Rome, Berlin, Munich et Vienne se détachent comme attracteurs persistants. D’après Schich et al. (2014).</w:t>
       </w:r>
     </w:p>
     <w:p>
@@ -2826,6 +2856,8 @@
       </w:r>
       <w:r>
         <w:t xml:space="preserve"> généralisent les CNN aux données structurées en graphes. Chaque nœud échange itérativement des informations avec ses voisins, ce qui permet d’apprendre des représentations qui tiennent compte de la structure relationnelle. Les GNN sont utilisés en analyse d’art pour combiner embeddings </w:t>
+      </w:r>
+      <w:r>
         <w:lastRenderedPageBreak/>
         <w:t>d’image et information contextuelle (cartels et autres métadonnées), et pour classifier ou recommander des œuvres dans des bases volumineuses. Garcia, Renoust et Nakashima (2020) ont par exemple appliqué les GNN à la base SemArt pour combiner image et commentaires textuels.</w:t>
       </w:r>
@@ -2889,7 +2921,7 @@
         <w:jc w:val="both"/>
       </w:pPr>
       <w:r>
-        <w:t xml:space="preserve">Le style ne désigne pas le sujet représenté mais la manière de le représenter : type de trait, rythme des contours, texture, palette, organisation. La stylométrie visuelle cherche à mesurer ce style à partir de descripteurs quantitatifs, par analogie avec la stylométrie textuelle qui, depuis Mendenhall (1887), mesure le style d’un auteur à partir de la distribution des mots et de la longueur des phrases (Hughes et al., 2010 ; Elgammal et al., 2018 ; Vieira et al., 2015).</w:t>
+        <w:t>Le style ne désigne pas le sujet représenté mais la manière de le représenter : type de trait, rythme des contours, texture, palette, organisation. La stylométrie visuelle cherche à mesurer ce style à partir de descripteurs quantitatifs, par analogie avec la stylométrie textuelle qui, depuis Mendenhall (1887), mesure le style d’un auteur à partir de la distribution des mots et de la longueur des phrases (Hughes et al., 2010 ; Elgammal et al., 2018 ; Vieira et al., 2015).</w:t>
       </w:r>
     </w:p>
     <w:p>
@@ -2909,16 +2941,16 @@
         <w:jc w:val="both"/>
       </w:pPr>
       <w:r>
-        <w:t xml:space="preserve">Le codage parcimonieux (sparse coding en anglais) (sparse coding, Olshausen et Field, 1996) repose sur l’idée qu’une image peut être reconstruite comme une combinaison linéaire d’éléments visuels de base (un dictionnaire) avec un petit nombre de coefficients non nuls. Si un dictionnaire est appris sur les œuvres d’un artiste donné, les éléments retenus reflètent sa grammaire visuelle. Hughes, Graham et Rockmore (2010) ont appliqué cette idée aux dessins de Pieter Bruegel l’Ancien (figure S5) : ils montrent qu’un dictionnaire parcimonieux permet de distinguer ses dessins authentiques d’œuvres attribuées à tort. Plus récemment, Elgammal et al. (2018) ont étendu cette logique au niveau du trait individuel pour Picasso, Matisse et Schiele.</w:t>
-      </w:r>
-    </w:p>
-    <w:p>
-      <w:pPr>
-        <w:pStyle w:val="Corpsdetexte"/>
-        <w:jc w:val="both"/>
-      </w:pPr>
-      <w:r>
-        <w:t xml:space="preserve">Figure S5. Dictionnaire de caractéristiques visuelles appris par codage parcimonieux. Éléments de base appris sur les dessins authentiques de Pieter Bruegel l’Ancien : chacun code une orientation, une fréquence et une épaisseur de trait particulières, et tout dessin du corpus se reconstruit comme la combinaison de quelques-uns d’entre eux. La qualité de cette reconstruction fournit un critère d’attribution. D’après Hughes, Graham &amp; Rockmore (2010).</w:t>
+        <w:t>Le codage parcimonieux (sparse coding en anglais) (sparse coding, Olshausen et Field, 1996) repose sur l’idée qu’une image peut être reconstruite comme une combinaison linéaire d’éléments visuels de base (un dictionnaire) avec un petit nombre de coefficients non nuls. Si un dictionnaire est appris sur les œuvres d’un artiste donné, les éléments retenus reflètent sa grammaire visuelle. Hughes, Graham et Rockmore (2010) ont appliqué cette idée aux dessins de Pieter Bruegel l’Ancien (figure S5) : ils montrent qu’un dictionnaire parcimonieux permet de distinguer ses dessins authentiques d’œuvres attribuées à tort. Plus récemment, Elgammal et al. (2018) ont étendu cette logique au niveau du trait individuel pour Picasso, Matisse et Schiele.</w:t>
+      </w:r>
+    </w:p>
+    <w:p>
+      <w:pPr>
+        <w:pStyle w:val="Corpsdetexte"/>
+        <w:jc w:val="both"/>
+      </w:pPr>
+      <w:r>
+        <w:t>Figure S5. Dictionnaire de caractéristiques visuelles appris par codage parcimonieux. Éléments de base appris sur les dessins authentiques de Pieter Bruegel l’Ancien : chacun code une orientation, une fréquence et une épaisseur de trait particulières, et tout dessin du corpus se reconstruit comme la combinaison de quelques-uns d’entre eux. La qualité de cette reconstruction fournit un critère d’attribution. D’après Hughes, Graham &amp; Rockmore (2010).</w:t>
       </w:r>
     </w:p>
     <w:p>
@@ -2979,16 +3011,16 @@
         <w:jc w:val="both"/>
       </w:pPr>
       <w:r>
-        <w:t xml:space="preserve">Le transfert de style introduit par Gatys, Ecker et Bethge (2016) est une approche différente mais intéressante à détailler. Ces auteurs ont montré que, dans un réseau de neurones convolutif pré-entraîné, le contenu d’une image (‘ce qui est représenté’) et son style (‘la manière dont c’est représenté’) peuvent être séparés. Plus précisément, le style est capturé par la matrice de Gram des activations des couches intermédiaires : la matrice G dont l’élément G(i, j) est le produit scalaire entre les feature maps i et j à une couche donnée. Cette matrice encode quelles caractéristiques visuelles co-apparaissent en moyenne, sans tenir compte de leur position spatiale ; autrement dit, elle capture la texture et la grammaire visuelle sans le contenu. Deux images dont les matrices de Gram sont proches partagent un style ; deux images dont les activations spatiales sont proches (c’est-à-dire dont chaque région de l’image produit, dans les couches intermédiaires du réseau, des réponses comparables) partagent un contenu.</w:t>
-      </w:r>
-    </w:p>
-    <w:p>
-      <w:pPr>
-        <w:pStyle w:val="Corpsdetexte"/>
-        <w:jc w:val="both"/>
-      </w:pPr>
-      <w:r>
-        <w:t xml:space="preserve">Pour l’analyse stylistique, cette construction offre un descripteur puissant et bien défini : la distance entre matrices de Gram peut être utilisée pour comparer des œuvres sans confondre style et sujet (Selim, Elgharib et Doyle, 2016 ; Bell et Ommer, 2019). Pour l’art brut, l’intérêt est précisément cette dissociation : on peut comparer le style d’un portrait à celui d’une scène, ou regrouper des œuvres représentant des sujets très différents mais traitées dans une grammaire visuelle commune (figure S6).</w:t>
+        <w:t>Le transfert de style introduit par Gatys, Ecker et Bethge (2016) est une approche différente mais intéressante à détailler. Ces auteurs ont montré que, dans un réseau de neurones convolutif pré-entraîné, le contenu d’une image (‘ce qui est représenté’) et son style (‘la manière dont c’est représenté’) peuvent être séparés. Plus précisément, le style est capturé par la matrice de Gram des activations des couches intermédiaires : la matrice G dont l’élément G(i, j) est le produit scalaire entre les feature maps i et j à une couche donnée. Cette matrice encode quelles caractéristiques visuelles co-apparaissent en moyenne, sans tenir compte de leur position spatiale ; autrement dit, elle capture la texture et la grammaire visuelle sans le contenu. Deux images dont les matrices de Gram sont proches partagent un style ; deux images dont les activations spatiales sont proches (c’est-à-dire dont chaque région de l’image produit, dans les couches intermédiaires du réseau, des réponses comparables) partagent un contenu.</w:t>
+      </w:r>
+    </w:p>
+    <w:p>
+      <w:pPr>
+        <w:pStyle w:val="Corpsdetexte"/>
+        <w:jc w:val="both"/>
+      </w:pPr>
+      <w:r>
+        <w:t>Pour l’analyse stylistique, cette construction offre un descripteur puissant et bien défini : la distance entre matrices de Gram peut être utilisée pour comparer des œuvres sans confondre style et sujet (Selim, Elgharib et Doyle, 2016 ; Bell et Ommer, 2019). Pour l’art brut, l’intérêt est précisément cette dissociation : on peut comparer le style d’un portrait à celui d’une scène, ou regrouper des œuvres représentant des sujets très différents mais traitées dans une grammaire visuelle commune (figure S6).</w:t>
       </w:r>
     </w:p>
     <w:p>
@@ -3030,7 +3062,7 @@
       <w:bookmarkEnd w:id="86"/>
       <w:r>
         <w:lastRenderedPageBreak/>
-        <w:t xml:space="preserve">12. Apprentissage profond supervisé : CNN, Transformers et limites</w:t>
+        <w:t>12. Apprentissage profond supervisé : CNN, Transformers et limites</w:t>
       </w:r>
     </w:p>
     <w:p>
@@ -3069,7 +3101,7 @@
         <w:jc w:val="both"/>
       </w:pPr>
       <w:r>
-        <w:t xml:space="preserve">Un réseau de neurones convolutif (CNN) analyse l’image par petites fenêtres (les filtres convolutifs) qui détectent localement des motifs simples (contours, coins, textures). Les couches successives combinent ces motifs en représentations de plus en plus complexes : contours → formes → parties d’objets → objets → scènes. Cette architecture, popularisée par LeCun, Bengio et Hinton (2015) et appliquée à grande échelle par Krizhevsky, Sutskever et Hinton (2012) avec AlexNet, a dominé la vision par ordinateur pendant la décennie 2012-2020. Des architectures comme VGG (Simonyan et Zisserman, 2015), ResNet (He et al., 2016)</w:t>
+        <w:t>Un réseau de neurones convolutif (CNN) analyse l’image par petites fenêtres (les filtres convolutifs) qui détectent localement des motifs simples (contours, coins, textures). Les couches successives combinent ces motifs en représentations de plus en plus complexes : contours → formes → parties d’objets → objets → scènes. Cette architecture, popularisée par LeCun, Bengio et Hinton (2015) et appliquée à grande échelle par Krizhevsky, Sutskever et Hinton (2012) avec AlexNet, a dominé la vision par ordinateur pendant la décennie 2012-2020. Des architectures comme VGG (Simonyan et Zisserman, 2015), ResNet (He et al., 2016)</w:t>
       </w:r>
       <w:r>
         <w:rPr>
@@ -3154,7 +3186,7 @@
         <w:footnoteReference w:id="37"/>
       </w:r>
       <w:r>
-        <w:t xml:space="preserve">, qui contient quatorze millions d’images d’objets photographiés) et à l’adapter à une tâche spécifique en n’ajustant qu’une partie des paramètres. Cette stratégie est cruciale pour les études en histoire de l’art, avec des corpus souvent restreints. Elle est toutefois porteuse d’un biais : le modèle apporte avec lui les catégories visuelles apprises sur d’autres images, souvent photographiques, contemporaines et occidentales (Zhao et al., 2021 ; Cetinic, Lipic et Grgic, 2018).</w:t>
+        <w:t>, qui contient quatorze millions d’images d’objets photographiés) et à l’adapter à une tâche spécifique en n’ajustant qu’une partie des paramètres. Cette stratégie est cruciale pour les études en histoire de l’art, avec des corpus souvent restreints. Elle est toutefois porteuse d’un biais : le modèle apporte avec lui les catégories visuelles apprises sur d’autres images, souvent photographiques, contemporaines et occidentales (Zhao et al., 2021 ; Cetinic, Lipic et Grgic, 2018).</w:t>
       </w:r>
     </w:p>
     <w:p>
@@ -3204,7 +3236,7 @@
         <w:jc w:val="both"/>
       </w:pPr>
       <w:r>
-        <w:t xml:space="preserve">Les travaux de Roberto, Ortego et Davis (2020) sont les seuls à avoir explicitement entraîné un réseau de neurones convolutif à classifier l’art brut en regard d’un grand corpus d’art conventionnel. Le protocole utilise un ResNet-18 (He et al., 2016) pré-entraîné sur ImageNet et affiné en transfer learning sur deux jeux. Le corpus d’art brut rassemble des œuvres recueillies sur Internet à partir de sources documentant le domaine (catalogues, musées spécialisés). Le corpus comparatif d’art conventionnel est WikiArt, qui couvre l’histoire de l’art occidental sous une nomenclature de vingt-six styles. Deux expériences sont réalisées : binaire (art brut vs. WikiArt agrégé) et multi-classe (art brut comme vingt-septième style d’art conventionnel).</w:t>
+        <w:t>Les travaux de Roberto, Ortego et Davis (2020) sont les seuls à avoir explicitement entraîné un réseau de neurones convolutif à classifier l’art brut en regard d’un grand corpus d’art conventionnel. Le protocole utilise un ResNet-18 (He et al., 2016) pré-entraîné sur ImageNet et affiné en transfer learning sur deux jeux. Le corpus d’art brut rassemble des œuvres recueillies sur Internet à partir de sources documentant le domaine (catalogues, musées spécialisés). Le corpus comparatif d’art conventionnel est WikiArt, qui couvre l’histoire de l’art occidental sous une nomenclature de vingt-six styles. Deux expériences sont réalisées : binaire (art brut vs. WikiArt agrégé) et multi-classe (art brut comme vingt-septième style d’art conventionnel).</w:t>
       </w:r>
     </w:p>
     <w:p>
@@ -3234,7 +3266,7 @@
         <w:jc w:val="both"/>
       </w:pPr>
       <w:r>
-        <w:t xml:space="preserve">Le corpus d’art brut de Roberto, Ortego et Davis (2020) a été constitué par recueil sur le web, sans contrôle des conditions de numérisation, ce qui expose à des artefacts d’acquisition (cf. §12.6). Le déséquilibre des effectifs entre art brut et corpus conventionnel impose une stratification rigoureuse. L’absence de métadonnées biographiques détaillées ne permet pas d’analyser les facteurs explicatifs (artiste, période, médium, contexte de production). L’étude ne mobilise pas de méthode d’explicabilité, ce qui ne permet pas de vérifier sur quels signaux visuels la classification s’appuie.</w:t>
+        <w:t>Le corpus d’art brut de Roberto, Ortego et Davis (2020) a été constitué par recueil sur le web, sans contrôle des conditions de numérisation, ce qui expose à des artefacts d’acquisition (cf. §12.6). Le déséquilibre des effectifs entre art brut et corpus conventionnel impose une stratification rigoureuse. L’absence de métadonnées biographiques détaillées ne permet pas d’analyser les facteurs explicatifs (artiste, période, médium, contexte de production). L’étude ne mobilise pas de méthode d’explicabilité, ce qui ne permet pas de vérifier sur quels signaux visuels la classification s’appuie.</w:t>
       </w:r>
     </w:p>
     <w:p>
@@ -3294,16 +3326,16 @@
         <w:jc w:val="both"/>
       </w:pPr>
       <w:r>
-        <w:t xml:space="preserve">Les cartes de saillance par gradient (par exemple Grad-CAM ; Selvaraju et al., 2017) calculent quels pixels de l’image ont le plus contribué à la prédiction. L’idée intuitive est la suivante : si modifier légèrement la valeur d’un pixel modifie significativement la prédiction, ce pixel est important. Grad-CAM produit une carte de chaleur superposable à l’image originale (figure S7), qui permet de vérifier visuellement que le modèle s’appuie sur des régions porteuses de sens (le visage représenté, la texture du dessin) plutôt que sur des artefacts (le numéro de catalogue, le bord du papier).</w:t>
-      </w:r>
-    </w:p>
-    <w:p>
-      <w:pPr>
-        <w:pStyle w:val="Corpsdetexte"/>
-        <w:jc w:val="both"/>
-      </w:pPr>
-      <w:r>
-        <w:t xml:space="preserve">LIME (Local Interpretable Model-agnostic Explanations ; Ribeiro, Singh et Guestrin, 2016) explique une prédiction donnée en construisant un modèle linéaire simple, valable localement autour de l’image étudiée. On perturbe systématiquement l’image (en masquant des zones), on observe les variations de prédiction, et on en déduit quelles zones expliquent localement la décision.</w:t>
+        <w:t>Les cartes de saillance par gradient (par exemple Grad-CAM ; Selvaraju et al., 2017) calculent quels pixels de l’image ont le plus contribué à la prédiction. L’idée intuitive est la suivante : si modifier légèrement la valeur d’un pixel modifie significativement la prédiction, ce pixel est important. Grad-CAM produit une carte de chaleur superposable à l’image originale (figure S7), qui permet de vérifier visuellement que le modèle s’appuie sur des régions porteuses de sens (le visage représenté, la texture du dessin) plutôt que sur des artefacts (le numéro de catalogue, le bord du papier).</w:t>
+      </w:r>
+    </w:p>
+    <w:p>
+      <w:pPr>
+        <w:pStyle w:val="Corpsdetexte"/>
+        <w:jc w:val="both"/>
+      </w:pPr>
+      <w:r>
+        <w:t>LIME (Local Interpretable Model-agnostic Explanations ; Ribeiro, Singh et Guestrin, 2016) explique une prédiction donnée en construisant un modèle linéaire simple, valable localement autour de l’image étudiée. On perturbe systématiquement l’image (en masquant des zones), on observe les variations de prédiction, et on en déduit quelles zones expliquent localement la décision.</w:t>
       </w:r>
     </w:p>
     <w:p>
@@ -3324,17 +3356,19 @@
       </w:r>
       <w:r>
         <w:t xml:space="preserve"> qui mesure sa contribution moyenne à la prédiction sur tous les </w:t>
+      </w:r>
+      <w:r>
         <w:lastRenderedPageBreak/>
-        <w:t xml:space="preserve">sous-ensembles possibles d’autres caractéristiques. L’approche SHAP fournit des explications théoriquement solides mais coûteuses en calcul.</w:t>
-      </w:r>
-    </w:p>
-    <w:p>
-      <w:pPr>
-        <w:pStyle w:val="Corpsdetexte"/>
-        <w:jc w:val="both"/>
-      </w:pPr>
-      <w:r>
-        <w:t xml:space="preserve">Figure S7. Cartes d’explicabilité d’un classificateur d’images. Sur une même photographie où figurent un chien et un chat, les régions ayant déterminé la décision du réseau sont localisées pour la classe ‘chat’ (a-f) puis pour la classe ‘chien’ (g-l), par rétropropagation guidée (b, h), Grad-CAM (c, i), Grad-CAM guidée (d, j), carte d’occlusion (e, k) et Grad-CAM appliquée à un ResNet (f, l). Les zones chaudes désignent les régions les plus contributives, ce qui permet de vérifier si le modèle s’appuie sur des régions porteuses de sens ou sur des artefacts d’acquisition. D’après Selvaraju et al. (2017).</w:t>
+        <w:t>sous-ensembles possibles d’autres caractéristiques. L’approche SHAP fournit des explications théoriquement solides mais coûteuses en calcul.</w:t>
+      </w:r>
+    </w:p>
+    <w:p>
+      <w:pPr>
+        <w:pStyle w:val="Corpsdetexte"/>
+        <w:jc w:val="both"/>
+      </w:pPr>
+      <w:r>
+        <w:t>Figure S7. Cartes d’explicabilité d’un classificateur d’images. Sur une même photographie où figurent un chien et un chat, les régions ayant déterminé la décision du réseau sont localisées pour la classe ‘chat’ (a-f) puis pour la classe ‘chien’ (g-l), par rétropropagation guidée (b, h), Grad-CAM (c, i), Grad-CAM guidée (d, j), carte d’occlusion (e, k) et Grad-CAM appliquée à un ResNet (f, l). Les zones chaudes désignent les régions les plus contributives, ce qui permet de vérifier si le modèle s’appuie sur des régions porteuses de sens ou sur des artefacts d’acquisition. D’après Selvaraju et al. (2017).</w:t>
       </w:r>
     </w:p>
     <w:p>
@@ -3374,7 +3408,7 @@
         <w:jc w:val="both"/>
       </w:pPr>
       <w:r>
-        <w:t xml:space="preserve">Au-delà des méthodes d’explicabilité, plusieurs stratégies aident à limiter l’impact des artéfacts. L’augmentation de données</w:t>
+        <w:t>Au-delà des méthodes d’explicabilité, plusieurs stratégies aident à limiter l’impact des artéfacts. L’augmentation de données</w:t>
       </w:r>
       <w:r>
         <w:rPr>
@@ -3489,7 +3523,7 @@
         <w:jc w:val="both"/>
       </w:pPr>
       <w:r>
-        <w:t xml:space="preserve">CLIP (Radford et al., 2021) est un modèle entraîné sur quatre cents millions de couples image-texte issus du web à apprendre à projeter image et texte dans un espace commun où une image et sa légende sont proches. L’approche CLIP permet la classification zero-shot : on peut décrire une catégorie par une phrase (‘un dessin d’une figure humaine au crayon’) et demander au modèle de classer des images sans aucun exemple d’entraînement. Il permet aussi la recherche par concept (‘montre-moi des œuvres qui contiennent un visage de profil avec des inscriptions’). Pour l’art brut, l’approche CLIP offre un outil d’exploration et d’annotation semi-automatique puissant.</w:t>
+        <w:t>CLIP (Radford et al., 2021) est un modèle entraîné sur quatre cents millions de couples image-texte issus du web à apprendre à projeter image et texte dans un espace commun où une image et sa légende sont proches. L’approche CLIP permet la classification zero-shot : on peut décrire une catégorie par une phrase (‘un dessin d’une figure humaine au crayon’) et demander au modèle de classer des images sans aucun exemple d’entraînement. Il permet aussi la recherche par concept (‘montre-moi des œuvres qui contiennent un visage de profil avec des inscriptions’). Pour l’art brut, l’approche CLIP offre un outil d’exploration et d’annotation semi-automatique puissant.</w:t>
       </w:r>
     </w:p>
     <w:p>
@@ -3509,7 +3543,7 @@
         <w:jc w:val="both"/>
       </w:pPr>
       <w:r>
-        <w:t xml:space="preserve">Une famille de modèles voisine, distincte par sa finalité (synthétiser des images plutôt qu’en classer) mais reposant sur les mêmes architectures profondes, comprend les modèles génératifs (GAN, diffusion models : Goodfellow et al., 2014 ; Rombach et al., 2022) et les grands modèles de langage multimodaux (GPT-4 avec vision, Gemini, Claude), capables de décrire une image en langage naturel. Ces modèles peuvent produire des descriptions iconographiques utiles, mais ils sont sujets à des hallucinations</w:t>
+        <w:t>Une famille de modèles voisine, distincte par sa finalité (synthétiser des images plutôt qu’en classer) mais reposant sur les mêmes architectures profondes, comprend les modèles génératifs (GAN, diffusion models : Goodfellow et al., 2014 ; Rombach et al., 2022) et les grands modèles de langage multimodaux (GPT-4 avec vision, Gemini, Claude), capables de décrire une image en langage naturel. Ces modèles peuvent produire des descriptions iconographiques utiles, mais ils sont sujets à des hallucinations</w:t>
       </w:r>
       <w:r>
         <w:rPr>
@@ -3521,6 +3555,8 @@
       </w:r>
       <w:r>
         <w:t xml:space="preserve"> : ils inventent parfois des éléments absents de l’image, en </w:t>
+      </w:r>
+      <w:r>
         <w:lastRenderedPageBreak/>
         <w:t>particulier pour des œuvres atypiques (Bender et al., 2021 ; Liu et al., 2024b). Leur usage en contexte clinique exige donc une validation systématique.</w:t>
       </w:r>
@@ -3542,7 +3578,7 @@
         <w:jc w:val="both"/>
       </w:pPr>
       <w:r>
-        <w:t xml:space="preserve">Les modèles de fondation offrent trois avantages majeurs pour l’étude de l’art brut : ils ne nécessitent pas d’entraînement sur les œuvres, ce qui réduit le risque de sur-apprentissage ; ils sont robustes à des variations de domaine ; et ils permettent la recherche par concept, particulièrement utile pour des collections où les métadonnées sont hétérogènes. Leur principale limite est leur biais d’entraînement : ces modèles ont été entraînés sur des images du web, surreprésentant certains styles, certaines cultures et certaines périodes. Une œuvre d’art brut peut être mal représentée dans leur espace, ce qui peut produire des proximités trompeuses (Birhane, 2022).</w:t>
+        <w:t>Les modèles de fondation offrent trois avantages majeurs pour l’étude de l’art brut : ils ne nécessitent pas d’entraînement sur les œuvres, ce qui réduit le risque de sur-apprentissage ; ils sont robustes à des variations de domaine ; et ils permettent la recherche par concept, particulièrement utile pour des collections où les métadonnées sont hétérogènes. Leur principale limite est leur biais d’entraînement : ces modèles ont été entraînés sur des images du web, surreprésentant certains styles, certaines cultures et certaines périodes. Une œuvre d’art brut peut être mal représentée dans leur espace, ce qui peut produire des proximités trompeuses (Birhane, 2022).</w:t>
       </w:r>
     </w:p>
     <w:p>
@@ -3573,7 +3609,7 @@
         <w:jc w:val="both"/>
       </w:pPr>
       <w:r>
-        <w:t xml:space="preserve">Le clustering consiste à regrouper des images sans étiquette préalable, simplement à partir de leurs représentations (descripteurs explicites ou embeddings). C’est une approche exploratoire : on ne cherche pas à confirmer une hypothèse mais à voir quelles familles émergent.</w:t>
+        <w:t>Le clustering consiste à regrouper des images sans étiquette préalable, simplement à partir de leurs représentations (descripteurs explicites ou embeddings). C’est une approche exploratoire : on ne cherche pas à confirmer une hypothèse mais à voir quelles familles émergent.</w:t>
       </w:r>
     </w:p>
     <w:p>
@@ -3584,7 +3620,7 @@
       <w:bookmarkStart w:id="110" w:name="méthodes-usuelles"/>
       <w:bookmarkEnd w:id="109"/>
       <w:r>
-        <w:t xml:space="preserve">14.2. Méthodes usuelles</w:t>
+        <w:t>14.2. Méthodes usuelles</w:t>
       </w:r>
     </w:p>
     <w:p>
@@ -3674,6 +3710,8 @@
       </w:r>
       <w:r>
         <w:t xml:space="preserve"> et UMAP (McInnes, </w:t>
+      </w:r>
+      <w:r>
         <w:lastRenderedPageBreak/>
         <w:t>Healy et Melville, 2018). Toutes deux préservent les voisinages locaux (figures S8 et S9) (deux points proches dans l’espace original restent proches dans la projection) mais déforment les distances globales. Une carte t-SNE/UMAP est donc une visualisation exploratoire et non une preuve de la structure du corpus.</w:t>
       </w:r>
@@ -3693,7 +3731,7 @@
         <w:jc w:val="both"/>
       </w:pPr>
       <w:r>
-        <w:t xml:space="preserve">Figure S9. Effet de l’architecture et du pré-entraînement sur la carte obtenue. Projection du même corpus dans les deux premières composantes principales des représentations de plusieurs réseaux, chaque point coloré par la date de l’œuvre : (a, b) AlexNet+2 pré-entraîné puis affiné, puis entraîné depuis zéro ; (c, d) VGGNet+2 dans les deux mêmes conditions ; (e) ResNet+2 pré-entraîné puis affiné. Le tableau donne la corrélation de Pearson entre la date et chacune des deux composantes, ainsi que la distance radiale : l’ordonnancement chronologique se retrouve dans toutes les configurations, le plus nettement pour ResNet+2 (r = 0,77 sur la composante radiale). D’après Elgammal, Mazzone et al. (2018).</w:t>
+        <w:t>Figure S9. Effet de l’architecture et du pré-entraînement sur la carte obtenue. Projection du même corpus dans les deux premières composantes principales des représentations de plusieurs réseaux, chaque point coloré par la date de l’œuvre : (a, b) AlexNet+2 pré-entraîné puis affiné, puis entraîné depuis zéro ; (c, d) VGGNet+2 dans les deux mêmes conditions ; (e) ResNet+2 pré-entraîné puis affiné. Le tableau donne la corrélation de Pearson entre la date et chacune des deux composantes, ainsi que la distance radiale : l’ordonnancement chronologique se retrouve dans toutes les configurations, le plus nettement pour ResNet+2 (r = 0,77 sur la composante radiale). D’après Elgammal, Mazzone et al. (2018).</w:t>
       </w:r>
     </w:p>
     <w:p>
@@ -3713,7 +3751,7 @@
         <w:jc w:val="both"/>
       </w:pPr>
       <w:r>
-        <w:t xml:space="preserve">Le clustering est une étape exploratoire intéressante : avant de chercher à classer brut/non brut, il est possible de demander aux algorithmes de clustering quels regroupements émergent spontanément. Les groupes correspondent-ils à des médiums (encre, peinture, crayon), à des périodes, à des artistes, à des thèmes, ou à des organisations graphiques transversales ? Cette question est compatible avec une démarche patrimoniale et clinique parce qu’elle ne présuppose pas que la catégorie diagnostique soit visible dans l’image (Lang et Ommer, 2021 ; Bell et Ommer, 2019).</w:t>
+        <w:t>Le clustering est une étape exploratoire intéressante : avant de chercher à classer brut/non brut, il est possible de demander aux algorithmes de clustering quels regroupements émergent spontanément. Les groupes correspondent-ils à des médiums (encre, peinture, crayon), à des périodes, à des artistes, à des thèmes, ou à des organisations graphiques transversales ? Cette question est compatible avec une démarche patrimoniale et clinique parce qu’elle ne présuppose pas que la catégorie diagnostique soit visible dans l’image (Lang et Ommer, 2021 ; Bell et Ommer, 2019).</w:t>
       </w:r>
     </w:p>
     <w:p>
@@ -3776,7 +3814,7 @@
         <w:jc w:val="both"/>
       </w:pPr>
       <w:r>
-        <w:t xml:space="preserve">La comparaison transversale (un patient vs. un témoin, un corpus vs. un autre) souffre d’un défaut majeur : la diversité interindividuelle est immense et masque presque toujours les effets cliniques. L’analyse longitudinale intra-artiste permet d’avancer dans la réponse à ce problème : au lieu de comparer des artistes différents, l’approche longitudinale consiste à suivre l’évolution d’un même artiste au cours du temps, en cherchant des ruptures internes. Les éléments mis en évidence de manière longitudinalte sont susceptibles d’être mis en regard de sa trajectoire psychopathologique (Piechowski-Jóźwiak et Bogousslavsky, 2018 ; Liu et al., 2018 ; Forsythe et al., 2017).</w:t>
+        <w:t>La comparaison transversale (un patient vs. un témoin, un corpus vs. un autre) souffre d’un défaut majeur : la diversité interindividuelle est immense et masque presque toujours les effets cliniques. L’analyse longitudinale intra-artiste permet d’avancer dans la réponse à ce problème : au lieu de comparer des artistes différents, l’approche longitudinale consiste à suivre l’évolution d’un même artiste au cours du temps, en cherchant des ruptures internes. Les éléments mis en évidence de manière longitudinalte sont susceptibles d’être mis en regard de sa trajectoire psychopathologique (Piechowski-Jóźwiak et Bogousslavsky, 2018 ; Liu et al., 2018 ; Forsythe et al., 2017).</w:t>
       </w:r>
     </w:p>
     <w:p>
@@ -3836,7 +3874,7 @@
         <w:jc w:val="both"/>
       </w:pPr>
       <w:r>
-        <w:t xml:space="preserve">Liu et al. (2018) ont introduit la notion de hot streaks, périodes de forte productivité ou de forte réussite dans les carrières artistiques, scientifiques et culturelles. Cette perspective est utile pour l’étude de l’art brut pour caractériser les phases de production d’un artiste en termes d’intensité, de ruptures et de reprises par exemple.</w:t>
+        <w:t>Liu et al. (2018) ont introduit la notion de hot streaks, périodes de forte productivité ou de forte réussite dans les carrières artistiques, scientifiques et culturelles. Cette perspective est utile pour l’étude de l’art brut pour caractériser les phases de production d’un artiste en termes d’intensité, de ruptures et de reprises par exemple.</w:t>
       </w:r>
     </w:p>
     <w:p>
@@ -3888,7 +3926,7 @@
         <w:jc w:val="both"/>
       </w:pPr>
       <w:r>
-        <w:t xml:space="preserve">Les approches précédentes traitent l’image comme un signal. L’analyse sémantique cherche au contraire à identifier ce qui est représenté : personnages, animaux, objets, lieux, symboles, gestes, scènes. L’analyse iconographique interprète ces éléments dans un cadre culturel et historique (Panofsky, 1939). L’analyse multimodale combine l’image avec d’autres sources d’information : texte écrit dans l’œuvre, titre, métadonnées, notices de collection, archives biographiques, commentaires cliniques (Spee et al., 2023 ; Lang et Ommer, 2021).</w:t>
+        <w:t>Les approches précédentes traitent l’image comme un signal. L’analyse sémantique cherche au contraire à identifier ce qui est représenté : personnages, animaux, objets, lieux, symboles, gestes, scènes. L’analyse iconographique interprète ces éléments dans un cadre culturel et historique (Panofsky, 1939). L’analyse multimodale combine l’image avec d’autres sources d’information : texte écrit dans l’œuvre, titre, métadonnées, notices de collection, archives biographiques, commentaires cliniques (Spee et al., 2023 ; Lang et Ommer, 2021).</w:t>
       </w:r>
     </w:p>
     <w:p>
@@ -3969,6 +4007,8 @@
       </w:r>
       <w:r>
         <w:t xml:space="preserve">, des relations à partir de biographies d’artistes, de notices de catalogue et d’archives cliniques. Enfin, elle permet </w:t>
+      </w:r>
+      <w:r>
         <w:lastRenderedPageBreak/>
         <w:t>de croiser les analyses visuelles avec les métadonnées structurées, condition pour des analyses multimodales.</w:t>
       </w:r>
@@ -3979,7 +4019,7 @@
         <w:jc w:val="both"/>
       </w:pPr>
       <w:r>
-        <w:t xml:space="preserve">Pour l’art brut, un étape importante serait d’aligner les nomenclature des différents corpus existants sur CIDOC-CRM et à enrichir progressivement, par TAL et annotation humaine, les liens entre œuvres, artistes, parcours et contexte clinique.</w:t>
+        <w:t>Pour l’art brut, un étape importante serait d’aligner les nomenclature des différents corpus existants sur CIDOC-CRM et à enrichir progressivement, par TAL et annotation humaine, les liens entre œuvres, artistes, parcours et contexte clinique.</w:t>
       </w:r>
     </w:p>
     <w:p>
@@ -4001,7 +4041,7 @@
       </w:pPr>
       <w:bookmarkStart w:id="127" w:name="la-cladistique-au-delà-de-la-biologie"/>
       <w:r>
-        <w:t xml:space="preserve">17.1. La cladistique au-delà de la biologie</w:t>
+        <w:t>17.1. La cladistique au-delà de la biologie</w:t>
       </w:r>
     </w:p>
     <w:p>
@@ -4071,6 +4111,8 @@
       </w:pPr>
       <w:r>
         <w:t xml:space="preserve">Adapter la cladistique à un corpus pictural suppose deux opérations préalables. Premièrement, choisir un ensemble de caractères discrets, suffisamment robustes pour être codés sans ambiguïté sur chaque œuvre : présence/absence de cadre, de signature, de visage humain, d’inscription, d’éléments répétés, choix de palette discrétisée, organisation compositionnelle (centrée </w:t>
+      </w:r>
+      <w:r>
         <w:lastRenderedPageBreak/>
         <w:t>vs. distribuée). Deuxièmement, définir une matrice de caractères œuvre × propriété, sur laquelle un algorithme de reconstruction (parcimonie maximale, Neighbor-Joining</w:t>
       </w:r>
@@ -4134,7 +4176,7 @@
         <w:footnoteReference w:id="49"/>
       </w:r>
       <w:r>
-        <w:t xml:space="preserve">) sont plus appropriées que les arbres stricts, comme l’a montré la littérature stemmatologique récente (Howe et al., 2001 ; Windram et al., 2008). Par ailleurs, le choix des caractères influence fortement le résultat : la robustesse d’une reconstruction doit être évaluée par des tests de réplication (bootstrap</w:t>
+        <w:t>) sont plus appropriées que les arbres stricts, comme l’a montré la littérature stemmatologique récente (Howe et al., 2001 ; Windram et al., 2008). Par ailleurs, le choix des caractères influence fortement le résultat : la robustesse d’une reconstruction doit être évaluée par des tests de réplication (bootstrap</w:t>
       </w:r>
       <w:r>
         <w:rPr>
@@ -4145,7 +4187,7 @@
         <w:footnoteReference w:id="50"/>
       </w:r>
       <w:r>
-        <w:t xml:space="preserve">, Felsenstein, 1985) et par comparaison à des reconstructions partielles obtenues sur des sous-ensembles de caractères. L’applicabilité de ces méthodes à l’art brut reste à explorer empiriquement et constitue à notre sens une piste exploratoire pertinente plutôt qu’une méthode immédiatement opérationnelle.</w:t>
+        <w:t>, Felsenstein, 1985) et par comparaison à des reconstructions partielles obtenues sur des sous-ensembles de caractères. L’applicabilité de ces méthodes à l’art brut reste à explorer empiriquement et constitue à notre sens une piste exploratoire pertinente plutôt qu’une méthode immédiatement opérationnelle.</w:t>
       </w:r>
     </w:p>
     <w:p>
@@ -4357,7 +4399,7 @@
               <w:rPr>
                 <w:lang w:val="en-US"/>
               </w:rPr>
-              <w:t xml:space="preserve">Embeddings DINOv2 ou CLIP + UMAP + HDBSCAN</w:t>
+              <w:t>Embeddings DINOv2 ou CLIP + UMAP + HDBSCAN</w:t>
             </w:r>
           </w:p>
         </w:tc>
@@ -4415,7 +4457,7 @@
               <w:jc w:val="both"/>
             </w:pPr>
             <w:r>
-              <w:t xml:space="preserve">OCR/HTR + modèles vision-langage + annotation iconographique</w:t>
+              <w:t>OCR/HTR + modèles vision-langage + annotation iconographique</w:t>
             </w:r>
           </w:p>
         </w:tc>
@@ -4673,7 +4715,7 @@
         <w:jc w:val="both"/>
       </w:pPr>
       <w:r>
-        <w:t xml:space="preserve">Tableau 2. Feuille de route opérationnelle pour une étude computationnelle d’un corpus d’art brut, ordonnée par complexité croissante des tâches, du descriptif (tâche 1) au prédictif clinique (tâche 7). Chaque tâche est associée à un ensemble de méthodes prioritaires et à son risque méthodologique principal.</w:t>
+        <w:t>Tableau 2. Feuille de route opérationnelle pour une étude computationnelle d’un corpus d’art brut, ordonnée par complexité croissante des tâches, du descriptif (tâche 1) au prédictif clinique (tâche 7). Chaque tâche est associée à un ensemble de méthodes prioritaires et à son risque méthodologique principal.</w:t>
       </w:r>
     </w:p>
     <w:p>
@@ -4703,7 +4745,7 @@
         <w:rPr>
           <w:lang w:val="en-US"/>
         </w:rPr>
-        <w:t xml:space="preserve">Persistence images: A stable vector representation of persistent homology. Journal of Machine Learning Research, 18, 1–35.</w:t>
+        <w:t>Persistence images: A stable vector representation of persistent homology. Journal of Machine Learning Research, 18, 1–35.</w:t>
       </w:r>
     </w:p>
     <w:p>
@@ -4719,67 +4761,67 @@
           <w:lang w:val="en-US"/>
         </w:rPr>
         <w:lastRenderedPageBreak/>
-        <w:t xml:space="preserve">Adebayo, J., Gilmer, J., Muelly, M., Goodfellow, I., Hardt, M. &amp; Kim, B. (2018). Sanity checks for saliency maps. Advances in Neural Information Processing Systems, 31.</w:t>
-      </w:r>
-    </w:p>
-    <w:p>
-      <w:pPr>
-        <w:pStyle w:val="Corpsdetexte"/>
-        <w:jc w:val="both"/>
-        <w:rPr>
-          <w:lang w:val="en-US"/>
-        </w:rPr>
-      </w:pPr>
-      <w:r>
-        <w:rPr>
-          <w:lang w:val="en-US"/>
-        </w:rPr>
-        <w:t xml:space="preserve">Aks, D. J. &amp; Sprott, J. C. (1996). Quantifying aesthetic preference for chaotic patterns. Empirical Studies of the Arts, 14(1), 1–16.</w:t>
-      </w:r>
-    </w:p>
-    <w:p>
-      <w:pPr>
-        <w:pStyle w:val="Corpsdetexte"/>
-        <w:jc w:val="both"/>
-        <w:rPr>
-          <w:lang w:val="en-US"/>
-        </w:rPr>
-      </w:pPr>
-      <w:r>
-        <w:rPr>
-          <w:lang w:val="en-US"/>
-        </w:rPr>
-        <w:t xml:space="preserve">Alayrac, J.-B., Donahue, J., Luc, P., Miech, A., Barr, I., Hasson, Y., Lenc, K. et al. (2022). Flamingo: A visual language model for few-shot learning. Advances in Neural Information Processing Systems, 35, 23716–23736.</w:t>
-      </w:r>
-    </w:p>
-    <w:p>
-      <w:pPr>
-        <w:pStyle w:val="Corpsdetexte"/>
-        <w:jc w:val="both"/>
-        <w:rPr>
-          <w:lang w:val="en-US"/>
-        </w:rPr>
-      </w:pPr>
-      <w:r>
-        <w:rPr>
-          <w:lang w:val="en-US"/>
-        </w:rPr>
-        <w:t xml:space="preserve">Amirshahi, S. A., Hayn-Leichsenring, G. U., Denzler, J. &amp; Redies, C. (2014). JenAesthetics subjective dataset: Analyzing paintings by subjective scores. In European Conference on Computer Vision Workshops (pp. 3–19). Springer.</w:t>
-      </w:r>
-    </w:p>
-    <w:p>
-      <w:pPr>
-        <w:pStyle w:val="Corpsdetexte"/>
-        <w:jc w:val="both"/>
-        <w:rPr>
-          <w:lang w:val="en-US"/>
-        </w:rPr>
-      </w:pPr>
-      <w:r>
-        <w:rPr>
-          <w:lang w:val="en-US"/>
-        </w:rPr>
-        <w:t xml:space="preserve">Andén, J. &amp; Mallat, S. (2014). Deep scattering spectrum. IEEE Transactions on Signal Processing, 62(16), 4114–4128.</w:t>
+        <w:t>Adebayo, J., Gilmer, J., Muelly, M., Goodfellow, I., Hardt, M. &amp; Kim, B. (2018). Sanity checks for saliency maps. Advances in Neural Information Processing Systems, 31.</w:t>
+      </w:r>
+    </w:p>
+    <w:p>
+      <w:pPr>
+        <w:pStyle w:val="Corpsdetexte"/>
+        <w:jc w:val="both"/>
+        <w:rPr>
+          <w:lang w:val="en-US"/>
+        </w:rPr>
+      </w:pPr>
+      <w:r>
+        <w:rPr>
+          <w:lang w:val="en-US"/>
+        </w:rPr>
+        <w:t>Aks, D. J. &amp; Sprott, J. C. (1996). Quantifying aesthetic preference for chaotic patterns. Empirical Studies of the Arts, 14(1), 1–16.</w:t>
+      </w:r>
+    </w:p>
+    <w:p>
+      <w:pPr>
+        <w:pStyle w:val="Corpsdetexte"/>
+        <w:jc w:val="both"/>
+        <w:rPr>
+          <w:lang w:val="en-US"/>
+        </w:rPr>
+      </w:pPr>
+      <w:r>
+        <w:rPr>
+          <w:lang w:val="en-US"/>
+        </w:rPr>
+        <w:t>Alayrac, J.-B., Donahue, J., Luc, P., Miech, A., Barr, I., Hasson, Y., Lenc, K. et al. (2022). Flamingo: A visual language model for few-shot learning. Advances in Neural Information Processing Systems, 35, 23716–23736.</w:t>
+      </w:r>
+    </w:p>
+    <w:p>
+      <w:pPr>
+        <w:pStyle w:val="Corpsdetexte"/>
+        <w:jc w:val="both"/>
+        <w:rPr>
+          <w:lang w:val="en-US"/>
+        </w:rPr>
+      </w:pPr>
+      <w:r>
+        <w:rPr>
+          <w:lang w:val="en-US"/>
+        </w:rPr>
+        <w:t>Amirshahi, S. A., Hayn-Leichsenring, G. U., Denzler, J. &amp; Redies, C. (2014). JenAesthetics subjective dataset: Analyzing paintings by subjective scores. In European Conference on Computer Vision Workshops (pp. 3–19). Springer.</w:t>
+      </w:r>
+    </w:p>
+    <w:p>
+      <w:pPr>
+        <w:pStyle w:val="Corpsdetexte"/>
+        <w:jc w:val="both"/>
+        <w:rPr>
+          <w:lang w:val="en-US"/>
+        </w:rPr>
+      </w:pPr>
+      <w:r>
+        <w:rPr>
+          <w:lang w:val="en-US"/>
+        </w:rPr>
+        <w:t>Andén, J. &amp; Mallat, S. (2014). Deep scattering spectrum. IEEE Transactions on Signal Processing, 62(16), 4114–4128.</w:t>
       </w:r>
     </w:p>
     <w:p>
@@ -4797,7 +4839,7 @@
         <w:rPr>
           <w:lang w:val="en-US"/>
         </w:rPr>
-        <w:t xml:space="preserve">Turbulent luminance in impassioned van Gogh paintings. Journal of Mathematical Imaging and Vision, 30, 275–283.</w:t>
+        <w:t>Turbulent luminance in impassioned van Gogh paintings. Journal of Mathematical Imaging and Vision, 30, 275–283.</w:t>
       </w:r>
     </w:p>
     <w:p>
@@ -4827,7 +4869,7 @@
         <w:rPr>
           <w:lang w:val="en-US"/>
         </w:rPr>
-        <w:t xml:space="preserve">Asaad, A. &amp; Jassim, S. (2017). Topological data analysis for image tampering detection. In International Workshop on Digital Watermarking (pp. 136–146). Springer.</w:t>
+        <w:t>Asaad, A. &amp; Jassim, S. (2017). Topological data analysis for image tampering detection. In International Workshop on Digital Watermarking (pp. 136–146). Springer.</w:t>
       </w:r>
     </w:p>
     <w:p>
@@ -4857,7 +4899,7 @@
         <w:rPr>
           <w:lang w:val="en-US"/>
         </w:rPr>
-        <w:t xml:space="preserve">Bandt, C. &amp; Pompe, B. (2002). Permutation entropy: A natural complexity measure for time series. Physical Review Letters, 88(17), 174102.</w:t>
+        <w:t>Bandt, C. &amp; Pompe, B. (2002). Permutation entropy: A natural complexity measure for time series. Physical Review Letters, 88(17), 174102.</w:t>
       </w:r>
     </w:p>
     <w:p>
@@ -4905,22 +4947,22 @@
         <w:rPr>
           <w:lang w:val="en-US"/>
         </w:rPr>
-        <w:t xml:space="preserve">Bell, P. &amp; Ommer, B. (2019). Computer vision and the analysis of art and cultural heritage. International Journal of Digital Art History, 4, 1–18.</w:t>
-      </w:r>
-    </w:p>
-    <w:p>
-      <w:pPr>
-        <w:pStyle w:val="Corpsdetexte"/>
-        <w:jc w:val="both"/>
-        <w:rPr>
-          <w:lang w:val="en-US"/>
-        </w:rPr>
-      </w:pPr>
-      <w:r>
-        <w:rPr>
-          <w:lang w:val="en-US"/>
-        </w:rPr>
-        <w:t xml:space="preserve">Bender, E. M., Gebru, T., McMillan-Major, A. &amp; Shmitchell, S. (2021). On the dangers of stochastic parrots: Can language models be too big? In Proceedings of the 2021 ACM Conference on Fairness, Accountability, and Transparency (pp. 610–623).</w:t>
+        <w:t>Bell, P. &amp; Ommer, B. (2019). Computer vision and the analysis of art and cultural heritage. International Journal of Digital Art History, 4, 1–18.</w:t>
+      </w:r>
+    </w:p>
+    <w:p>
+      <w:pPr>
+        <w:pStyle w:val="Corpsdetexte"/>
+        <w:jc w:val="both"/>
+        <w:rPr>
+          <w:lang w:val="en-US"/>
+        </w:rPr>
+      </w:pPr>
+      <w:r>
+        <w:rPr>
+          <w:lang w:val="en-US"/>
+        </w:rPr>
+        <w:t>Bender, E. M., Gebru, T., McMillan-Major, A. &amp; Shmitchell, S. (2021). On the dangers of stochastic parrots: Can language models be too big? In Proceedings of the 2021 ACM Conference on Fairness, Accountability, and Transparency (pp. 610–623).</w:t>
       </w:r>
     </w:p>
     <w:p>
@@ -4950,7 +4992,7 @@
         <w:rPr>
           <w:lang w:val="en-US"/>
         </w:rPr>
-        <w:t xml:space="preserve">Berns, R. S. (2019). Billmeyer and Saltzman’s Principles of Color Technology (4e éd.). Wiley.</w:t>
+        <w:t>Berns, R. S. (2019). Billmeyer and Saltzman’s Principles of Color Technology (4e éd.). Wiley.</w:t>
       </w:r>
     </w:p>
     <w:p>
@@ -4996,7 +5038,7 @@
           <w:lang w:val="en-US"/>
         </w:rPr>
         <w:lastRenderedPageBreak/>
-        <w:t xml:space="preserve">Blinkov, S. M. &amp; Glezer, I. I. (1968). The Human Brain in Figures and Tables: A Quantitative Handbook (trad. B. Haigh de l’édition russe, Leningrad, 1964). Basic Books / Plenum Press.</w:t>
+        <w:t>Blinkov, S. M. &amp; Glezer, I. I. (1968). The Human Brain in Figures and Tables: A Quantitative Handbook (trad. B. Haigh de l’édition russe, Leningrad, 1964). Basic Books / Plenum Press.</w:t>
       </w:r>
     </w:p>
     <w:p>
@@ -5047,82 +5089,82 @@
         <w:rPr>
           <w:lang w:val="en-US"/>
         </w:rPr>
-        <w:t xml:space="preserve">Borji, A. &amp; Itti, L. (2013). State-of-the-art in visual attention modeling. IEEE Transactions on Pattern Analysis and Machine Intelligence, 35(1), 185–207.</w:t>
-      </w:r>
-    </w:p>
-    <w:p>
-      <w:pPr>
-        <w:pStyle w:val="Corpsdetexte"/>
-        <w:jc w:val="both"/>
-        <w:rPr>
-          <w:lang w:val="en-US"/>
-        </w:rPr>
-      </w:pPr>
-      <w:r>
-        <w:rPr>
-          <w:lang w:val="en-US"/>
-        </w:rPr>
-        <w:t xml:space="preserve">Bouckaert, R., Lemey, P., Dunn, M., Greenhill, S. J., Alekseyenko, A. V., Drummond, A. J., Gray, R. D., Suchard, M. A. &amp; Atkinson, Q. D. (2012). Mapping the origins and expansion of the Indo-European language family. Science, 337(6097), 957–960.</w:t>
-      </w:r>
-    </w:p>
-    <w:p>
-      <w:pPr>
-        <w:pStyle w:val="Corpsdetexte"/>
-        <w:jc w:val="both"/>
-        <w:rPr>
-          <w:lang w:val="en-US"/>
-        </w:rPr>
-      </w:pPr>
-      <w:r>
-        <w:rPr>
-          <w:lang w:val="en-US"/>
-        </w:rPr>
-        <w:t xml:space="preserve">Bracewell, R. N. (1986). The Fourier Transform and Its Applications (2e éd.). McGraw-Hill.</w:t>
-      </w:r>
-    </w:p>
-    <w:p>
-      <w:pPr>
-        <w:pStyle w:val="Corpsdetexte"/>
-        <w:jc w:val="both"/>
-        <w:rPr>
-          <w:lang w:val="en-US"/>
-        </w:rPr>
-      </w:pPr>
-      <w:r>
-        <w:rPr>
-          <w:lang w:val="en-US"/>
-        </w:rPr>
-        <w:t xml:space="preserve">Brachmann, A. &amp; Redies, C. (2017). Computational and experimental approaches to visual aesthetics. Frontiers in Computational Neuroscience, 11, 102.</w:t>
-      </w:r>
-    </w:p>
-    <w:p>
-      <w:pPr>
-        <w:pStyle w:val="Corpsdetexte"/>
-        <w:jc w:val="both"/>
-        <w:rPr>
-          <w:lang w:val="en-US"/>
-        </w:rPr>
-      </w:pPr>
-      <w:r>
-        <w:rPr>
-          <w:lang w:val="en-US"/>
-        </w:rPr>
-        <w:t xml:space="preserve">Brielmann, A. A. &amp; Pelli, D. G. (2018). Aesthetics. Current Biology, 28(16), R859–R863.</w:t>
-      </w:r>
-    </w:p>
-    <w:p>
-      <w:pPr>
-        <w:pStyle w:val="Corpsdetexte"/>
-        <w:jc w:val="both"/>
-        <w:rPr>
-          <w:lang w:val="en-US"/>
-        </w:rPr>
-      </w:pPr>
-      <w:r>
-        <w:rPr>
-          <w:lang w:val="en-US"/>
-        </w:rPr>
-        <w:t xml:space="preserve">Bruna, J. &amp; Mallat, S. (2013). Invariant scattering convolution networks. IEEE Transactions on Pattern Analysis and Machine Intelligence, 35(8), 1872–1886.</w:t>
+        <w:t>Borji, A. &amp; Itti, L. (2013). State-of-the-art in visual attention modeling. IEEE Transactions on Pattern Analysis and Machine Intelligence, 35(1), 185–207.</w:t>
+      </w:r>
+    </w:p>
+    <w:p>
+      <w:pPr>
+        <w:pStyle w:val="Corpsdetexte"/>
+        <w:jc w:val="both"/>
+        <w:rPr>
+          <w:lang w:val="en-US"/>
+        </w:rPr>
+      </w:pPr>
+      <w:r>
+        <w:rPr>
+          <w:lang w:val="en-US"/>
+        </w:rPr>
+        <w:t>Bouckaert, R., Lemey, P., Dunn, M., Greenhill, S. J., Alekseyenko, A. V., Drummond, A. J., Gray, R. D., Suchard, M. A. &amp; Atkinson, Q. D. (2012). Mapping the origins and expansion of the Indo-European language family. Science, 337(6097), 957–960.</w:t>
+      </w:r>
+    </w:p>
+    <w:p>
+      <w:pPr>
+        <w:pStyle w:val="Corpsdetexte"/>
+        <w:jc w:val="both"/>
+        <w:rPr>
+          <w:lang w:val="en-US"/>
+        </w:rPr>
+      </w:pPr>
+      <w:r>
+        <w:rPr>
+          <w:lang w:val="en-US"/>
+        </w:rPr>
+        <w:t>Bracewell, R. N. (1986). The Fourier Transform and Its Applications (2e éd.). McGraw-Hill.</w:t>
+      </w:r>
+    </w:p>
+    <w:p>
+      <w:pPr>
+        <w:pStyle w:val="Corpsdetexte"/>
+        <w:jc w:val="both"/>
+        <w:rPr>
+          <w:lang w:val="en-US"/>
+        </w:rPr>
+      </w:pPr>
+      <w:r>
+        <w:rPr>
+          <w:lang w:val="en-US"/>
+        </w:rPr>
+        <w:t>Brachmann, A. &amp; Redies, C. (2017). Computational and experimental approaches to visual aesthetics. Frontiers in Computational Neuroscience, 11, 102.</w:t>
+      </w:r>
+    </w:p>
+    <w:p>
+      <w:pPr>
+        <w:pStyle w:val="Corpsdetexte"/>
+        <w:jc w:val="both"/>
+        <w:rPr>
+          <w:lang w:val="en-US"/>
+        </w:rPr>
+      </w:pPr>
+      <w:r>
+        <w:rPr>
+          <w:lang w:val="en-US"/>
+        </w:rPr>
+        <w:t>Brielmann, A. A. &amp; Pelli, D. G. (2018). Aesthetics. Current Biology, 28(16), R859–R863.</w:t>
+      </w:r>
+    </w:p>
+    <w:p>
+      <w:pPr>
+        <w:pStyle w:val="Corpsdetexte"/>
+        <w:jc w:val="both"/>
+        <w:rPr>
+          <w:lang w:val="en-US"/>
+        </w:rPr>
+      </w:pPr>
+      <w:r>
+        <w:rPr>
+          <w:lang w:val="en-US"/>
+        </w:rPr>
+        <w:t>Bruna, J. &amp; Mallat, S. (2013). Invariant scattering convolution networks. IEEE Transactions on Pattern Analysis and Machine Intelligence, 35(8), 1872–1886.</w:t>
       </w:r>
     </w:p>
     <w:p>
@@ -5197,7 +5239,7 @@
         <w:rPr>
           <w:lang w:val="en-US"/>
         </w:rPr>
-        <w:t xml:space="preserve">Canny, J. (1986). A computational approach to edge detection. IEEE Transactions on Pattern Analysis and Machine Intelligence, PAMI-8(6), 679–698.</w:t>
+        <w:t>Canny, J. (1986). A computational approach to edge detection. IEEE Transactions on Pattern Analysis and Machine Intelligence, PAMI-8(6), 679–698.</w:t>
       </w:r>
     </w:p>
     <w:p>
@@ -5227,7 +5269,7 @@
         <w:rPr>
           <w:lang w:val="en-US"/>
         </w:rPr>
-        <w:t xml:space="preserve">Carion, N., Massa, F., Synnaeve, G., Usunier, N., Kirillov, A. &amp; Zagoruyko, S. (2020). End-to-end object detection with transformers. In European Conference on Computer Vision (pp. 213–229). Springer.</w:t>
+        <w:t>Carion, N., Massa, F., Synnaeve, G., Usunier, N., Kirillov, A. &amp; Zagoruyko, S. (2020). End-to-end object detection with transformers. In European Conference on Computer Vision (pp. 213–229). Springer.</w:t>
       </w:r>
     </w:p>
     <w:p>
@@ -5276,7 +5318,7 @@
         <w:rPr>
           <w:lang w:val="en-US"/>
         </w:rPr>
-        <w:t xml:space="preserve">Cetinic, E., Lipic, T. &amp; Grgic, S. (2018). Fine-tuning convolutional neural networks for fine art classification. Expert Systems with Applications, 114, 107–118.</w:t>
+        <w:t>Cetinic, E., Lipic, T. &amp; Grgic, S. (2018). Fine-tuning convolutional neural networks for fine art classification. Expert Systems with Applications, 114, 107–118.</w:t>
       </w:r>
     </w:p>
     <w:p>
@@ -5321,7 +5363,7 @@
         <w:rPr>
           <w:lang w:val="en-US"/>
         </w:rPr>
-        <w:t xml:space="preserve">CIE (Commission Internationale de l’Éclairage) (1976). Colorimetry. Official Recommendations of the International Commission on Illumination. Publication CIE n° 15. Vienne.</w:t>
+        <w:t>CIE (Commission Internationale de l’Éclairage) (1976). Colorimetry. Official Recommendations of the International Commission on Illumination. Publication CIE n° 15. Vienne.</w:t>
       </w:r>
     </w:p>
     <w:p>
@@ -5351,7 +5393,7 @@
         <w:rPr>
           <w:lang w:val="en-US"/>
         </w:rPr>
-        <w:t xml:space="preserve">Dalal, N. &amp; Triggs, B. (2005). Histograms of oriented gradients for human detection. In 2005 IEEE Computer Society Conference on Computer Vision and Pattern Recognition (vol. 1, pp. 886–893).</w:t>
+        <w:t>Dalal, N. &amp; Triggs, B. (2005). Histograms of oriented gradients for human detection. In 2005 IEEE Computer Society Conference on Computer Vision and Pattern Recognition (vol. 1, pp. 886–893).</w:t>
       </w:r>
     </w:p>
     <w:p>
@@ -5366,7 +5408,7 @@
         <w:t xml:space="preserve">Das, M., Chowdary, S., Das, S., Goyal, N. et al. (2024). Deep learning models for classification of human figure drawings into psychiatric diagnostic labels: A proof-of-concept study. </w:t>
       </w:r>
       <w:r>
-        <w:t xml:space="preserve">SSRN preprint.</w:t>
+        <w:t>SSRN preprint.</w:t>
       </w:r>
     </w:p>
     <w:p>
@@ -5459,7 +5501,7 @@
         <w:rPr>
           <w:lang w:val="en-US"/>
         </w:rPr>
-        <w:t xml:space="preserve">Deng, J., Dong, W., Socher, R., Li, L.-J., Li, K. &amp; Fei-Fei, L. (2009). ImageNet: A large-scale hierarchical image database. In IEEE Conference on Computer Vision and Pattern Recognition (pp. 248–255).</w:t>
+        <w:t>Deng, J., Dong, W., Socher, R., Li, L.-J., Li, K. &amp; Fei-Fei, L. (2009). ImageNet: A large-scale hierarchical image database. In IEEE Conference on Computer Vision and Pattern Recognition (pp. 248–255).</w:t>
       </w:r>
     </w:p>
     <w:p>
@@ -5492,7 +5534,7 @@
         <w:rPr>
           <w:lang w:val="en-US"/>
         </w:rPr>
-        <w:t xml:space="preserve">Don, A. P. H., Jurova, A. &amp; Skorobogatova, M. (2024). Art’s hidden topology: A window into human perception. bioRxiv, 2024.10.16.618741.</w:t>
+        <w:t>Don, A. P. H., Jurova, A. &amp; Skorobogatova, M. (2024). Art’s hidden topology: A window into human perception. bioRxiv, 2024.10.16.618741.</w:t>
       </w:r>
     </w:p>
     <w:p>
@@ -5508,7 +5550,7 @@
         <w:t xml:space="preserve">Dosovitskiy, A., Beyer, L., Kolesnikov, A., Weissenborn, D., Zhai, X., Unterthiner, T. et al. (2021). An image is worth 16 × 16 words: Transformers for image recognition at scale. </w:t>
       </w:r>
       <w:r>
-        <w:t xml:space="preserve">In International Conference on Learning Representations.</w:t>
+        <w:t>In International Conference on Learning Representations.</w:t>
       </w:r>
     </w:p>
     <w:p>
@@ -5616,52 +5658,52 @@
         <w:rPr>
           <w:lang w:val="en-US"/>
         </w:rPr>
-        <w:t xml:space="preserve">Elgammal, A., Mazzone, M., Liu, B., Kim, D. &amp; Elhoseiny, M. (2018). The shape of art history in the eyes of the machine. In Proceedings of the AAAI Conference on Artificial Intelligence, 32(1).</w:t>
-      </w:r>
-    </w:p>
-    <w:p>
-      <w:pPr>
-        <w:pStyle w:val="Corpsdetexte"/>
-        <w:jc w:val="both"/>
-        <w:rPr>
-          <w:lang w:val="en-US"/>
-        </w:rPr>
-      </w:pPr>
-      <w:r>
-        <w:rPr>
-          <w:lang w:val="en-US"/>
-        </w:rPr>
-        <w:t xml:space="preserve">Fairbanks, M. S., Mureika, J. R. &amp; Taylor, R. P. (2010). Multifractal and statistical comparison of painting techniques of adults and children. SPIE Proceedings of Electronic Imaging, 7531, 1–6.</w:t>
-      </w:r>
-    </w:p>
-    <w:p>
-      <w:pPr>
-        <w:pStyle w:val="Corpsdetexte"/>
-        <w:jc w:val="both"/>
-        <w:rPr>
-          <w:lang w:val="en-US"/>
-        </w:rPr>
-      </w:pPr>
-      <w:r>
-        <w:rPr>
-          <w:lang w:val="en-US"/>
-        </w:rPr>
-        <w:t xml:space="preserve">Fairchild, M. D. (2013). Color Appearance Models (3e éd.). Wiley.</w:t>
-      </w:r>
-    </w:p>
-    <w:p>
-      <w:pPr>
-        <w:pStyle w:val="Corpsdetexte"/>
-        <w:jc w:val="both"/>
-        <w:rPr>
-          <w:lang w:val="en-US"/>
-        </w:rPr>
-      </w:pPr>
-      <w:r>
-        <w:rPr>
-          <w:lang w:val="en-US"/>
-        </w:rPr>
-        <w:t xml:space="preserve">Falconer, K. (2003). Fractal Geometry: Mathematical Foundations and Applications (2e éd.). Wiley.</w:t>
+        <w:t>Elgammal, A., Mazzone, M., Liu, B., Kim, D. &amp; Elhoseiny, M. (2018). The shape of art history in the eyes of the machine. In Proceedings of the AAAI Conference on Artificial Intelligence, 32(1).</w:t>
+      </w:r>
+    </w:p>
+    <w:p>
+      <w:pPr>
+        <w:pStyle w:val="Corpsdetexte"/>
+        <w:jc w:val="both"/>
+        <w:rPr>
+          <w:lang w:val="en-US"/>
+        </w:rPr>
+      </w:pPr>
+      <w:r>
+        <w:rPr>
+          <w:lang w:val="en-US"/>
+        </w:rPr>
+        <w:t>Fairbanks, M. S., Mureika, J. R. &amp; Taylor, R. P. (2010). Multifractal and statistical comparison of painting techniques of adults and children. SPIE Proceedings of Electronic Imaging, 7531, 1–6.</w:t>
+      </w:r>
+    </w:p>
+    <w:p>
+      <w:pPr>
+        <w:pStyle w:val="Corpsdetexte"/>
+        <w:jc w:val="both"/>
+        <w:rPr>
+          <w:lang w:val="en-US"/>
+        </w:rPr>
+      </w:pPr>
+      <w:r>
+        <w:rPr>
+          <w:lang w:val="en-US"/>
+        </w:rPr>
+        <w:t>Fairchild, M. D. (2013). Color Appearance Models (3e éd.). Wiley.</w:t>
+      </w:r>
+    </w:p>
+    <w:p>
+      <w:pPr>
+        <w:pStyle w:val="Corpsdetexte"/>
+        <w:jc w:val="both"/>
+        <w:rPr>
+          <w:lang w:val="en-US"/>
+        </w:rPr>
+      </w:pPr>
+      <w:r>
+        <w:rPr>
+          <w:lang w:val="en-US"/>
+        </w:rPr>
+        <w:t>Falconer, K. (2003). Fractal Geometry: Mathematical Foundations and Applications (2e éd.). Wiley.</w:t>
       </w:r>
     </w:p>
     <w:p>
@@ -5706,7 +5748,7 @@
         <w:rPr>
           <w:lang w:val="en-US"/>
         </w:rPr>
-        <w:t xml:space="preserve">Flash, T. &amp; Hogan, N. (1985). The coordination of arm movements: An experimentally confirmed mathematical model. The Journal of Neuroscience, 5(7), 1688–1703.</w:t>
+        <w:t>Flash, T. &amp; Hogan, N. (1985). The coordination of arm movements: An experimentally confirmed mathematical model. The Journal of Neuroscience, 5(7), 1688–1703.</w:t>
       </w:r>
     </w:p>
     <w:p>
@@ -5755,37 +5797,37 @@
           <w:lang w:val="en-US"/>
         </w:rPr>
         <w:lastRenderedPageBreak/>
-        <w:t xml:space="preserve">Garcia, N., Renoust, B. &amp; Nakashima, Y. (2020). ContextNet: Representation and exploration for painting classification and retrieval in context. International Journal of Multimedia Information Retrieval, 9(1), 17–30.</w:t>
-      </w:r>
-    </w:p>
-    <w:p>
-      <w:pPr>
-        <w:pStyle w:val="Corpsdetexte"/>
-        <w:jc w:val="both"/>
-        <w:rPr>
-          <w:lang w:val="en-US"/>
-        </w:rPr>
-      </w:pPr>
-      <w:r>
-        <w:rPr>
-          <w:lang w:val="en-US"/>
-        </w:rPr>
-        <w:t xml:space="preserve">Gatys, L. A., Ecker, A. S. &amp; Bethge, M. (2016). Image style transfer using convolutional neural networks. In Proceedings of the IEEE Conference on Computer Vision and Pattern Recognition (pp. 2414–2423).</w:t>
-      </w:r>
-    </w:p>
-    <w:p>
-      <w:pPr>
-        <w:pStyle w:val="Corpsdetexte"/>
-        <w:jc w:val="both"/>
-        <w:rPr>
-          <w:lang w:val="en-US"/>
-        </w:rPr>
-      </w:pPr>
-      <w:r>
-        <w:rPr>
-          <w:lang w:val="en-US"/>
-        </w:rPr>
-        <w:t xml:space="preserve">Geirhos, R., Jacobsen, J.-H., Michaelis, C., Zemel, R., Brendel, W., Bethge, M. &amp; Wichmann, F. A. (2020). Shortcut learning in deep neural networks. Nature Machine Intelligence, 2(11), 665–673.</w:t>
+        <w:t>Garcia, N., Renoust, B. &amp; Nakashima, Y. (2020). ContextNet: Representation and exploration for painting classification and retrieval in context. International Journal of Multimedia Information Retrieval, 9(1), 17–30.</w:t>
+      </w:r>
+    </w:p>
+    <w:p>
+      <w:pPr>
+        <w:pStyle w:val="Corpsdetexte"/>
+        <w:jc w:val="both"/>
+        <w:rPr>
+          <w:lang w:val="en-US"/>
+        </w:rPr>
+      </w:pPr>
+      <w:r>
+        <w:rPr>
+          <w:lang w:val="en-US"/>
+        </w:rPr>
+        <w:t>Gatys, L. A., Ecker, A. S. &amp; Bethge, M. (2016). Image style transfer using convolutional neural networks. In Proceedings of the IEEE Conference on Computer Vision and Pattern Recognition (pp. 2414–2423).</w:t>
+      </w:r>
+    </w:p>
+    <w:p>
+      <w:pPr>
+        <w:pStyle w:val="Corpsdetexte"/>
+        <w:jc w:val="both"/>
+        <w:rPr>
+          <w:lang w:val="en-US"/>
+        </w:rPr>
+      </w:pPr>
+      <w:r>
+        <w:rPr>
+          <w:lang w:val="en-US"/>
+        </w:rPr>
+        <w:t>Geirhos, R., Jacobsen, J.-H., Michaelis, C., Zemel, R., Brendel, W., Bethge, M. &amp; Wichmann, F. A. (2020). Shortcut learning in deep neural networks. Nature Machine Intelligence, 2(11), 665–673.</w:t>
       </w:r>
     </w:p>
     <w:p>
@@ -5815,37 +5857,37 @@
         <w:rPr>
           <w:lang w:val="en-US"/>
         </w:rPr>
-        <w:t xml:space="preserve">Goodfellow, I., Pouget-Abadie, J., Mirza, M., Xu, B., Warde-Farley, D., Ozair, S., Courville, A. &amp; Bengio, Y. (2014). Generative adversarial networks. Advances in Neural Information Processing Systems, 27.</w:t>
-      </w:r>
-    </w:p>
-    <w:p>
-      <w:pPr>
-        <w:pStyle w:val="Corpsdetexte"/>
-        <w:jc w:val="both"/>
-        <w:rPr>
-          <w:lang w:val="en-US"/>
-        </w:rPr>
-      </w:pPr>
-      <w:r>
-        <w:rPr>
-          <w:lang w:val="en-US"/>
-        </w:rPr>
-        <w:t xml:space="preserve">Goodfellow, I. J., Shlens, J. &amp; Szegedy, C. (2015). Explaining and harnessing adversarial examples. In International Conference on Learning Representations.</w:t>
-      </w:r>
-    </w:p>
-    <w:p>
-      <w:pPr>
-        <w:pStyle w:val="Corpsdetexte"/>
-        <w:jc w:val="both"/>
-        <w:rPr>
-          <w:lang w:val="en-US"/>
-        </w:rPr>
-      </w:pPr>
-      <w:r>
-        <w:rPr>
-          <w:lang w:val="en-US"/>
-        </w:rPr>
-        <w:t xml:space="preserve">Goupillaud, P., Grossmann, A. &amp; Morlet, J. (1984). Cycle-octave and related transforms in seismic signal analysis. Geoexploration, 23(1), 85–102.</w:t>
+        <w:t>Goodfellow, I., Pouget-Abadie, J., Mirza, M., Xu, B., Warde-Farley, D., Ozair, S., Courville, A. &amp; Bengio, Y. (2014). Generative adversarial networks. Advances in Neural Information Processing Systems, 27.</w:t>
+      </w:r>
+    </w:p>
+    <w:p>
+      <w:pPr>
+        <w:pStyle w:val="Corpsdetexte"/>
+        <w:jc w:val="both"/>
+        <w:rPr>
+          <w:lang w:val="en-US"/>
+        </w:rPr>
+      </w:pPr>
+      <w:r>
+        <w:rPr>
+          <w:lang w:val="en-US"/>
+        </w:rPr>
+        <w:t>Goodfellow, I. J., Shlens, J. &amp; Szegedy, C. (2015). Explaining and harnessing adversarial examples. In International Conference on Learning Representations.</w:t>
+      </w:r>
+    </w:p>
+    <w:p>
+      <w:pPr>
+        <w:pStyle w:val="Corpsdetexte"/>
+        <w:jc w:val="both"/>
+        <w:rPr>
+          <w:lang w:val="en-US"/>
+        </w:rPr>
+      </w:pPr>
+      <w:r>
+        <w:rPr>
+          <w:lang w:val="en-US"/>
+        </w:rPr>
+        <w:t>Goupillaud, P., Grossmann, A. &amp; Morlet, J. (1984). Cycle-octave and related transforms in seismic signal analysis. Geoexploration, 23(1), 85–102.</w:t>
       </w:r>
     </w:p>
     <w:p>
@@ -5875,22 +5917,22 @@
         <w:rPr>
           <w:lang w:val="en-US"/>
         </w:rPr>
-        <w:t xml:space="preserve">Graham, D. J. &amp; Meng, M. (2011). Altered spatial frequency content in paintings by artists with schizophrenia. i-Perception, 2(1), 1–9.</w:t>
-      </w:r>
-    </w:p>
-    <w:p>
-      <w:pPr>
-        <w:pStyle w:val="Corpsdetexte"/>
-        <w:jc w:val="both"/>
-        <w:rPr>
-          <w:lang w:val="en-US"/>
-        </w:rPr>
-      </w:pPr>
-      <w:r>
-        <w:rPr>
-          <w:lang w:val="en-US"/>
-        </w:rPr>
-        <w:t xml:space="preserve">Haar, A. (1910). Zur Theorie der orthogonalen Funktionensysteme. Mathematische Annalen, 69(3), 331–371.</w:t>
+        <w:t>Graham, D. J. &amp; Meng, M. (2011). Altered spatial frequency content in paintings by artists with schizophrenia. i-Perception, 2(1), 1–9.</w:t>
+      </w:r>
+    </w:p>
+    <w:p>
+      <w:pPr>
+        <w:pStyle w:val="Corpsdetexte"/>
+        <w:jc w:val="both"/>
+        <w:rPr>
+          <w:lang w:val="en-US"/>
+        </w:rPr>
+      </w:pPr>
+      <w:r>
+        <w:rPr>
+          <w:lang w:val="en-US"/>
+        </w:rPr>
+        <w:t>Haar, A. (1910). Zur Theorie der orthogonalen Funktionensysteme. Mathematische Annalen, 69(3), 331–371.</w:t>
       </w:r>
     </w:p>
     <w:p>
@@ -5935,52 +5977,52 @@
         <w:rPr>
           <w:lang w:val="en-US"/>
         </w:rPr>
-        <w:t xml:space="preserve">Haralick, R. M., Shanmugam, K. &amp; Dinstein, I. (1973). Textural features for image classification. IEEE Transactions on Systems, Man, and Cybernetics, SMC-3(6), 610–621.</w:t>
-      </w:r>
-    </w:p>
-    <w:p>
-      <w:pPr>
-        <w:pStyle w:val="Corpsdetexte"/>
-        <w:jc w:val="both"/>
-        <w:rPr>
-          <w:lang w:val="en-US"/>
-        </w:rPr>
-      </w:pPr>
-      <w:r>
-        <w:rPr>
-          <w:lang w:val="en-US"/>
-        </w:rPr>
-        <w:t xml:space="preserve">Hayn-Leichsenring, G. U., Lehmann, T. &amp; Redies, C. (2017). Subjective ratings of beauty and aesthetics: Correlations with statistical image properties in Western oil paintings. i-Perception, 8(3), 1–21.</w:t>
-      </w:r>
-    </w:p>
-    <w:p>
-      <w:pPr>
-        <w:pStyle w:val="Corpsdetexte"/>
-        <w:jc w:val="both"/>
-        <w:rPr>
-          <w:lang w:val="en-US"/>
-        </w:rPr>
-      </w:pPr>
-      <w:r>
-        <w:rPr>
-          <w:lang w:val="en-US"/>
-        </w:rPr>
-        <w:t xml:space="preserve">He, K., Zhang, X., Ren, S. &amp; Sun, J. (2016). Deep residual learning for image recognition. In Proceedings of the IEEE Conference on Computer Vision and Pattern Recognition (pp. 770–778).</w:t>
-      </w:r>
-    </w:p>
-    <w:p>
-      <w:pPr>
-        <w:pStyle w:val="Corpsdetexte"/>
-        <w:jc w:val="both"/>
-        <w:rPr>
-          <w:lang w:val="en-US"/>
-        </w:rPr>
-      </w:pPr>
-      <w:r>
-        <w:rPr>
-          <w:lang w:val="en-US"/>
-        </w:rPr>
-        <w:t xml:space="preserve">Health Data Hub. Le data challenge Outs[AI]der. https://www.health-data-hub.fr/page/le-data-challenge-outsaider</w:t>
+        <w:t>Haralick, R. M., Shanmugam, K. &amp; Dinstein, I. (1973). Textural features for image classification. IEEE Transactions on Systems, Man, and Cybernetics, SMC-3(6), 610–621.</w:t>
+      </w:r>
+    </w:p>
+    <w:p>
+      <w:pPr>
+        <w:pStyle w:val="Corpsdetexte"/>
+        <w:jc w:val="both"/>
+        <w:rPr>
+          <w:lang w:val="en-US"/>
+        </w:rPr>
+      </w:pPr>
+      <w:r>
+        <w:rPr>
+          <w:lang w:val="en-US"/>
+        </w:rPr>
+        <w:t>Hayn-Leichsenring, G. U., Lehmann, T. &amp; Redies, C. (2017). Subjective ratings of beauty and aesthetics: Correlations with statistical image properties in Western oil paintings. i-Perception, 8(3), 1–21.</w:t>
+      </w:r>
+    </w:p>
+    <w:p>
+      <w:pPr>
+        <w:pStyle w:val="Corpsdetexte"/>
+        <w:jc w:val="both"/>
+        <w:rPr>
+          <w:lang w:val="en-US"/>
+        </w:rPr>
+      </w:pPr>
+      <w:r>
+        <w:rPr>
+          <w:lang w:val="en-US"/>
+        </w:rPr>
+        <w:t>He, K., Zhang, X., Ren, S. &amp; Sun, J. (2016). Deep residual learning for image recognition. In Proceedings of the IEEE Conference on Computer Vision and Pattern Recognition (pp. 770–778).</w:t>
+      </w:r>
+    </w:p>
+    <w:p>
+      <w:pPr>
+        <w:pStyle w:val="Corpsdetexte"/>
+        <w:jc w:val="both"/>
+        <w:rPr>
+          <w:lang w:val="en-US"/>
+        </w:rPr>
+      </w:pPr>
+      <w:r>
+        <w:rPr>
+          <w:lang w:val="en-US"/>
+        </w:rPr>
+        <w:t>Health Data Hub. Le data challenge Outs[AI]der. https://www.health-data-hub.fr/page/le-data-challenge-outsaider</w:t>
       </w:r>
     </w:p>
     <w:p>
@@ -5996,7 +6038,7 @@
           <w:lang w:val="en-US"/>
         </w:rPr>
         <w:lastRenderedPageBreak/>
-        <w:t xml:space="preserve">Henemann, G. M., Brachmann, A. &amp; Redies, C. (2017). Statistical image properties in works from the Prinzhorn Collection of artists with schizophrenia. Frontiers in Psychiatry, 8, 273.</w:t>
+        <w:t>Henemann, G. M., Brachmann, A. &amp; Redies, C. (2017). Statistical image properties in works from the Prinzhorn Collection of artists with schizophrenia. Frontiers in Psychiatry, 8, 273.</w:t>
       </w:r>
     </w:p>
     <w:p>
@@ -6026,37 +6068,37 @@
         <w:rPr>
           <w:lang w:val="en-US"/>
         </w:rPr>
-        <w:t xml:space="preserve">Howe, C. J., Barbrook, A. C., Spencer, M., Robinson, P., Bordalejo, B. &amp; Mooney, L. R. (2001). Manuscript evolution. Trends in Genetics, 17(3), 147–152.</w:t>
-      </w:r>
-    </w:p>
-    <w:p>
-      <w:pPr>
-        <w:pStyle w:val="Corpsdetexte"/>
-        <w:jc w:val="both"/>
-        <w:rPr>
-          <w:lang w:val="en-US"/>
-        </w:rPr>
-      </w:pPr>
-      <w:r>
-        <w:rPr>
-          <w:lang w:val="en-US"/>
-        </w:rPr>
-        <w:t xml:space="preserve">Hughes, J. M., Graham, D. J. &amp; Rockmore, D. N. (2010). Quantification of artistic style through sparse coding analysis in the drawings of Pieter Bruegel the Elder. Proceedings of the National Academy of Sciences, 107(4), 1279–1283.</w:t>
-      </w:r>
-    </w:p>
-    <w:p>
-      <w:pPr>
-        <w:pStyle w:val="Corpsdetexte"/>
-        <w:jc w:val="both"/>
-        <w:rPr>
-          <w:lang w:val="en-US"/>
-        </w:rPr>
-      </w:pPr>
-      <w:r>
-        <w:rPr>
-          <w:lang w:val="en-US"/>
-        </w:rPr>
-        <w:t xml:space="preserve">Itti, L., Koch, C. &amp; Niebur, E. (1998). A model of saliency-based visual attention for rapid scene analysis. IEEE Transactions on Pattern Analysis and Machine Intelligence, 20(11), 1254–1259.</w:t>
+        <w:t>Howe, C. J., Barbrook, A. C., Spencer, M., Robinson, P., Bordalejo, B. &amp; Mooney, L. R. (2001). Manuscript evolution. Trends in Genetics, 17(3), 147–152.</w:t>
+      </w:r>
+    </w:p>
+    <w:p>
+      <w:pPr>
+        <w:pStyle w:val="Corpsdetexte"/>
+        <w:jc w:val="both"/>
+        <w:rPr>
+          <w:lang w:val="en-US"/>
+        </w:rPr>
+      </w:pPr>
+      <w:r>
+        <w:rPr>
+          <w:lang w:val="en-US"/>
+        </w:rPr>
+        <w:t>Hughes, J. M., Graham, D. J. &amp; Rockmore, D. N. (2010). Quantification of artistic style through sparse coding analysis in the drawings of Pieter Bruegel the Elder. Proceedings of the National Academy of Sciences, 107(4), 1279–1283.</w:t>
+      </w:r>
+    </w:p>
+    <w:p>
+      <w:pPr>
+        <w:pStyle w:val="Corpsdetexte"/>
+        <w:jc w:val="both"/>
+        <w:rPr>
+          <w:lang w:val="en-US"/>
+        </w:rPr>
+      </w:pPr>
+      <w:r>
+        <w:rPr>
+          <w:lang w:val="en-US"/>
+        </w:rPr>
+        <w:t>Itti, L., Koch, C. &amp; Niebur, E. (1998). A model of saliency-based visual attention for rapid scene analysis. IEEE Transactions on Pattern Analysis and Machine Intelligence, 20(11), 1254–1259.</w:t>
       </w:r>
     </w:p>
     <w:p>
@@ -6086,37 +6128,37 @@
         <w:rPr>
           <w:lang w:val="en-US"/>
         </w:rPr>
-        <w:t xml:space="preserve">Johnson, C. R., Hendriks, E., Berezhnoy, I. J., Brevdo, E., Hughes, S. M., Daubechies, I., Li, J., Postma, E. &amp; Wang, J. Z. (2008). Image processing for artist identification: Computerized analysis of Vincent van Gogh’s painting brushstrokes. IEEE Signal Processing Magazine, 25(4), 37–48.</w:t>
-      </w:r>
-    </w:p>
-    <w:p>
-      <w:pPr>
-        <w:pStyle w:val="Corpsdetexte"/>
-        <w:jc w:val="both"/>
-        <w:rPr>
-          <w:lang w:val="en-US"/>
-        </w:rPr>
-      </w:pPr>
-      <w:r>
-        <w:rPr>
-          <w:lang w:val="en-US"/>
-        </w:rPr>
-        <w:t xml:space="preserve">Jones-Smith, K. &amp; Mathur, H. (2006). Fractal analysis: Revisiting Pollock’s drip paintings. Nature, 444(7119), E9–E10.</w:t>
-      </w:r>
-    </w:p>
-    <w:p>
-      <w:pPr>
-        <w:pStyle w:val="Corpsdetexte"/>
-        <w:jc w:val="both"/>
-        <w:rPr>
-          <w:lang w:val="en-US"/>
-        </w:rPr>
-      </w:pPr>
-      <w:r>
-        <w:rPr>
-          <w:lang w:val="en-US"/>
-        </w:rPr>
-        <w:t xml:space="preserve">Kim, D., Son, S.-W. &amp; Jeong, H. (2014). Large-scale quantitative analysis of painting arts. Scientific Reports, 4, 7370.</w:t>
+        <w:t>Johnson, C. R., Hendriks, E., Berezhnoy, I. J., Brevdo, E., Hughes, S. M., Daubechies, I., Li, J., Postma, E. &amp; Wang, J. Z. (2008). Image processing for artist identification: Computerized analysis of Vincent van Gogh’s painting brushstrokes. IEEE Signal Processing Magazine, 25(4), 37–48.</w:t>
+      </w:r>
+    </w:p>
+    <w:p>
+      <w:pPr>
+        <w:pStyle w:val="Corpsdetexte"/>
+        <w:jc w:val="both"/>
+        <w:rPr>
+          <w:lang w:val="en-US"/>
+        </w:rPr>
+      </w:pPr>
+      <w:r>
+        <w:rPr>
+          <w:lang w:val="en-US"/>
+        </w:rPr>
+        <w:t>Jones-Smith, K. &amp; Mathur, H. (2006). Fractal analysis: Revisiting Pollock’s drip paintings. Nature, 444(7119), E9–E10.</w:t>
+      </w:r>
+    </w:p>
+    <w:p>
+      <w:pPr>
+        <w:pStyle w:val="Corpsdetexte"/>
+        <w:jc w:val="both"/>
+        <w:rPr>
+          <w:lang w:val="en-US"/>
+        </w:rPr>
+      </w:pPr>
+      <w:r>
+        <w:rPr>
+          <w:lang w:val="en-US"/>
+        </w:rPr>
+        <w:t>Kim, D., Son, S.-W. &amp; Jeong, H. (2014). Large-scale quantitative analysis of painting arts. Scientific Reports, 4, 7370.</w:t>
       </w:r>
     </w:p>
     <w:p>
@@ -6146,7 +6188,7 @@
         <w:rPr>
           <w:lang w:val="en-US"/>
         </w:rPr>
-        <w:t xml:space="preserve">Kittler, F. A. (1985). Aufschreibesysteme 1800/1900. Wilhelm Fink (trad. angl. Discourse Networks 1800/1900, Stanford University Press, 1990).</w:t>
+        <w:t>Kittler, F. A. (1985). Aufschreibesysteme 1800/1900. Wilhelm Fink (trad. angl. Discourse Networks 1800/1900, Stanford University Press, 1990).</w:t>
       </w:r>
     </w:p>
     <w:p>
@@ -6161,7 +6203,7 @@
         <w:t xml:space="preserve">Kittler, F. A. (1986). Grammophon, Film, Typewriter. </w:t>
       </w:r>
       <w:r>
-        <w:t xml:space="preserve">Brinkmann &amp; Bose (trad. fr. Gramophone, Film, Typewriter, Les Presses du réel, 2018).</w:t>
+        <w:t>Brinkmann &amp; Bose (trad. fr. Gramophone, Film, Typewriter, Les Presses du réel, 2018).</w:t>
       </w:r>
     </w:p>
     <w:p>
@@ -6191,7 +6233,7 @@
         <w:rPr>
           <w:lang w:val="en-US"/>
         </w:rPr>
-        <w:t xml:space="preserve">Koch, M., Denzler, J. &amp; Redies, C. (2010). 1/f² characteristics and isotropy in the Fourier power spectra of visual art, cartoons, comics, mangas, and different categories of photographs. PLOS ONE, 5(8), e12268.</w:t>
+        <w:t>Koch, M., Denzler, J. &amp; Redies, C. (2010). 1/f² characteristics and isotropy in the Fourier power spectra of visual art, cartoons, comics, mangas, and different categories of photographs. PLOS ONE, 5(8), e12268.</w:t>
       </w:r>
     </w:p>
     <w:p>
@@ -6236,7 +6278,7 @@
         <w:rPr>
           <w:lang w:val="en-US"/>
         </w:rPr>
-        <w:t xml:space="preserve">Krizhevsky, A., Sutskever, I. &amp; Hinton, G. E. (2012). ImageNet classification with deep convolutional neural networks. Advances in Neural Information Processing Systems, 25, 1097–1105.</w:t>
+        <w:t>Krizhevsky, A., Sutskever, I. &amp; Hinton, G. E. (2012). ImageNet classification with deep convolutional neural networks. Advances in Neural Information Processing Systems, 25, 1097–1105.</w:t>
       </w:r>
     </w:p>
     <w:p>
@@ -6252,106 +6294,106 @@
           <w:lang w:val="en-US"/>
         </w:rPr>
         <w:lastRenderedPageBreak/>
-        <w:t xml:space="preserve">Kümmerer, M., Wallis, T. S. A. &amp; Bethge, M. (2017). DeepGaze II: Reading fixations from deep features trained on object recognition. arXiv preprint, arXiv:1610.01563.</w:t>
-      </w:r>
-    </w:p>
-    <w:p>
-      <w:pPr>
-        <w:pStyle w:val="Corpsdetexte"/>
-        <w:jc w:val="both"/>
-        <w:rPr>
-          <w:lang w:val="en-US"/>
-        </w:rPr>
-      </w:pPr>
-      <w:r>
-        <w:rPr>
-          <w:lang w:val="en-US"/>
-        </w:rPr>
-        <w:t xml:space="preserve">Lang, S. &amp; Ommer, B. (2021). Transforming information into knowledge: How computational methods reshape art history. Digital Humanities Quarterly, 15(3).</w:t>
-      </w:r>
-    </w:p>
-    <w:p>
-      <w:pPr>
-        <w:pStyle w:val="Corpsdetexte"/>
-        <w:jc w:val="both"/>
-        <w:rPr>
-          <w:lang w:val="en-US"/>
-        </w:rPr>
-      </w:pPr>
-      <w:r>
-        <w:rPr>
-          <w:lang w:val="en-US"/>
-        </w:rPr>
-        <w:t xml:space="preserve">Lapuschkin, S., Wäldchen, S., Binder, A., Montavon, G., Samek, W. &amp; Müller, K.-R. (2019). Unmasking Clever Hans predictors and assessing what machines really learn. Nature Communications, 10, 1096.</w:t>
-      </w:r>
-    </w:p>
-    <w:p>
-      <w:pPr>
-        <w:pStyle w:val="Corpsdetexte"/>
-        <w:jc w:val="both"/>
-        <w:rPr>
-          <w:lang w:val="en-US"/>
-        </w:rPr>
-      </w:pPr>
-      <w:r>
-        <w:rPr>
-          <w:lang w:val="en-US"/>
-        </w:rPr>
-        <w:t xml:space="preserve">Le Bomin, S., Lecointre, G. &amp; Heyer, E. (2016). The evolution of musical diversity: The key role of vertical transmission. PLOS ONE, 11(3), e0151570.</w:t>
-      </w:r>
-    </w:p>
-    <w:p>
-      <w:pPr>
-        <w:pStyle w:val="Corpsdetexte"/>
-        <w:jc w:val="both"/>
-        <w:rPr>
-          <w:lang w:val="en-US"/>
-        </w:rPr>
-      </w:pPr>
-      <w:r>
-        <w:rPr>
-          <w:lang w:val="en-US"/>
-        </w:rPr>
-        <w:t xml:space="preserve">LeCun, Y., Bottou, L., Bengio, Y. &amp; Haffner, P. (1998). Gradient-based learning applied to document recognition. Proceedings of the IEEE, 86(11), 2278–2324.</w:t>
-      </w:r>
-    </w:p>
-    <w:p>
-      <w:pPr>
-        <w:pStyle w:val="Corpsdetexte"/>
-        <w:jc w:val="both"/>
-        <w:rPr>
-          <w:lang w:val="en-US"/>
-        </w:rPr>
-      </w:pPr>
-      <w:r>
-        <w:rPr>
-          <w:lang w:val="en-US"/>
-        </w:rPr>
-        <w:t xml:space="preserve">LeCun, Y., Bengio, Y. &amp; Hinton, G. (2015). Deep learning. Nature, 521, 436–444.</w:t>
-      </w:r>
-    </w:p>
-    <w:p>
-      <w:pPr>
-        <w:pStyle w:val="Corpsdetexte"/>
-        <w:jc w:val="both"/>
-        <w:rPr>
-          <w:lang w:val="en-US"/>
-        </w:rPr>
-      </w:pPr>
-      <w:r>
-        <w:rPr>
-          <w:lang w:val="en-US"/>
-        </w:rPr>
-        <w:t xml:space="preserve">Lee, B., Seo, M. K., Kim, D., Shin, I.-S., Schich, M., Jeong, H. &amp; Han, S. K. (2020). Dissecting landscape art history with information theory. Proceedings of the National Academy of Sciences, 117(43), 26580–26590.</w:t>
-      </w:r>
-    </w:p>
-    <w:p>
-      <w:pPr>
-        <w:pStyle w:val="Corpsdetexte"/>
-        <w:jc w:val="both"/>
-      </w:pPr>
-      <w:r>
-        <w:t xml:space="preserve">Lefebvre, T. (2018). La Collection Sainte-Anne (à propos de Dubois A.-M., Entre art des fous et art brut). Revue d’histoire de la pharmacie, 105(398), 264.</w:t>
+        <w:t>Kümmerer, M., Wallis, T. S. A. &amp; Bethge, M. (2017). DeepGaze II: Reading fixations from deep features trained on object recognition. arXiv preprint, arXiv:1610.01563.</w:t>
+      </w:r>
+    </w:p>
+    <w:p>
+      <w:pPr>
+        <w:pStyle w:val="Corpsdetexte"/>
+        <w:jc w:val="both"/>
+        <w:rPr>
+          <w:lang w:val="en-US"/>
+        </w:rPr>
+      </w:pPr>
+      <w:r>
+        <w:rPr>
+          <w:lang w:val="en-US"/>
+        </w:rPr>
+        <w:t>Lang, S. &amp; Ommer, B. (2021). Transforming information into knowledge: How computational methods reshape art history. Digital Humanities Quarterly, 15(3).</w:t>
+      </w:r>
+    </w:p>
+    <w:p>
+      <w:pPr>
+        <w:pStyle w:val="Corpsdetexte"/>
+        <w:jc w:val="both"/>
+        <w:rPr>
+          <w:lang w:val="en-US"/>
+        </w:rPr>
+      </w:pPr>
+      <w:r>
+        <w:rPr>
+          <w:lang w:val="en-US"/>
+        </w:rPr>
+        <w:t>Lapuschkin, S., Wäldchen, S., Binder, A., Montavon, G., Samek, W. &amp; Müller, K.-R. (2019). Unmasking Clever Hans predictors and assessing what machines really learn. Nature Communications, 10, 1096.</w:t>
+      </w:r>
+    </w:p>
+    <w:p>
+      <w:pPr>
+        <w:pStyle w:val="Corpsdetexte"/>
+        <w:jc w:val="both"/>
+        <w:rPr>
+          <w:lang w:val="en-US"/>
+        </w:rPr>
+      </w:pPr>
+      <w:r>
+        <w:rPr>
+          <w:lang w:val="en-US"/>
+        </w:rPr>
+        <w:t>Le Bomin, S., Lecointre, G. &amp; Heyer, E. (2016). The evolution of musical diversity: The key role of vertical transmission. PLOS ONE, 11(3), e0151570.</w:t>
+      </w:r>
+    </w:p>
+    <w:p>
+      <w:pPr>
+        <w:pStyle w:val="Corpsdetexte"/>
+        <w:jc w:val="both"/>
+        <w:rPr>
+          <w:lang w:val="en-US"/>
+        </w:rPr>
+      </w:pPr>
+      <w:r>
+        <w:rPr>
+          <w:lang w:val="en-US"/>
+        </w:rPr>
+        <w:t>LeCun, Y., Bottou, L., Bengio, Y. &amp; Haffner, P. (1998). Gradient-based learning applied to document recognition. Proceedings of the IEEE, 86(11), 2278–2324.</w:t>
+      </w:r>
+    </w:p>
+    <w:p>
+      <w:pPr>
+        <w:pStyle w:val="Corpsdetexte"/>
+        <w:jc w:val="both"/>
+        <w:rPr>
+          <w:lang w:val="en-US"/>
+        </w:rPr>
+      </w:pPr>
+      <w:r>
+        <w:rPr>
+          <w:lang w:val="en-US"/>
+        </w:rPr>
+        <w:t>LeCun, Y., Bengio, Y. &amp; Hinton, G. (2015). Deep learning. Nature, 521, 436–444.</w:t>
+      </w:r>
+    </w:p>
+    <w:p>
+      <w:pPr>
+        <w:pStyle w:val="Corpsdetexte"/>
+        <w:jc w:val="both"/>
+        <w:rPr>
+          <w:lang w:val="en-US"/>
+        </w:rPr>
+      </w:pPr>
+      <w:r>
+        <w:rPr>
+          <w:lang w:val="en-US"/>
+        </w:rPr>
+        <w:t>Lee, B., Seo, M. K., Kim, D., Shin, I.-S., Schich, M., Jeong, H. &amp; Han, S. K. (2020). Dissecting landscape art history with information theory. Proceedings of the National Academy of Sciences, 117(43), 26580–26590.</w:t>
+      </w:r>
+    </w:p>
+    <w:p>
+      <w:pPr>
+        <w:pStyle w:val="Corpsdetexte"/>
+        <w:jc w:val="both"/>
+      </w:pPr>
+      <w:r>
+        <w:t>Lefebvre, T. (2018). La Collection Sainte-Anne (à propos de Dubois A.-M., Entre art des fous et art brut). Revue d’histoire de la pharmacie, 105(398), 264.</w:t>
       </w:r>
     </w:p>
     <w:p>
@@ -6393,7 +6435,7 @@
         <w:rPr>
           <w:lang w:val="en-US"/>
         </w:rPr>
-        <w:t xml:space="preserve">Liang, S. et al. (2025). Enhancing artistic style classification through a novel ArtFusionNet framework. Scientific Reports.</w:t>
+        <w:t>Liang, S. et al. (2025). Enhancing artistic style classification through a novel ArtFusionNet framework. Scientific Reports.</w:t>
       </w:r>
     </w:p>
     <w:p>
@@ -6423,37 +6465,37 @@
         <w:rPr>
           <w:lang w:val="en-US"/>
         </w:rPr>
-        <w:t xml:space="preserve">Liu, Z., Lin, Y., Cao, Y., Hu, H., Wei, Y., Zhang, Z., Lin, S. &amp; Guo, B. (2021). Swin Transformer: Hierarchical vision transformer using shifted windows. In Proceedings of the IEEE/CVF International Conference on Computer Vision (pp. 10012–10022).</w:t>
-      </w:r>
-    </w:p>
-    <w:p>
-      <w:pPr>
-        <w:pStyle w:val="Corpsdetexte"/>
-        <w:jc w:val="both"/>
-        <w:rPr>
-          <w:lang w:val="en-US"/>
-        </w:rPr>
-      </w:pPr>
-      <w:r>
-        <w:rPr>
-          <w:lang w:val="en-US"/>
-        </w:rPr>
-        <w:t xml:space="preserve">Liu, Z., Mao, H., Wu, C.-Y., Feichtenhofer, C., Darrell, T. &amp; Xie, S. (2022). A ConvNet for the 2020s. In Proceedings of the IEEE/CVF Conference on Computer Vision and Pattern Recognition (pp. 11976–11986).</w:t>
-      </w:r>
-    </w:p>
-    <w:p>
-      <w:pPr>
-        <w:pStyle w:val="Corpsdetexte"/>
-        <w:jc w:val="both"/>
-        <w:rPr>
-          <w:lang w:val="en-US"/>
-        </w:rPr>
-      </w:pPr>
-      <w:r>
-        <w:rPr>
-          <w:lang w:val="en-US"/>
-        </w:rPr>
-        <w:t xml:space="preserve">Liu, Y., Bai, H. &amp; Wang, J. (2024a). Fine-art recognition using convolutional transformers. PeerJ Computer Science, 10, e2409.</w:t>
+        <w:t>Liu, Z., Lin, Y., Cao, Y., Hu, H., Wei, Y., Zhang, Z., Lin, S. &amp; Guo, B. (2021). Swin Transformer: Hierarchical vision transformer using shifted windows. In Proceedings of the IEEE/CVF International Conference on Computer Vision (pp. 10012–10022).</w:t>
+      </w:r>
+    </w:p>
+    <w:p>
+      <w:pPr>
+        <w:pStyle w:val="Corpsdetexte"/>
+        <w:jc w:val="both"/>
+        <w:rPr>
+          <w:lang w:val="en-US"/>
+        </w:rPr>
+      </w:pPr>
+      <w:r>
+        <w:rPr>
+          <w:lang w:val="en-US"/>
+        </w:rPr>
+        <w:t>Liu, Z., Mao, H., Wu, C.-Y., Feichtenhofer, C., Darrell, T. &amp; Xie, S. (2022). A ConvNet for the 2020s. In Proceedings of the IEEE/CVF Conference on Computer Vision and Pattern Recognition (pp. 11976–11986).</w:t>
+      </w:r>
+    </w:p>
+    <w:p>
+      <w:pPr>
+        <w:pStyle w:val="Corpsdetexte"/>
+        <w:jc w:val="both"/>
+        <w:rPr>
+          <w:lang w:val="en-US"/>
+        </w:rPr>
+      </w:pPr>
+      <w:r>
+        <w:rPr>
+          <w:lang w:val="en-US"/>
+        </w:rPr>
+        <w:t>Liu, Y., Bai, H. &amp; Wang, J. (2024a). Fine-art recognition using convolutional transformers. PeerJ Computer Science, 10, e2409.</w:t>
       </w:r>
     </w:p>
     <w:p>
@@ -6499,37 +6541,37 @@
         <w:rPr>
           <w:lang w:val="en-US"/>
         </w:rPr>
-        <w:t xml:space="preserve">Lyu, S., Rockmore, D. &amp; Farid, H. (2004). A digital technique for art authentication. Proceedings of the National Academy of Sciences, 101(49), 17006–17010.</w:t>
-      </w:r>
-    </w:p>
-    <w:p>
-      <w:pPr>
-        <w:pStyle w:val="Corpsdetexte"/>
-        <w:jc w:val="both"/>
-        <w:rPr>
-          <w:lang w:val="en-US"/>
-        </w:rPr>
-      </w:pPr>
-      <w:r>
-        <w:rPr>
-          <w:lang w:val="en-US"/>
-        </w:rPr>
-        <w:t xml:space="preserve">Ma, F. &amp; Li, H. (2023). Online painting image clustering for the mental health of college art students based on improved CNN and SMOTE. PeerJ Computer Science, 9, e1462.</w:t>
-      </w:r>
-    </w:p>
-    <w:p>
-      <w:pPr>
-        <w:pStyle w:val="Corpsdetexte"/>
-        <w:jc w:val="both"/>
-        <w:rPr>
-          <w:lang w:val="en-US"/>
-        </w:rPr>
-      </w:pPr>
-      <w:r>
-        <w:rPr>
-          <w:lang w:val="en-US"/>
-        </w:rPr>
-        <w:t xml:space="preserve">Mace, R., Holden, C. J. &amp; Shennan, S. (Eds.). (2005). The Evolution of Cultural Diversity: A Phylogenetic Approach. UCL Press.</w:t>
+        <w:t>Lyu, S., Rockmore, D. &amp; Farid, H. (2004). A digital technique for art authentication. Proceedings of the National Academy of Sciences, 101(49), 17006–17010.</w:t>
+      </w:r>
+    </w:p>
+    <w:p>
+      <w:pPr>
+        <w:pStyle w:val="Corpsdetexte"/>
+        <w:jc w:val="both"/>
+        <w:rPr>
+          <w:lang w:val="en-US"/>
+        </w:rPr>
+      </w:pPr>
+      <w:r>
+        <w:rPr>
+          <w:lang w:val="en-US"/>
+        </w:rPr>
+        <w:t>Ma, F. &amp; Li, H. (2023). Online painting image clustering for the mental health of college art students based on improved CNN and SMOTE. PeerJ Computer Science, 9, e1462.</w:t>
+      </w:r>
+    </w:p>
+    <w:p>
+      <w:pPr>
+        <w:pStyle w:val="Corpsdetexte"/>
+        <w:jc w:val="both"/>
+        <w:rPr>
+          <w:lang w:val="en-US"/>
+        </w:rPr>
+      </w:pPr>
+      <w:r>
+        <w:rPr>
+          <w:lang w:val="en-US"/>
+        </w:rPr>
+        <w:t>Mace, R., Holden, C. J. &amp; Shennan, S. (Eds.). (2005). The Evolution of Cultural Diversity: A Phylogenetic Approach. UCL Press.</w:t>
       </w:r>
     </w:p>
     <w:p>
@@ -6604,7 +6646,7 @@
         <w:rPr>
           <w:lang w:val="en-US"/>
         </w:rPr>
-        <w:t xml:space="preserve">Mallat, S. (2008). A Wavelet Tour of Signal Processing (3e éd.). Academic Press.</w:t>
+        <w:t>Mallat, S. (2008). A Wavelet Tour of Signal Processing (3e éd.). Academic Press.</w:t>
       </w:r>
     </w:p>
     <w:p>
@@ -6649,52 +6691,52 @@
         <w:rPr>
           <w:lang w:val="en-US"/>
         </w:rPr>
-        <w:t xml:space="preserve">Marek, S., Tervo-Clemmens, B., Calabro, F. J. et al. (2022). Reproducible brain-wide association studies require thousands of individuals. Nature, 603(7902), 654–660.</w:t>
-      </w:r>
-    </w:p>
-    <w:p>
-      <w:pPr>
-        <w:pStyle w:val="Corpsdetexte"/>
-        <w:jc w:val="both"/>
-        <w:rPr>
-          <w:lang w:val="en-US"/>
-        </w:rPr>
-      </w:pPr>
-      <w:r>
-        <w:rPr>
-          <w:lang w:val="en-US"/>
-        </w:rPr>
-        <w:t xml:space="preserve">Massaro, D., Savazzi, F., Di Dio, C., Freedberg, D., Gallese, V., Gilli, G. &amp; Marchetti, A. (2012). When art moves the eyes: A behavioral and eye-tracking study. PLOS ONE, 7(5), e37285.</w:t>
-      </w:r>
-    </w:p>
-    <w:p>
-      <w:pPr>
-        <w:pStyle w:val="Corpsdetexte"/>
-        <w:jc w:val="both"/>
-        <w:rPr>
-          <w:lang w:val="en-US"/>
-        </w:rPr>
-      </w:pPr>
-      <w:r>
-        <w:rPr>
-          <w:lang w:val="en-US"/>
-        </w:rPr>
-        <w:t xml:space="preserve">McInnes, L., Healy, J. &amp; Melville, J. (2018). UMAP: Uniform Manifold Approximation and Projection for dimension reduction. arXiv preprint, arXiv:1802.03426.</w:t>
-      </w:r>
-    </w:p>
-    <w:p>
-      <w:pPr>
-        <w:pStyle w:val="Corpsdetexte"/>
-        <w:jc w:val="both"/>
-        <w:rPr>
-          <w:lang w:val="en-US"/>
-        </w:rPr>
-      </w:pPr>
-      <w:r>
-        <w:rPr>
-          <w:lang w:val="en-US"/>
-        </w:rPr>
-        <w:t xml:space="preserve">McManus, I. C., Stöver, K. &amp; Kim, D. (2011). Arnheim’s gestalt theory of visual balance: Examining the compositional structure of art. i-Perception, 2(6), 615–647.</w:t>
+        <w:t>Marek, S., Tervo-Clemmens, B., Calabro, F. J. et al. (2022). Reproducible brain-wide association studies require thousands of individuals. Nature, 603(7902), 654–660.</w:t>
+      </w:r>
+    </w:p>
+    <w:p>
+      <w:pPr>
+        <w:pStyle w:val="Corpsdetexte"/>
+        <w:jc w:val="both"/>
+        <w:rPr>
+          <w:lang w:val="en-US"/>
+        </w:rPr>
+      </w:pPr>
+      <w:r>
+        <w:rPr>
+          <w:lang w:val="en-US"/>
+        </w:rPr>
+        <w:t>Massaro, D., Savazzi, F., Di Dio, C., Freedberg, D., Gallese, V., Gilli, G. &amp; Marchetti, A. (2012). When art moves the eyes: A behavioral and eye-tracking study. PLOS ONE, 7(5), e37285.</w:t>
+      </w:r>
+    </w:p>
+    <w:p>
+      <w:pPr>
+        <w:pStyle w:val="Corpsdetexte"/>
+        <w:jc w:val="both"/>
+        <w:rPr>
+          <w:lang w:val="en-US"/>
+        </w:rPr>
+      </w:pPr>
+      <w:r>
+        <w:rPr>
+          <w:lang w:val="en-US"/>
+        </w:rPr>
+        <w:t>McInnes, L., Healy, J. &amp; Melville, J. (2018). UMAP: Uniform Manifold Approximation and Projection for dimension reduction. arXiv preprint, arXiv:1802.03426.</w:t>
+      </w:r>
+    </w:p>
+    <w:p>
+      <w:pPr>
+        <w:pStyle w:val="Corpsdetexte"/>
+        <w:jc w:val="both"/>
+        <w:rPr>
+          <w:lang w:val="en-US"/>
+        </w:rPr>
+      </w:pPr>
+      <w:r>
+        <w:rPr>
+          <w:lang w:val="en-US"/>
+        </w:rPr>
+        <w:t>McManus, I. C., Stöver, K. &amp; Kim, D. (2011). Arnheim’s gestalt theory of visual balance: Examining the compositional structure of art. i-Perception, 2(6), 615–647.</w:t>
       </w:r>
     </w:p>
     <w:p>
@@ -6742,22 +6784,22 @@
         <w:rPr>
           <w:lang w:val="en-US"/>
         </w:rPr>
-        <w:t xml:space="preserve">Morgenthaler, W. (1921). Ein Geisteskranker als Künstler (Adolf Wölfli). Ernst Bircher.</w:t>
-      </w:r>
-    </w:p>
-    <w:p>
-      <w:pPr>
-        <w:pStyle w:val="Corpsdetexte"/>
-        <w:jc w:val="both"/>
-        <w:rPr>
-          <w:lang w:val="en-US"/>
-        </w:rPr>
-      </w:pPr>
-      <w:r>
-        <w:rPr>
-          <w:lang w:val="en-US"/>
-        </w:rPr>
-        <w:t xml:space="preserve">Munnangi, R. R. &amp; Giunti, B. (2025). The persistence of painting styles. arXiv preprint, arXiv:2511.16695.</w:t>
+        <w:t>Morgenthaler, W. (1921). Ein Geisteskranker als Künstler (Adolf Wölfli). Ernst Bircher.</w:t>
+      </w:r>
+    </w:p>
+    <w:p>
+      <w:pPr>
+        <w:pStyle w:val="Corpsdetexte"/>
+        <w:jc w:val="both"/>
+        <w:rPr>
+          <w:lang w:val="en-US"/>
+        </w:rPr>
+      </w:pPr>
+      <w:r>
+        <w:rPr>
+          <w:lang w:val="en-US"/>
+        </w:rPr>
+        <w:t>Munnangi, R. R. &amp; Giunti, B. (2025). The persistence of painting styles. arXiv preprint, arXiv:2511.16695.</w:t>
       </w:r>
     </w:p>
     <w:p>
@@ -6773,37 +6815,37 @@
           <w:lang w:val="en-US"/>
         </w:rPr>
         <w:lastRenderedPageBreak/>
-        <w:t xml:space="preserve">Mureika, J. R., Cupchik, G. C. &amp; Dyer, C. C. (2005). Multifractal structure in nonrepresentational art. Physical Review E, 72(4), 046101.</w:t>
-      </w:r>
-    </w:p>
-    <w:p>
-      <w:pPr>
-        <w:pStyle w:val="Corpsdetexte"/>
-        <w:jc w:val="both"/>
-        <w:rPr>
-          <w:lang w:val="en-US"/>
-        </w:rPr>
-      </w:pPr>
-      <w:r>
-        <w:rPr>
-          <w:lang w:val="en-US"/>
-        </w:rPr>
-        <w:t xml:space="preserve">Mureika, J. R. &amp; Taylor, R. P. (2013). The abstract expressionists and Les Automatistes: A shared multi-fractal depth? Signal Processing, 93(3), 573–578.</w:t>
-      </w:r>
-    </w:p>
-    <w:p>
-      <w:pPr>
-        <w:pStyle w:val="Corpsdetexte"/>
-        <w:jc w:val="both"/>
-        <w:rPr>
-          <w:lang w:val="en-US"/>
-        </w:rPr>
-      </w:pPr>
-      <w:r>
-        <w:rPr>
-          <w:lang w:val="en-US"/>
-        </w:rPr>
-        <w:t xml:space="preserve">Nakauchi, S. &amp; Tamura, H. (2022). Regularity of colour statistics in explaining colour composition preferences in art paintings. Scientific Reports, 12, 14585.</w:t>
+        <w:t>Mureika, J. R., Cupchik, G. C. &amp; Dyer, C. C. (2005). Multifractal structure in nonrepresentational art. Physical Review E, 72(4), 046101.</w:t>
+      </w:r>
+    </w:p>
+    <w:p>
+      <w:pPr>
+        <w:pStyle w:val="Corpsdetexte"/>
+        <w:jc w:val="both"/>
+        <w:rPr>
+          <w:lang w:val="en-US"/>
+        </w:rPr>
+      </w:pPr>
+      <w:r>
+        <w:rPr>
+          <w:lang w:val="en-US"/>
+        </w:rPr>
+        <w:t>Mureika, J. R. &amp; Taylor, R. P. (2013). The abstract expressionists and Les Automatistes: A shared multi-fractal depth? Signal Processing, 93(3), 573–578.</w:t>
+      </w:r>
+    </w:p>
+    <w:p>
+      <w:pPr>
+        <w:pStyle w:val="Corpsdetexte"/>
+        <w:jc w:val="both"/>
+        <w:rPr>
+          <w:lang w:val="en-US"/>
+        </w:rPr>
+      </w:pPr>
+      <w:r>
+        <w:rPr>
+          <w:lang w:val="en-US"/>
+        </w:rPr>
+        <w:t>Nakauchi, S. &amp; Tamura, H. (2022). Regularity of colour statistics in explaining colour composition preferences in art paintings. Scientific Reports, 12, 14585.</w:t>
       </w:r>
     </w:p>
     <w:p>
@@ -6833,7 +6875,7 @@
         <w:rPr>
           <w:lang w:val="en-US"/>
         </w:rPr>
-        <w:t xml:space="preserve">Ojala, T., Pietikäinen, M. &amp; Mäenpää, T. (2002). Multiresolution gray-scale and rotation invariant texture classification with local binary patterns. IEEE Transactions on Pattern Analysis and Machine Intelligence, 24(7), 971–987.</w:t>
+        <w:t>Ojala, T., Pietikäinen, M. &amp; Mäenpää, T. (2002). Multiresolution gray-scale and rotation invariant texture classification with local binary patterns. IEEE Transactions on Pattern Analysis and Machine Intelligence, 24(7), 971–987.</w:t>
       </w:r>
     </w:p>
     <w:p>
@@ -6896,22 +6938,22 @@
         <w:rPr>
           <w:lang w:val="en-US"/>
         </w:rPr>
-        <w:t xml:space="preserve">Osu, R., Ota, K., Fujiwara, T., Otaka, Y., Kawato, M. &amp; Liu, M. (2011). Quantifying the quality of hand movement in stroke patients through three-dimensional curvature. Journal of NeuroEngineering and Rehabilitation, 8, 62.</w:t>
-      </w:r>
-    </w:p>
-    <w:p>
-      <w:pPr>
-        <w:pStyle w:val="Corpsdetexte"/>
-        <w:jc w:val="both"/>
-        <w:rPr>
-          <w:lang w:val="en-US"/>
-        </w:rPr>
-      </w:pPr>
-      <w:r>
-        <w:rPr>
-          <w:lang w:val="en-US"/>
-        </w:rPr>
-        <w:t xml:space="preserve">Otter, N., Porter, M. A., Tillmann, U., Grindrod, P. &amp; Harrington, H. A. (2017). A roadmap for the computation of persistent homology. EPJ Data Science, 6, 17.</w:t>
+        <w:t>Osu, R., Ota, K., Fujiwara, T., Otaka, Y., Kawato, M. &amp; Liu, M. (2011). Quantifying the quality of hand movement in stroke patients through three-dimensional curvature. Journal of NeuroEngineering and Rehabilitation, 8, 62.</w:t>
+      </w:r>
+    </w:p>
+    <w:p>
+      <w:pPr>
+        <w:pStyle w:val="Corpsdetexte"/>
+        <w:jc w:val="both"/>
+        <w:rPr>
+          <w:lang w:val="en-US"/>
+        </w:rPr>
+      </w:pPr>
+      <w:r>
+        <w:rPr>
+          <w:lang w:val="en-US"/>
+        </w:rPr>
+        <w:t>Otter, N., Porter, M. A., Tillmann, U., Grindrod, P. &amp; Harrington, H. A. (2017). A roadmap for the computation of persistent homology. EPJ Data Science, 6, 17.</w:t>
       </w:r>
     </w:p>
     <w:p>
@@ -6941,7 +6983,7 @@
         <w:rPr>
           <w:lang w:val="en-US"/>
         </w:rPr>
-        <w:t xml:space="preserve">Patterson, J. D., Barbot, B., Lloyd-Cox, J. &amp; Beaty, R. E. (2024). AuDrA: An automated drawing assessment platform for evaluating creativity. Behavior Research Methods, 56, 3619–3636.</w:t>
+        <w:t>Patterson, J. D., Barbot, B., Lloyd-Cox, J. &amp; Beaty, R. E. (2024). AuDrA: An automated drawing assessment platform for evaluating creativity. Behavior Research Methods, 56, 3619–3636.</w:t>
       </w:r>
     </w:p>
     <w:p>
@@ -6986,22 +7028,22 @@
         <w:rPr>
           <w:lang w:val="en-US"/>
         </w:rPr>
-        <w:t xml:space="preserve">Piechowski-Jóźwiak, B. &amp; Bogousslavsky, J. (2018). Dementia and change of style: Willem de Kooning. Frontiers of Neurology and Neuroscience, 43, 96–104.</w:t>
-      </w:r>
-    </w:p>
-    <w:p>
-      <w:pPr>
-        <w:pStyle w:val="Corpsdetexte"/>
-        <w:jc w:val="both"/>
-        <w:rPr>
-          <w:lang w:val="en-US"/>
-        </w:rPr>
-      </w:pPr>
-      <w:r>
-        <w:rPr>
-          <w:lang w:val="en-US"/>
-        </w:rPr>
-        <w:t xml:space="preserve">Polatkan, G., Jafarpour, S., Brasoveanu, A., Hughes, S. &amp; Daubechies, I. (2009). Detection of forgery in paintings using supervised learning. In IEEE International Conference on Image Processing (pp. 2921–2924).</w:t>
+        <w:t>Piechowski-Jóźwiak, B. &amp; Bogousslavsky, J. (2018). Dementia and change of style: Willem de Kooning. Frontiers of Neurology and Neuroscience, 43, 96–104.</w:t>
+      </w:r>
+    </w:p>
+    <w:p>
+      <w:pPr>
+        <w:pStyle w:val="Corpsdetexte"/>
+        <w:jc w:val="both"/>
+        <w:rPr>
+          <w:lang w:val="en-US"/>
+        </w:rPr>
+      </w:pPr>
+      <w:r>
+        <w:rPr>
+          <w:lang w:val="en-US"/>
+        </w:rPr>
+        <w:t>Polatkan, G., Jafarpour, S., Brasoveanu, A., Hughes, S. &amp; Daubechies, I. (2009). Detection of forgery in paintings using supervised learning. In IEEE International Conference on Image Processing (pp. 2921–2924).</w:t>
       </w:r>
     </w:p>
     <w:p>
@@ -7035,37 +7077,37 @@
           <w:lang w:val="en-US"/>
         </w:rPr>
         <w:lastRenderedPageBreak/>
-        <w:t xml:space="preserve">Quaak, M., van de Mortel, L., Thomas, R. M. &amp; van Wingen, G. (2021). Deep learning applications for the classification of psychiatric disorders using neuroimaging data: Systematic review and meta-analysis. NeuroImage: Clinical, 30, 102584.</w:t>
-      </w:r>
-    </w:p>
-    <w:p>
-      <w:pPr>
-        <w:pStyle w:val="Corpsdetexte"/>
-        <w:jc w:val="both"/>
-        <w:rPr>
-          <w:lang w:val="en-US"/>
-        </w:rPr>
-      </w:pPr>
-      <w:r>
-        <w:rPr>
-          <w:lang w:val="en-US"/>
-        </w:rPr>
-        <w:t xml:space="preserve">Radford, A., Kim, J. W., Hallacy, C., Ramesh, A., Goh, G., Agarwal, S. et al. (2021). Learning transferable visual models from natural language supervision. In International Conference on Machine Learning (pp. 8748–8763).</w:t>
-      </w:r>
-    </w:p>
-    <w:p>
-      <w:pPr>
-        <w:pStyle w:val="Corpsdetexte"/>
-        <w:jc w:val="both"/>
-        <w:rPr>
-          <w:lang w:val="en-US"/>
-        </w:rPr>
-      </w:pPr>
-      <w:r>
-        <w:rPr>
-          <w:lang w:val="en-US"/>
-        </w:rPr>
-        <w:t xml:space="preserve">Redies, C., Hasenstein, J. &amp; Denzler, J. (2007). Fractal-like image statistics in visual art: Similarity to natural scenes. Spatial Vision, 21(1), 137–148.</w:t>
+        <w:t>Quaak, M., van de Mortel, L., Thomas, R. M. &amp; van Wingen, G. (2021). Deep learning applications for the classification of psychiatric disorders using neuroimaging data: Systematic review and meta-analysis. NeuroImage: Clinical, 30, 102584.</w:t>
+      </w:r>
+    </w:p>
+    <w:p>
+      <w:pPr>
+        <w:pStyle w:val="Corpsdetexte"/>
+        <w:jc w:val="both"/>
+        <w:rPr>
+          <w:lang w:val="en-US"/>
+        </w:rPr>
+      </w:pPr>
+      <w:r>
+        <w:rPr>
+          <w:lang w:val="en-US"/>
+        </w:rPr>
+        <w:t>Radford, A., Kim, J. W., Hallacy, C., Ramesh, A., Goh, G., Agarwal, S. et al. (2021). Learning transferable visual models from natural language supervision. In International Conference on Machine Learning (pp. 8748–8763).</w:t>
+      </w:r>
+    </w:p>
+    <w:p>
+      <w:pPr>
+        <w:pStyle w:val="Corpsdetexte"/>
+        <w:jc w:val="both"/>
+        <w:rPr>
+          <w:lang w:val="en-US"/>
+        </w:rPr>
+      </w:pPr>
+      <w:r>
+        <w:rPr>
+          <w:lang w:val="en-US"/>
+        </w:rPr>
+        <w:t>Redies, C., Hasenstein, J. &amp; Denzler, J. (2007). Fractal-like image statistics in visual art: Similarity to natural scenes. Spatial Vision, 21(1), 137–148.</w:t>
       </w:r>
     </w:p>
     <w:p>
@@ -7095,7 +7137,7 @@
         <w:rPr>
           <w:lang w:val="en-US"/>
         </w:rPr>
-        <w:t xml:space="preserve">Redmon, J., Divvala, S., Girshick, R. &amp; Farhadi, A. (2016). You only look once: Unified, real-time object detection. In Proceedings of the IEEE Conference on Computer Vision and Pattern Recognition (pp. 779–788).</w:t>
+        <w:t>Redmon, J., Divvala, S., Girshick, R. &amp; Farhadi, A. (2016). You only look once: Unified, real-time object detection. In Proceedings of the IEEE Conference on Computer Vision and Pattern Recognition (pp. 779–788).</w:t>
       </w:r>
     </w:p>
     <w:p>
@@ -7140,7 +7182,7 @@
         <w:rPr>
           <w:lang w:val="en-US"/>
         </w:rPr>
-        <w:t xml:space="preserve">Roberto, J. &amp; Davis, B. (2020). Towards the ontologization of the outsider art domain: Position paper. In Proceedings of the 16th Joint ACL-ISO Workshop on Interoperable Semantic Annotation (ISA-16), LREC 2020 (pp. 94–101). European Language Resources Association.</w:t>
+        <w:t>Roberto, J. &amp; Davis, B. (2020). Towards the ontologization of the outsider art domain: Position paper. In Proceedings of the 16th Joint ACL-ISO Workshop on Interoperable Semantic Annotation (ISA-16), LREC 2020 (pp. 94–101). European Language Resources Association.</w:t>
       </w:r>
     </w:p>
     <w:p>
@@ -7170,52 +7212,52 @@
         <w:rPr>
           <w:lang w:val="en-US"/>
         </w:rPr>
-        <w:t xml:space="preserve">Rombach, R., Blattmann, A., Lorenz, D., Esser, P. &amp; Ommer, B. (2022). High-resolution image synthesis with latent diffusion models. In Proceedings of the IEEE/CVF Conference on Computer Vision and Pattern Recognition (pp. 10684–10695).</w:t>
-      </w:r>
-    </w:p>
-    <w:p>
-      <w:pPr>
-        <w:pStyle w:val="Corpsdetexte"/>
-        <w:jc w:val="both"/>
-        <w:rPr>
-          <w:lang w:val="en-US"/>
-        </w:rPr>
-      </w:pPr>
-      <w:r>
-        <w:rPr>
-          <w:lang w:val="en-US"/>
-        </w:rPr>
-        <w:t xml:space="preserve">Romero, J., Gómez-Robledo, L. &amp; Nieves, J. L. (2018). Computational color analysis of paintings for different artists of the XVI and XVII centuries. Color Research &amp; Application, 43(6), 943–953.</w:t>
-      </w:r>
-    </w:p>
-    <w:p>
-      <w:pPr>
-        <w:pStyle w:val="Corpsdetexte"/>
-        <w:jc w:val="both"/>
-        <w:rPr>
-          <w:lang w:val="en-US"/>
-        </w:rPr>
-      </w:pPr>
-      <w:r>
-        <w:rPr>
-          <w:lang w:val="en-US"/>
-        </w:rPr>
-        <w:t xml:space="preserve">Rosso, O. A., Larrondo, H. A., Martin, M. T., Plastino, A. &amp; Fuentes, M. A. (2007). Distinguishing noise from chaos. Physical Review Letters, 99(15), 154102.</w:t>
-      </w:r>
-    </w:p>
-    <w:p>
-      <w:pPr>
-        <w:pStyle w:val="Corpsdetexte"/>
-        <w:jc w:val="both"/>
-        <w:rPr>
-          <w:lang w:val="en-US"/>
-        </w:rPr>
-      </w:pPr>
-      <w:r>
-        <w:rPr>
-          <w:lang w:val="en-US"/>
-        </w:rPr>
-        <w:t xml:space="preserve">Rubin, E. (1915). Synsoplevede Figurer. Gyldendalske Boghandel, Copenhague.</w:t>
+        <w:t>Rombach, R., Blattmann, A., Lorenz, D., Esser, P. &amp; Ommer, B. (2022). High-resolution image synthesis with latent diffusion models. In Proceedings of the IEEE/CVF Conference on Computer Vision and Pattern Recognition (pp. 10684–10695).</w:t>
+      </w:r>
+    </w:p>
+    <w:p>
+      <w:pPr>
+        <w:pStyle w:val="Corpsdetexte"/>
+        <w:jc w:val="both"/>
+        <w:rPr>
+          <w:lang w:val="en-US"/>
+        </w:rPr>
+      </w:pPr>
+      <w:r>
+        <w:rPr>
+          <w:lang w:val="en-US"/>
+        </w:rPr>
+        <w:t>Romero, J., Gómez-Robledo, L. &amp; Nieves, J. L. (2018). Computational color analysis of paintings for different artists of the XVI and XVII centuries. Color Research &amp; Application, 43(6), 943–953.</w:t>
+      </w:r>
+    </w:p>
+    <w:p>
+      <w:pPr>
+        <w:pStyle w:val="Corpsdetexte"/>
+        <w:jc w:val="both"/>
+        <w:rPr>
+          <w:lang w:val="en-US"/>
+        </w:rPr>
+      </w:pPr>
+      <w:r>
+        <w:rPr>
+          <w:lang w:val="en-US"/>
+        </w:rPr>
+        <w:t>Rosso, O. A., Larrondo, H. A., Martin, M. T., Plastino, A. &amp; Fuentes, M. A. (2007). Distinguishing noise from chaos. Physical Review Letters, 99(15), 154102.</w:t>
+      </w:r>
+    </w:p>
+    <w:p>
+      <w:pPr>
+        <w:pStyle w:val="Corpsdetexte"/>
+        <w:jc w:val="both"/>
+        <w:rPr>
+          <w:lang w:val="en-US"/>
+        </w:rPr>
+      </w:pPr>
+      <w:r>
+        <w:rPr>
+          <w:lang w:val="en-US"/>
+        </w:rPr>
+        <w:t>Rubin, E. (1915). Synsoplevede Figurer. Gyldendalske Boghandel, Copenhague.</w:t>
       </w:r>
     </w:p>
     <w:p>
@@ -7263,7 +7305,7 @@
         <w:rPr>
           <w:lang w:val="en-US"/>
         </w:rPr>
-        <w:t xml:space="preserve">Saitou, N. &amp; Nei, M. (1987). The neighbor-joining method: A new method for reconstructing phylogenetic trees. Molecular Biology and Evolution, 4(4), 406–425.</w:t>
+        <w:t>Saitou, N. &amp; Nei, M. (1987). The neighbor-joining method: A new method for reconstructing phylogenetic trees. Molecular Biology and Evolution, 4(4), 406–425.</w:t>
       </w:r>
     </w:p>
     <w:p>
@@ -7279,37 +7321,37 @@
           <w:lang w:val="en-US"/>
         </w:rPr>
         <w:lastRenderedPageBreak/>
-        <w:t xml:space="preserve">Schich, M., Song, C., Ahn, Y.-Y., Mirsky, A., Martino, M., Barabási, A.-L. &amp; Helbing, D. (2014). A network framework of cultural history. Science, 345(6196), 558–562.</w:t>
-      </w:r>
-    </w:p>
-    <w:p>
-      <w:pPr>
-        <w:pStyle w:val="Corpsdetexte"/>
-        <w:jc w:val="both"/>
-        <w:rPr>
-          <w:lang w:val="en-US"/>
-        </w:rPr>
-      </w:pPr>
-      <w:r>
-        <w:rPr>
-          <w:lang w:val="en-US"/>
-        </w:rPr>
-        <w:t xml:space="preserve">Selim, A., Elgharib, M. &amp; Doyle, L. (2016). Painting style transfer for head portraits using convolutional neural networks. ACM Transactions on Graphics, 35(4), 1–18.</w:t>
-      </w:r>
-    </w:p>
-    <w:p>
-      <w:pPr>
-        <w:pStyle w:val="Corpsdetexte"/>
-        <w:jc w:val="both"/>
-        <w:rPr>
-          <w:lang w:val="en-US"/>
-        </w:rPr>
-      </w:pPr>
-      <w:r>
-        <w:rPr>
-          <w:lang w:val="en-US"/>
-        </w:rPr>
-        <w:t xml:space="preserve">Selvaraju, R. R., Cogswell, M., Das, A., Vedantam, R., Parikh, D. &amp; Batra, D. (2017). Grad-CAM: Visual explanations from deep networks via gradient-based localization. In Proceedings of the IEEE International Conference on Computer Vision (pp. 618–626).</w:t>
+        <w:t>Schich, M., Song, C., Ahn, Y.-Y., Mirsky, A., Martino, M., Barabási, A.-L. &amp; Helbing, D. (2014). A network framework of cultural history. Science, 345(6196), 558–562.</w:t>
+      </w:r>
+    </w:p>
+    <w:p>
+      <w:pPr>
+        <w:pStyle w:val="Corpsdetexte"/>
+        <w:jc w:val="both"/>
+        <w:rPr>
+          <w:lang w:val="en-US"/>
+        </w:rPr>
+      </w:pPr>
+      <w:r>
+        <w:rPr>
+          <w:lang w:val="en-US"/>
+        </w:rPr>
+        <w:t>Selim, A., Elgharib, M. &amp; Doyle, L. (2016). Painting style transfer for head portraits using convolutional neural networks. ACM Transactions on Graphics, 35(4), 1–18.</w:t>
+      </w:r>
+    </w:p>
+    <w:p>
+      <w:pPr>
+        <w:pStyle w:val="Corpsdetexte"/>
+        <w:jc w:val="both"/>
+        <w:rPr>
+          <w:lang w:val="en-US"/>
+        </w:rPr>
+      </w:pPr>
+      <w:r>
+        <w:rPr>
+          <w:lang w:val="en-US"/>
+        </w:rPr>
+        <w:t>Selvaraju, R. R., Cogswell, M., Das, A., Vedantam, R., Parikh, D. &amp; Batra, D. (2017). Grad-CAM: Visual explanations from deep networks via gradient-based localization. In Proceedings of the IEEE International Conference on Computer Vision (pp. 618–626).</w:t>
       </w:r>
     </w:p>
     <w:p>
@@ -7339,22 +7381,22 @@
         <w:rPr>
           <w:lang w:val="en-US"/>
         </w:rPr>
-        <w:t xml:space="preserve">Shapley, L. S. (1953). A value for n-person games. In H. W. Kuhn &amp; A. W. Tucker (Eds.), Contributions to the Theory of Games (Vol. II, pp. 307–317). Princeton University Press.</w:t>
-      </w:r>
-    </w:p>
-    <w:p>
-      <w:pPr>
-        <w:pStyle w:val="Corpsdetexte"/>
-        <w:jc w:val="both"/>
-        <w:rPr>
-          <w:lang w:val="en-US"/>
-        </w:rPr>
-      </w:pPr>
-      <w:r>
-        <w:rPr>
-          <w:lang w:val="en-US"/>
-        </w:rPr>
-        <w:t xml:space="preserve">Sharma, G., Wu, W. &amp; Dalal, E. N. (2005). The CIEDE2000 color-difference formula: Implementation notes, supplementary test data, and mathematical observations. Color Research &amp; Application, 30(1), 21–30.</w:t>
+        <w:t>Shapley, L. S. (1953). A value for n-person games. In H. W. Kuhn &amp; A. W. Tucker (Eds.), Contributions to the Theory of Games (Vol. II, pp. 307–317). Princeton University Press.</w:t>
+      </w:r>
+    </w:p>
+    <w:p>
+      <w:pPr>
+        <w:pStyle w:val="Corpsdetexte"/>
+        <w:jc w:val="both"/>
+        <w:rPr>
+          <w:lang w:val="en-US"/>
+        </w:rPr>
+      </w:pPr>
+      <w:r>
+        <w:rPr>
+          <w:lang w:val="en-US"/>
+        </w:rPr>
+        <w:t>Sharma, G., Wu, W. &amp; Dalal, E. N. (2005). The CIEDE2000 color-difference formula: Implementation notes, supplementary test data, and mathematical observations. Color Research &amp; Application, 30(1), 21–30.</w:t>
       </w:r>
     </w:p>
     <w:p>
@@ -7384,22 +7426,22 @@
         <w:rPr>
           <w:lang w:val="en-US"/>
         </w:rPr>
-        <w:t xml:space="preserve">Sifre, L. &amp; Mallat, S. (2013). Rotation, scaling and deformation invariant scattering for texture discrimination. In IEEE Conference on Computer Vision and Pattern Recognition (pp. 1233–1240).</w:t>
-      </w:r>
-    </w:p>
-    <w:p>
-      <w:pPr>
-        <w:pStyle w:val="Corpsdetexte"/>
-        <w:jc w:val="both"/>
-        <w:rPr>
-          <w:lang w:val="en-US"/>
-        </w:rPr>
-      </w:pPr>
-      <w:r>
-        <w:rPr>
-          <w:lang w:val="en-US"/>
-        </w:rPr>
-        <w:t xml:space="preserve">Sigaki, H. Y. D., Perc, M. &amp; Ribeiro, H. V. (2018). History of art paintings through the lens of entropy and complexity. Proceedings of the National Academy of Sciences, 115(37), E8585–E8594.</w:t>
+        <w:t>Sifre, L. &amp; Mallat, S. (2013). Rotation, scaling and deformation invariant scattering for texture discrimination. In IEEE Conference on Computer Vision and Pattern Recognition (pp. 1233–1240).</w:t>
+      </w:r>
+    </w:p>
+    <w:p>
+      <w:pPr>
+        <w:pStyle w:val="Corpsdetexte"/>
+        <w:jc w:val="both"/>
+        <w:rPr>
+          <w:lang w:val="en-US"/>
+        </w:rPr>
+      </w:pPr>
+      <w:r>
+        <w:rPr>
+          <w:lang w:val="en-US"/>
+        </w:rPr>
+        <w:t>Sigaki, H. Y. D., Perc, M. &amp; Ribeiro, H. V. (2018). History of art paintings through the lens of entropy and complexity. Proceedings of the National Academy of Sciences, 115(37), E8585–E8594.</w:t>
       </w:r>
     </w:p>
     <w:p>
@@ -7477,7 +7519,7 @@
         <w:t xml:space="preserve">Sobel, I. &amp; Feldman, G. (1968). A 3 × 3 isotropic gradient operator for image processing. </w:t>
       </w:r>
       <w:r>
-        <w:t xml:space="preserve">Présenté au Stanford Artificial Intelligence Project (SAIL).</w:t>
+        <w:t>Présenté au Stanford Artificial Intelligence Project (SAIL).</w:t>
       </w:r>
     </w:p>
     <w:p>
@@ -7511,22 +7553,22 @@
           <w:lang w:val="en-US"/>
         </w:rPr>
         <w:lastRenderedPageBreak/>
-        <w:t xml:space="preserve">Spehar, B., Clifford, C. W. G., Newell, B. R. &amp; Taylor, R. P. (2003). Universal aesthetic of fractals. Computers &amp; Graphics, 27(5), 813–820.</w:t>
-      </w:r>
-    </w:p>
-    <w:p>
-      <w:pPr>
-        <w:pStyle w:val="Corpsdetexte"/>
-        <w:jc w:val="both"/>
-        <w:rPr>
-          <w:lang w:val="en-US"/>
-        </w:rPr>
-      </w:pPr>
-      <w:r>
-        <w:rPr>
-          <w:lang w:val="en-US"/>
-        </w:rPr>
-        <w:t xml:space="preserve">Stanley, H. E. &amp; Meakin, P. (1988). Multifractal phenomena in physics and chemistry. Nature, 335, 405–409.</w:t>
+        <w:t>Spehar, B., Clifford, C. W. G., Newell, B. R. &amp; Taylor, R. P. (2003). Universal aesthetic of fractals. Computers &amp; Graphics, 27(5), 813–820.</w:t>
+      </w:r>
+    </w:p>
+    <w:p>
+      <w:pPr>
+        <w:pStyle w:val="Corpsdetexte"/>
+        <w:jc w:val="both"/>
+        <w:rPr>
+          <w:lang w:val="en-US"/>
+        </w:rPr>
+      </w:pPr>
+      <w:r>
+        <w:rPr>
+          <w:lang w:val="en-US"/>
+        </w:rPr>
+        <w:t>Stanley, H. E. &amp; Meakin, P. (1988). Multifractal phenomena in physics and chemistry. Nature, 335, 405–409.</w:t>
       </w:r>
     </w:p>
     <w:p>
@@ -7556,37 +7598,37 @@
         <w:rPr>
           <w:lang w:val="en-US"/>
         </w:rPr>
-        <w:t xml:space="preserve">Sánchez, J. A., Romero, V., Toselli, A. H., Villegas, M. &amp; Vidal, E. (2019). A set of benchmarks for handwritten text recognition on historical documents. Pattern Recognition, 94, 122–134.</w:t>
-      </w:r>
-    </w:p>
-    <w:p>
-      <w:pPr>
-        <w:pStyle w:val="Corpsdetexte"/>
-        <w:jc w:val="both"/>
-        <w:rPr>
-          <w:lang w:val="en-US"/>
-        </w:rPr>
-      </w:pPr>
-      <w:r>
-        <w:rPr>
-          <w:lang w:val="en-US"/>
-        </w:rPr>
-        <w:t xml:space="preserve">Tan, M. &amp; Le, Q. (2019). EfficientNet: Rethinking model scaling for convolutional neural networks. In International Conference on Machine Learning (pp. 6105–6114).</w:t>
-      </w:r>
-    </w:p>
-    <w:p>
-      <w:pPr>
-        <w:pStyle w:val="Corpsdetexte"/>
-        <w:jc w:val="both"/>
-        <w:rPr>
-          <w:lang w:val="en-US"/>
-        </w:rPr>
-      </w:pPr>
-      <w:r>
-        <w:rPr>
-          <w:lang w:val="en-US"/>
-        </w:rPr>
-        <w:t xml:space="preserve">Taylor, R. P., Micolich, A. P. &amp; Jonas, D. (1999). Fractal analysis of Pollock’s drip paintings. Nature, 399, 422.</w:t>
+        <w:t>Sánchez, J. A., Romero, V., Toselli, A. H., Villegas, M. &amp; Vidal, E. (2019). A set of benchmarks for handwritten text recognition on historical documents. Pattern Recognition, 94, 122–134.</w:t>
+      </w:r>
+    </w:p>
+    <w:p>
+      <w:pPr>
+        <w:pStyle w:val="Corpsdetexte"/>
+        <w:jc w:val="both"/>
+        <w:rPr>
+          <w:lang w:val="en-US"/>
+        </w:rPr>
+      </w:pPr>
+      <w:r>
+        <w:rPr>
+          <w:lang w:val="en-US"/>
+        </w:rPr>
+        <w:t>Tan, M. &amp; Le, Q. (2019). EfficientNet: Rethinking model scaling for convolutional neural networks. In International Conference on Machine Learning (pp. 6105–6114).</w:t>
+      </w:r>
+    </w:p>
+    <w:p>
+      <w:pPr>
+        <w:pStyle w:val="Corpsdetexte"/>
+        <w:jc w:val="both"/>
+        <w:rPr>
+          <w:lang w:val="en-US"/>
+        </w:rPr>
+      </w:pPr>
+      <w:r>
+        <w:rPr>
+          <w:lang w:val="en-US"/>
+        </w:rPr>
+        <w:t>Taylor, R. P., Micolich, A. P. &amp; Jonas, D. (1999). Fractal analysis of Pollock’s drip paintings. Nature, 399, 422.</w:t>
       </w:r>
     </w:p>
     <w:p>
@@ -7616,7 +7658,7 @@
         <w:rPr>
           <w:lang w:val="en-US"/>
         </w:rPr>
-        <w:t xml:space="preserve">Thévoz, M. (1975). L’Art brut. Skira.</w:t>
+        <w:t>Thévoz, M. (1975). L’Art brut. Skira.</w:t>
       </w:r>
     </w:p>
     <w:p>
@@ -7646,7 +7688,7 @@
         <w:rPr>
           <w:lang w:val="en-US"/>
         </w:rPr>
-        <w:t xml:space="preserve">Tolhurst, D. J., Tadmor, Y. &amp; Chao, T. (1992). Amplitude spectra of natural images. Ophthalmic and Physiological Optics, 12(2), 229–232.</w:t>
+        <w:t>Tolhurst, D. J., Tadmor, Y. &amp; Chao, T. (1992). Amplitude spectra of natural images. Ophthalmic and Physiological Optics, 12(2), 229–232.</w:t>
       </w:r>
     </w:p>
     <w:p>
@@ -7676,52 +7718,52 @@
         <w:rPr>
           <w:lang w:val="en-US"/>
         </w:rPr>
-        <w:t xml:space="preserve">van Dantzig, M. M. (1973). Pictology: An Analytical Method for Attribution and Evaluation of Pictures. E. J. Brill.</w:t>
-      </w:r>
-    </w:p>
-    <w:p>
-      <w:pPr>
-        <w:pStyle w:val="Corpsdetexte"/>
-        <w:jc w:val="both"/>
-        <w:rPr>
-          <w:lang w:val="en-US"/>
-        </w:rPr>
-      </w:pPr>
-      <w:r>
-        <w:rPr>
-          <w:lang w:val="en-US"/>
-        </w:rPr>
-        <w:t xml:space="preserve">van der Maaten, L. &amp; Hinton, G. (2008). Visualizing data using t-SNE. Journal of Machine Learning Research, 9, 2579–2605.</w:t>
-      </w:r>
-    </w:p>
-    <w:p>
-      <w:pPr>
-        <w:pStyle w:val="Corpsdetexte"/>
-        <w:jc w:val="both"/>
-        <w:rPr>
-          <w:lang w:val="en-US"/>
-        </w:rPr>
-      </w:pPr>
-      <w:r>
-        <w:rPr>
-          <w:lang w:val="en-US"/>
-        </w:rPr>
-        <w:t xml:space="preserve">Vaswani, A., Shazeer, N., Parmar, N., Uszkoreit, J., Jones, L., Gomez, A. N., Kaiser, Ł. &amp; Polosukhin, I. (2017). Attention is all you need. Advances in Neural Information Processing Systems, 30.</w:t>
-      </w:r>
-    </w:p>
-    <w:p>
-      <w:pPr>
-        <w:pStyle w:val="Corpsdetexte"/>
-        <w:jc w:val="both"/>
-        <w:rPr>
-          <w:lang w:val="en-US"/>
-        </w:rPr>
-      </w:pPr>
-      <w:r>
-        <w:rPr>
-          <w:lang w:val="en-US"/>
-        </w:rPr>
-        <w:t xml:space="preserve">Veličković, P., Cucurull, G., Casanova, A., Romero, A., Liò, P. &amp; Bengio, Y. (2018). Graph attention networks. In International Conference on Learning Representations.</w:t>
+        <w:t>van Dantzig, M. M. (1973). Pictology: An Analytical Method for Attribution and Evaluation of Pictures. E. J. Brill.</w:t>
+      </w:r>
+    </w:p>
+    <w:p>
+      <w:pPr>
+        <w:pStyle w:val="Corpsdetexte"/>
+        <w:jc w:val="both"/>
+        <w:rPr>
+          <w:lang w:val="en-US"/>
+        </w:rPr>
+      </w:pPr>
+      <w:r>
+        <w:rPr>
+          <w:lang w:val="en-US"/>
+        </w:rPr>
+        <w:t>van der Maaten, L. &amp; Hinton, G. (2008). Visualizing data using t-SNE. Journal of Machine Learning Research, 9, 2579–2605.</w:t>
+      </w:r>
+    </w:p>
+    <w:p>
+      <w:pPr>
+        <w:pStyle w:val="Corpsdetexte"/>
+        <w:jc w:val="both"/>
+        <w:rPr>
+          <w:lang w:val="en-US"/>
+        </w:rPr>
+      </w:pPr>
+      <w:r>
+        <w:rPr>
+          <w:lang w:val="en-US"/>
+        </w:rPr>
+        <w:t>Vaswani, A., Shazeer, N., Parmar, N., Uszkoreit, J., Jones, L., Gomez, A. N., Kaiser, Ł. &amp; Polosukhin, I. (2017). Attention is all you need. Advances in Neural Information Processing Systems, 30.</w:t>
+      </w:r>
+    </w:p>
+    <w:p>
+      <w:pPr>
+        <w:pStyle w:val="Corpsdetexte"/>
+        <w:jc w:val="both"/>
+        <w:rPr>
+          <w:lang w:val="en-US"/>
+        </w:rPr>
+      </w:pPr>
+      <w:r>
+        <w:rPr>
+          <w:lang w:val="en-US"/>
+        </w:rPr>
+        <w:t>Veličković, P., Cucurull, G., Casanova, A., Romero, A., Liò, P. &amp; Bengio, Y. (2018). Graph attention networks. In International Conference on Learning Representations.</w:t>
       </w:r>
     </w:p>
     <w:p>
@@ -7736,7 +7778,7 @@
         <w:t xml:space="preserve">Vessel, E. A., Starr, G. G. &amp; Rubin, N. (2012). The brain on art: Intense aesthetic experience activates the default mode network. </w:t>
       </w:r>
       <w:r>
-        <w:t xml:space="preserve">Frontiers in Human Neuroscience, 6, 66.</w:t>
+        <w:t>Frontiers in Human Neuroscience, 6, 66.</w:t>
       </w:r>
     </w:p>
     <w:p>
@@ -7754,7 +7796,7 @@
         <w:rPr>
           <w:lang w:val="en-US"/>
         </w:rPr>
-        <w:t xml:space="preserve">A quantitative approach to painting styles. Physica A, 417, 110–129.</w:t>
+        <w:t>A quantitative approach to painting styles. Physica A, 417, 110–129.</w:t>
       </w:r>
     </w:p>
     <w:p>
@@ -7770,7 +7812,7 @@
           <w:lang w:val="en-US"/>
         </w:rPr>
         <w:lastRenderedPageBreak/>
-        <w:t xml:space="preserve">Vinyals, O., Toshev, A., Bengio, S. &amp; Erhan, D. (2015). Show and tell: A neural image caption generator. In Proceedings of the IEEE Conference on Computer Vision and Pattern Recognition (pp. 3156–3164).</w:t>
+        <w:t>Vinyals, O., Toshev, A., Bengio, S. &amp; Erhan, D. (2015). Show and tell: A neural image caption generator. In Proceedings of the IEEE Conference on Computer Vision and Pattern Recognition (pp. 3156–3164).</w:t>
       </w:r>
     </w:p>
     <w:p>
@@ -7794,22 +7836,22 @@
         <w:rPr>
           <w:lang w:val="en-US"/>
         </w:rPr>
-        <w:t xml:space="preserve">Wagemans, J., Elder, J. H., Kubovy, M., Palmer, S. E., Peterson, M. A., Singh, M. &amp; von der Heydt, R. (2012a). A century of Gestalt psychology in visual perception: I. Perceptual grouping and figure-ground organization. Psychological Bulletin, 138(6), 1172–1217.</w:t>
-      </w:r>
-    </w:p>
-    <w:p>
-      <w:pPr>
-        <w:pStyle w:val="Corpsdetexte"/>
-        <w:jc w:val="both"/>
-        <w:rPr>
-          <w:lang w:val="en-US"/>
-        </w:rPr>
-      </w:pPr>
-      <w:r>
-        <w:rPr>
-          <w:lang w:val="en-US"/>
-        </w:rPr>
-        <w:t xml:space="preserve">Wagemans, J., Feldman, J., Gepshtein, S., Kimchi, R., Pomerantz, J. R., van der Helm, P. A. &amp; van Leeuwen, C. (2012b). A century of Gestalt psychology in visual perception: II. Conceptual and theoretical foundations. Psychological Bulletin, 138(6), 1218–1252.</w:t>
+        <w:t>Wagemans, J., Elder, J. H., Kubovy, M., Palmer, S. E., Peterson, M. A., Singh, M. &amp; von der Heydt, R. (2012a). A century of Gestalt psychology in visual perception: I. Perceptual grouping and figure-ground organization. Psychological Bulletin, 138(6), 1172–1217.</w:t>
+      </w:r>
+    </w:p>
+    <w:p>
+      <w:pPr>
+        <w:pStyle w:val="Corpsdetexte"/>
+        <w:jc w:val="both"/>
+        <w:rPr>
+          <w:lang w:val="en-US"/>
+        </w:rPr>
+      </w:pPr>
+      <w:r>
+        <w:rPr>
+          <w:lang w:val="en-US"/>
+        </w:rPr>
+        <w:t>Wagemans, J., Feldman, J., Gepshtein, S., Kimchi, R., Pomerantz, J. R., van der Helm, P. A. &amp; van Leeuwen, C. (2012b). A century of Gestalt psychology in visual perception: II. Conceptual and theoretical foundations. Psychological Bulletin, 138(6), 1218–1252.</w:t>
       </w:r>
     </w:p>
     <w:p>
@@ -7839,22 +7881,22 @@
         <w:rPr>
           <w:lang w:val="en-US"/>
         </w:rPr>
-        <w:t xml:space="preserve">Wertheimer, M. (1923). Untersuchungen zur Lehre von der Gestalt II. Psychologische Forschung, 4, 301–350.</w:t>
-      </w:r>
-    </w:p>
-    <w:p>
-      <w:pPr>
-        <w:pStyle w:val="Corpsdetexte"/>
-        <w:jc w:val="both"/>
-        <w:rPr>
-          <w:lang w:val="en-US"/>
-        </w:rPr>
-      </w:pPr>
-      <w:r>
-        <w:rPr>
-          <w:lang w:val="en-US"/>
-        </w:rPr>
-        <w:t xml:space="preserve">Wiatowski, T. &amp; Bölcskei, H. (2018). A mathematical theory of deep convolutional neural networks for feature extraction. IEEE Transactions on Information Theory, 64(3), 1845–1866.</w:t>
+        <w:t>Wertheimer, M. (1923). Untersuchungen zur Lehre von der Gestalt II. Psychologische Forschung, 4, 301–350.</w:t>
+      </w:r>
+    </w:p>
+    <w:p>
+      <w:pPr>
+        <w:pStyle w:val="Corpsdetexte"/>
+        <w:jc w:val="both"/>
+        <w:rPr>
+          <w:lang w:val="en-US"/>
+        </w:rPr>
+      </w:pPr>
+      <w:r>
+        <w:rPr>
+          <w:lang w:val="en-US"/>
+        </w:rPr>
+        <w:t>Wiatowski, T. &amp; Bölcskei, H. (2018). A mathematical theory of deep convolutional neural networks for feature extraction. IEEE Transactions on Information Theory, 64(3), 1845–1866.</w:t>
       </w:r>
     </w:p>
     <w:p>
@@ -7869,7 +7911,7 @@
         <w:t xml:space="preserve">Windram, H. F., Shaw, P., Robinson, P. &amp; Howe, C. J. (2008). Dante’s Monarchia as a test case for the use of phylogenetic methods in stemmatic analysis. </w:t>
       </w:r>
       <w:r>
-        <w:t xml:space="preserve">Literary and Linguistic Computing, 23(4), 443–463.</w:t>
+        <w:t>Literary and Linguistic Computing, 23(4), 443–463.</w:t>
       </w:r>
     </w:p>
     <w:p>
@@ -7941,7 +7983,7 @@
         <w:rPr>
           <w:lang w:val="en-US"/>
         </w:rPr>
-        <w:t xml:space="preserve">Zhao, W., Zhou, D., Qiu, X. &amp; Jiang, W. (2021). Compare the performance of the models in art classification. PLOS ONE, 16(3), e0248414.</w:t>
+        <w:t>Zhao, W., Zhou, D., Qiu, X. &amp; Jiang, W. (2021). Compare the performance of the models in art classification. PLOS ONE, 16(3), e0248414.</w:t>
       </w:r>
     </w:p>
     <w:p>
@@ -8043,14 +8085,7 @@
           <w:sz w:val="18"/>
           <w:szCs w:val="18"/>
         </w:rPr>
-        <w:t xml:space="preserve"> </w:t>
-      </w:r>
-      <w:r>
-        <w:rPr>
-          <w:sz w:val="18"/>
-          <w:szCs w:val="18"/>
-        </w:rPr>
-        <w:t xml:space="preserve">Le titre reprend celui de </w:t>
+        <w:t xml:space="preserve"> Le titre reprend celui de </w:t>
       </w:r>
       <w:proofErr w:type="spellStart"/>
       <w:r>
@@ -8097,28 +8132,7 @@
           <w:sz w:val="18"/>
           <w:szCs w:val="18"/>
         </w:rPr>
-        <w:t xml:space="preserve"> </w:t>
-      </w:r>
-      <w:r>
-        <w:rPr>
-          <w:sz w:val="18"/>
-          <w:szCs w:val="18"/>
-        </w:rPr>
-        <w:t>—</w:t>
-      </w:r>
-      <w:r>
-        <w:rPr>
-          <w:sz w:val="18"/>
-          <w:szCs w:val="18"/>
-        </w:rPr>
-        <w:t xml:space="preserve"> 482 p. et 305 tableaux, entreprise soviétique</w:t>
-      </w:r>
-      <w:r>
-        <w:rPr>
-          <w:sz w:val="18"/>
-          <w:szCs w:val="18"/>
-        </w:rPr>
-        <w:t xml:space="preserve"> de quantification du cerveau humain qui fait ici office de précédent et d’avertissement.</w:t>
+        <w:t xml:space="preserve"> — 482 p. et 305 tableaux, entreprise soviétique de quantification du cerveau humain qui fait ici office de précédent et d’avertissement.</w:t>
       </w:r>
     </w:p>
   </w:footnote>
@@ -8204,15 +8218,7 @@
           <w:szCs w:val="18"/>
           <w:lang w:val="en-US"/>
         </w:rPr>
-        <w:t>, A. P. &amp; Jonas, D. (1999).</w:t>
-      </w:r>
-      <w:r>
-        <w:rPr>
-          <w:sz w:val="18"/>
-          <w:szCs w:val="18"/>
-          <w:lang w:val="en-US"/>
-        </w:rPr>
-        <w:t xml:space="preserve"> Fractal analysis of Pollock’s drip paintings. </w:t>
+        <w:t xml:space="preserve">, A. P. &amp; Jonas, D. (1999). Fractal analysis of Pollock’s drip paintings. </w:t>
       </w:r>
       <w:r>
         <w:rPr>
@@ -8227,15 +8233,7 @@
           <w:szCs w:val="18"/>
           <w:lang w:val="en-US"/>
         </w:rPr>
-        <w:t>Turbulent luminance in impassioned van Gogh paintings. Journal of Mathematical Imaging and</w:t>
-      </w:r>
-      <w:r>
-        <w:rPr>
-          <w:sz w:val="18"/>
-          <w:szCs w:val="18"/>
-          <w:lang w:val="en-US"/>
-        </w:rPr>
-        <w:t xml:space="preserve"> Vision, 30, 275-283.</w:t>
+        <w:t>Turbulent luminance in impassioned van Gogh paintings. Journal of Mathematical Imaging and Vision, 30, 275-283.</w:t>
       </w:r>
     </w:p>
   </w:footnote>
@@ -8296,15 +8294,7 @@
           <w:szCs w:val="18"/>
           <w:lang w:val="en-US"/>
         </w:rPr>
-        <w:t>, D. N. (2010). Quantification of artistic style through sparse coding analysis in the drawings of Pieter Bruegel the Elder. Proceedings of the National Academy of Sciences, 107(</w:t>
-      </w:r>
-      <w:r>
-        <w:rPr>
-          <w:sz w:val="18"/>
-          <w:szCs w:val="18"/>
-          <w:lang w:val="en-US"/>
-        </w:rPr>
-        <w:t xml:space="preserve">4), 1279-1283. Pour Van </w:t>
+        <w:t xml:space="preserve">, D. N. (2010). Quantification of artistic style through sparse coding analysis in the drawings of Pieter Bruegel the Elder. Proceedings of the National Academy of Sciences, 107(4), 1279-1283. Pour Van </w:t>
       </w:r>
       <w:proofErr w:type="gramStart"/>
       <w:r>
@@ -8358,15 +8348,7 @@
           <w:szCs w:val="18"/>
           <w:lang w:val="en-US"/>
         </w:rPr>
-        <w:t>, E., Hughes, S. M., Daubechies, I., Li, J., Postma, E. &amp; Wang, J. Z. (2008). Image processing for artist identification: Computerized analysis of Vincent van Gogh’s paint</w:t>
-      </w:r>
-      <w:r>
-        <w:rPr>
-          <w:sz w:val="18"/>
-          <w:szCs w:val="18"/>
-          <w:lang w:val="en-US"/>
-        </w:rPr>
-        <w:t xml:space="preserve">ing brushstrokes. </w:t>
+        <w:t xml:space="preserve">, E., Hughes, S. M., Daubechies, I., Li, J., Postma, E. &amp; Wang, J. Z. (2008). Image processing for artist identification: Computerized analysis of Vincent van Gogh’s painting brushstrokes. </w:t>
       </w:r>
       <w:r>
         <w:rPr>
@@ -8397,15 +8379,7 @@
           <w:szCs w:val="18"/>
           <w:lang w:val="en-US"/>
         </w:rPr>
-        <w:t>Picasso, Matisse, or a fake? Automated analysis of drawings at the stroke level for attribution and authentic</w:t>
-      </w:r>
-      <w:r>
-        <w:rPr>
-          <w:sz w:val="18"/>
-          <w:szCs w:val="18"/>
-          <w:lang w:val="en-US"/>
-        </w:rPr>
-        <w:t xml:space="preserve">ation. In Proceedings of the AAAI Conference on Artificial Intelligence, 32(1). </w:t>
+        <w:t xml:space="preserve">Picasso, Matisse, or a fake? Automated analysis of drawings at the stroke level for attribution and authentication. In Proceedings of the AAAI Conference on Artificial Intelligence, 32(1). </w:t>
       </w:r>
       <w:proofErr w:type="spellStart"/>
       <w:r>
@@ -8462,14 +8436,7 @@
           <w:sz w:val="18"/>
           <w:szCs w:val="18"/>
         </w:rPr>
-        <w:t xml:space="preserve"> Gaillard, R. (2022). Un coup de hache dans la tête : folie et créativité. Grasset. Le lien entre trouble psychiatrique et création n’est pas une surrep</w:t>
-      </w:r>
-      <w:r>
-        <w:rPr>
-          <w:sz w:val="18"/>
-          <w:szCs w:val="18"/>
-        </w:rPr>
-        <w:t>résentation du trouble chez les artistes, mais un lien familial et génétique. Il n’y a pas d’argument épidémiologique à ce jour pour remettre en cause la pertinence d’un groupe contrôle issu de collections d’art contemporain.</w:t>
+        <w:t xml:space="preserve"> Gaillard, R. (2022). Un coup de hache dans la tête : folie et créativité. Grasset. Le lien entre trouble psychiatrique et création n’est pas une surreprésentation du trouble chez les artistes, mais un lien familial et génétique. Il n’y a pas d’argument épidémiologique à ce jour pour remettre en cause la pertinence d’un groupe contrôle issu de collections d’art contemporain.</w:t>
       </w:r>
     </w:p>
   </w:footnote>
@@ -8491,23 +8458,7 @@
           <w:szCs w:val="18"/>
           <w:lang w:val="en-US"/>
         </w:rPr>
-        <w:t xml:space="preserve"> Roberto, J., Ortego, D. &amp; Da</w:t>
-      </w:r>
-      <w:r>
-        <w:rPr>
-          <w:sz w:val="18"/>
-          <w:szCs w:val="18"/>
-          <w:lang w:val="en-US"/>
-        </w:rPr>
-        <w:t>vis, B. (2020). Toward the automatic retrieval and annotation of outsider art images: A preliminary statement. In Proceedings of the 1st International Workshop on Artificial Intelligence for Historical Image Enrichment and Access (AI4HI 2020), LREC 2020 (p</w:t>
-      </w:r>
-      <w:r>
-        <w:rPr>
-          <w:sz w:val="18"/>
-          <w:szCs w:val="18"/>
-          <w:lang w:val="en-US"/>
-        </w:rPr>
-        <w:t xml:space="preserve">p. 16-22). </w:t>
+        <w:t xml:space="preserve"> Roberto, J., Ortego, D. &amp; Davis, B. (2020). Toward the automatic retrieval and annotation of outsider art images: A preliminary statement. In Proceedings of the 1st International Workshop on Artificial Intelligence for Historical Image Enrichment and Access (AI4HI 2020), LREC 2020 (pp. 16-22). </w:t>
       </w:r>
       <w:proofErr w:type="spellStart"/>
       <w:r>
@@ -8594,14 +8545,7 @@
           <w:sz w:val="18"/>
           <w:szCs w:val="18"/>
         </w:rPr>
-        <w:t>Nature Neuroscience, 19(3), 356-365. Sur le codage en fréquences</w:t>
-      </w:r>
-      <w:r>
-        <w:rPr>
-          <w:sz w:val="18"/>
-          <w:szCs w:val="18"/>
-        </w:rPr>
-        <w:t xml:space="preserve"> spatiales du cortex visuel primaire : Campbell, F. W. &amp; Robson, J. G. (1968). </w:t>
+        <w:t xml:space="preserve">Nature Neuroscience, 19(3), 356-365. Sur le codage en fréquences spatiales du cortex visuel primaire : Campbell, F. W. &amp; Robson, J. G. (1968). </w:t>
       </w:r>
       <w:r>
         <w:rPr>
@@ -8667,15 +8611,7 @@
           <w:szCs w:val="18"/>
           <w:lang w:val="en-US"/>
         </w:rPr>
-        <w:t xml:space="preserve"> Graham, D. J. &amp; Meng, M. (2011). Alte</w:t>
-      </w:r>
-      <w:r>
-        <w:rPr>
-          <w:sz w:val="18"/>
-          <w:szCs w:val="18"/>
-          <w:lang w:val="en-US"/>
-        </w:rPr>
-        <w:t xml:space="preserve">red spatial frequency content in paintings by artists with schizophrenia. </w:t>
+        <w:t xml:space="preserve"> Graham, D. J. &amp; Meng, M. (2011). Altered spatial frequency content in paintings by artists with schizophrenia. </w:t>
       </w:r>
       <w:proofErr w:type="spellStart"/>
       <w:r>
@@ -8737,14 +8673,7 @@
           <w:sz w:val="18"/>
           <w:szCs w:val="18"/>
         </w:rPr>
-        <w:t>Proceeding</w:t>
-      </w:r>
-      <w:r>
-        <w:rPr>
-          <w:sz w:val="18"/>
-          <w:szCs w:val="18"/>
-        </w:rPr>
-        <w:t>s</w:t>
+        <w:t>Proceedings</w:t>
       </w:r>
       <w:proofErr w:type="spellEnd"/>
       <w:r>
@@ -8797,14 +8726,7 @@
           <w:sz w:val="18"/>
           <w:szCs w:val="18"/>
         </w:rPr>
-        <w:t xml:space="preserve"> Spee, B. T. M., Sladky, R., Fingerhut, J., Laciny, A., </w:t>
-      </w:r>
-      <w:r>
-        <w:rPr>
-          <w:sz w:val="18"/>
-          <w:szCs w:val="18"/>
-        </w:rPr>
-        <w:t>Kraus, C., Carls-Diamante, S. et al. </w:t>
+        <w:t xml:space="preserve"> Spee, B. T. M., Sladky, R., Fingerhut, J., Laciny, A., Kraus, C., Carls-Diamante, S. et al. </w:t>
       </w:r>
       <w:r>
         <w:rPr>
@@ -8855,15 +8777,7 @@
           <w:szCs w:val="18"/>
           <w:lang w:val="en-US"/>
         </w:rPr>
-        <w:t>, B., Llo</w:t>
-      </w:r>
-      <w:r>
-        <w:rPr>
-          <w:sz w:val="18"/>
-          <w:szCs w:val="18"/>
-          <w:lang w:val="en-US"/>
-        </w:rPr>
-        <w:t xml:space="preserve">yd-Cox, J. &amp; Beaty, R. E. (2024). </w:t>
+        <w:t xml:space="preserve">, B., Lloyd-Cox, J. &amp; Beaty, R. E. (2024). </w:t>
       </w:r>
       <w:proofErr w:type="spellStart"/>
       <w:r>
@@ -8917,15 +8831,7 @@
           <w:szCs w:val="18"/>
           <w:lang w:val="en-US"/>
         </w:rPr>
-        <w:t xml:space="preserve">, P. &amp; Dumas, D. Open Creativity Scoring with Artificial Intelligence (OCSAI). University of </w:t>
-      </w:r>
-      <w:r>
-        <w:rPr>
-          <w:sz w:val="18"/>
-          <w:szCs w:val="18"/>
-          <w:lang w:val="en-US"/>
-        </w:rPr>
-        <w:t xml:space="preserve">Denver. </w:t>
+        <w:t xml:space="preserve">, P. &amp; Dumas, D. Open Creativity Scoring with Artificial Intelligence (OCSAI). University of Denver. </w:t>
       </w:r>
       <w:proofErr w:type="gramStart"/>
       <w:r>
@@ -9026,14 +8932,7 @@
           <w:sz w:val="18"/>
           <w:szCs w:val="18"/>
         </w:rPr>
-        <w:t>Communications Psychology. Ces travaux, conduits à l’Institut du Cerveau (Paris), décrivent la sélection d’id</w:t>
-      </w:r>
-      <w:r>
-        <w:rPr>
-          <w:sz w:val="18"/>
-          <w:szCs w:val="18"/>
-        </w:rPr>
-        <w:t>ées au cours de la pensée créative comme un processus de valuation subjective comparable à celui de la décision économique.</w:t>
+        <w:t>Communications Psychology. Ces travaux, conduits à l’Institut du Cerveau (Paris), décrivent la sélection d’idées au cours de la pensée créative comme un processus de valuation subjective comparable à celui de la décision économique.</w:t>
       </w:r>
     </w:p>
   </w:footnote>
@@ -9109,15 +9008,7 @@
           <w:szCs w:val="18"/>
           <w:lang w:val="en-US"/>
         </w:rPr>
-        <w:t>, C. (2017). Statistical image properties in works from the Prinzhorn Collection of artists</w:t>
-      </w:r>
-      <w:r>
-        <w:rPr>
-          <w:sz w:val="18"/>
-          <w:szCs w:val="18"/>
-          <w:lang w:val="en-US"/>
-        </w:rPr>
-        <w:t xml:space="preserve"> with schizophrenia. </w:t>
+        <w:t xml:space="preserve">, C. (2017). Statistical image properties in works from the Prinzhorn Collection of artists with schizophrenia. </w:t>
       </w:r>
       <w:proofErr w:type="spellStart"/>
       <w:r>
@@ -9199,15 +9090,7 @@
           <w:szCs w:val="18"/>
           <w:lang w:val="en-US"/>
         </w:rPr>
-        <w:t xml:space="preserve"> Forsythe, A., Williams</w:t>
-      </w:r>
-      <w:r>
-        <w:rPr>
-          <w:sz w:val="18"/>
-          <w:szCs w:val="18"/>
-          <w:lang w:val="en-US"/>
-        </w:rPr>
-        <w:t xml:space="preserve">, T. &amp; Reilly, R. G. (2017). What paint can tell us: A fractal analysis of neurological changes in seven artists. Neuropsychology, 31(1), 1-10. </w:t>
+        <w:t xml:space="preserve"> Forsythe, A., Williams, T. &amp; Reilly, R. G. (2017). What paint can tell us: A fractal analysis of neurological changes in seven artists. Neuropsychology, 31(1), 1-10. </w:t>
       </w:r>
       <w:proofErr w:type="spellStart"/>
       <w:r>
@@ -9265,15 +9148,7 @@
           <w:szCs w:val="18"/>
           <w:lang w:val="en-US"/>
         </w:rPr>
-        <w:t xml:space="preserve"> Jones-Smith, K. &amp; Mathur, H. (2006). Fractal analysis: Revisiting Pollock’s drip pain</w:t>
-      </w:r>
-      <w:r>
-        <w:rPr>
-          <w:sz w:val="18"/>
-          <w:szCs w:val="18"/>
-          <w:lang w:val="en-US"/>
-        </w:rPr>
-        <w:t xml:space="preserve">tings. </w:t>
+        <w:t xml:space="preserve"> Jones-Smith, K. &amp; Mathur, H. (2006). Fractal analysis: Revisiting Pollock’s drip paintings. </w:t>
       </w:r>
       <w:r>
         <w:rPr>
@@ -9316,14 +9191,7 @@
           <w:sz w:val="18"/>
           <w:szCs w:val="18"/>
         </w:rPr>
-        <w:t>Nature, 603(7902), 654-660. Les auteurs montrent que la</w:t>
-      </w:r>
-      <w:r>
-        <w:rPr>
-          <w:sz w:val="18"/>
-          <w:szCs w:val="18"/>
-        </w:rPr>
-        <w:t xml:space="preserve"> reproductibilité des associations cerveau-phénotype reste faible en deçà de mille sujets, alors que la taille médiane d’une étude de neuro-imagerie est d’environ vingt-cinq.</w:t>
+        <w:t>Nature, 603(7902), 654-660. Les auteurs montrent que la reproductibilité des associations cerveau-phénotype reste faible en deçà de mille sujets, alors que la taille médiane d’une étude de neuro-imagerie est d’environ vingt-cinq.</w:t>
       </w:r>
     </w:p>
   </w:footnote>
@@ -9344,28 +9212,7 @@
           <w:sz w:val="18"/>
           <w:szCs w:val="18"/>
         </w:rPr>
-        <w:t xml:space="preserve"> CIDOC-CRM (norme ISO 21127) est le modèle conceptuel de référence du Conseil in</w:t>
-      </w:r>
-      <w:r>
-        <w:rPr>
-          <w:sz w:val="18"/>
-          <w:szCs w:val="18"/>
-        </w:rPr>
-        <w:t xml:space="preserve">ternational des musées pour décrire le patrimoine culturel ; il définit un vocabulaire commun d’événements (création, exposition, restauration) et d’entités (œuvre, personne, lieu, matériau). L’Europeana Data Model (EDM) est le format d’agrégation utilisé </w:t>
-      </w:r>
-      <w:r>
-        <w:rPr>
-          <w:sz w:val="18"/>
-          <w:szCs w:val="18"/>
-        </w:rPr>
-        <w:t>par la bibliothèque numérique européenne Europeana. Les Getty Vocabularies sont des vocabulaires contrôlés multilingues maintenus par le Getty Research Institute ; le plus connu, l’Union List of Artist Names (ULAN), répertorie de manière unifiée les noms e</w:t>
-      </w:r>
-      <w:r>
-        <w:rPr>
-          <w:sz w:val="18"/>
-          <w:szCs w:val="18"/>
-        </w:rPr>
-        <w:t>t variantes d’attribution des artistes.</w:t>
+        <w:t xml:space="preserve"> CIDOC-CRM (norme ISO 21127) est le modèle conceptuel de référence du Conseil international des musées pour décrire le patrimoine culturel ; il définit un vocabulaire commun d’événements (création, exposition, restauration) et d’entités (œuvre, personne, lieu, matériau). L’Europeana Data Model (EDM) est le format d’agrégation utilisé par la bibliothèque numérique européenne Europeana. Les Getty Vocabularies sont des vocabulaires contrôlés multilingues maintenus par le Getty Research Institute ; le plus connu, l’Union List of Artist Names (ULAN), répertorie de manière unifiée les noms et variantes d’attribution des artistes.</w:t>
       </w:r>
     </w:p>
   </w:footnote>
@@ -9386,21 +9233,7 @@
           <w:sz w:val="18"/>
           <w:szCs w:val="18"/>
         </w:rPr>
-        <w:t xml:space="preserve"> Les principales familles d’ondelettes utilisées en analyse d’image sont l’ondelette de Haar (Haar, 1910), la plus simple, à valeurs discrètes ; les ondelettes de Daubechies (Daubechies, 1988, 1992), à support compa</w:t>
-      </w:r>
-      <w:r>
-        <w:rPr>
-          <w:sz w:val="18"/>
-          <w:szCs w:val="18"/>
-        </w:rPr>
-        <w:t xml:space="preserve">ct et orthogonales ; les ondelettes de Morlet (Goupillaud, Grossmann et Morlet, 1984), complexes et adaptées à l’analyse temps-fréquence ; et les ondelettes de Meyer (Meyer, 1990), à décroissance rapide en fréquence. Le choix dépend du compromis recherché </w:t>
-      </w:r>
-      <w:r>
-        <w:rPr>
-          <w:sz w:val="18"/>
-          <w:szCs w:val="18"/>
-        </w:rPr>
-        <w:t>entre localisation spatiale, localisation fréquentielle et coût de calcul.</w:t>
+        <w:t xml:space="preserve"> Les principales familles d’ondelettes utilisées en analyse d’image sont l’ondelette de Haar (Haar, 1910), la plus simple, à valeurs discrètes ; les ondelettes de Daubechies (Daubechies, 1988, 1992), à support compact et orthogonales ; les ondelettes de Morlet (Goupillaud, Grossmann et Morlet, 1984), complexes et adaptées à l’analyse temps-fréquence ; et les ondelettes de Meyer (Meyer, 1990), à décroissance rapide en fréquence. Le choix dépend du compromis recherché entre localisation spatiale, localisation fréquentielle et coût de calcul.</w:t>
       </w:r>
     </w:p>
   </w:footnote>
@@ -9421,21 +9254,7 @@
           <w:sz w:val="18"/>
           <w:szCs w:val="18"/>
         </w:rPr>
-        <w:t xml:space="preserve"> Les moments statistiques d’une distribution mesurent sa forme. Le moment d’ordre 1 est la moyenne (position du barycentre) ; les moments d’ordre 2 sont les variances le long des a</w:t>
-      </w:r>
-      <w:r>
-        <w:rPr>
-          <w:sz w:val="18"/>
-          <w:szCs w:val="18"/>
-        </w:rPr>
-        <w:t>xes horizontal et vertical, qui mesurent à quel point les valeurs de pixel sont étalées le long de chaque axe. Un moment d’ordre 2 élevé indique une information visuelle distribuée sur toute la dimension considérée ; un moment faible indique une concentrat</w:t>
-      </w:r>
-      <w:r>
-        <w:rPr>
-          <w:sz w:val="18"/>
-          <w:szCs w:val="18"/>
-        </w:rPr>
-        <w:t>ion centrale.</w:t>
+        <w:t xml:space="preserve"> Les moments statistiques d’une distribution mesurent sa forme. Le moment d’ordre 1 est la moyenne (position du barycentre) ; les moments d’ordre 2 sont les variances le long des axes horizontal et vertical, qui mesurent à quel point les valeurs de pixel sont étalées le long de chaque axe. Un moment d’ordre 2 élevé indique une information visuelle distribuée sur toute la dimension considérée ; un moment faible indique une concentration centrale.</w:t>
       </w:r>
     </w:p>
   </w:footnote>
@@ -9456,14 +9275,7 @@
           <w:sz w:val="18"/>
           <w:szCs w:val="18"/>
         </w:rPr>
-        <w:t xml:space="preserve"> Pour chaque pixel, on compare sa valeur à celles de ses huit voisins immédiats et l’on encode le résultat sous forme d’un nombre binaire à huit bits (1 si le voisin est plus clair, 0 sinon). La distribution de ces nombres binaires sur l’ens</w:t>
-      </w:r>
-      <w:r>
-        <w:rPr>
-          <w:sz w:val="18"/>
-          <w:szCs w:val="18"/>
-        </w:rPr>
-        <w:t>emble de l’image constitue le descripteur LBP. Sa principale qualité est sa robustesse aux variations d’éclairage uniformes.</w:t>
+        <w:t xml:space="preserve"> Pour chaque pixel, on compare sa valeur à celles de ses huit voisins immédiats et l’on encode le résultat sous forme d’un nombre binaire à huit bits (1 si le voisin est plus clair, 0 sinon). La distribution de ces nombres binaires sur l’ensemble de l’image constitue le descripteur LBP. Sa principale qualité est sa robustesse aux variations d’éclairage uniformes.</w:t>
       </w:r>
     </w:p>
   </w:footnote>
@@ -9484,14 +9296,7 @@
           <w:sz w:val="18"/>
           <w:szCs w:val="18"/>
         </w:rPr>
-        <w:t xml:space="preserve"> L’image est découpée en cellules dans lesquelles on calcule, pour chaque pixel, la direction et la magnitude du gradient. Les dir</w:t>
-      </w:r>
-      <w:r>
-        <w:rPr>
-          <w:sz w:val="18"/>
-          <w:szCs w:val="18"/>
-        </w:rPr>
-        <w:t>ections sont accumulées en histogrammes par cellule, puis ces histogrammes sont concaténés pour former un descripteur compact, particulièrement utile pour la détection de formes et de contours orientés.</w:t>
+        <w:t xml:space="preserve"> L’image est découpée en cellules dans lesquelles on calcule, pour chaque pixel, la direction et la magnitude du gradient. Les directions sont accumulées en histogrammes par cellule, puis ces histogrammes sont concaténés pour former un descripteur compact, particulièrement utile pour la détection de formes et de contours orientés.</w:t>
       </w:r>
     </w:p>
   </w:footnote>
@@ -9512,21 +9317,7 @@
           <w:sz w:val="18"/>
           <w:szCs w:val="18"/>
         </w:rPr>
-        <w:t xml:space="preserve"> Les opérateurs de Sobel et Prewitt sont des filtres</w:t>
-      </w:r>
-      <w:r>
-        <w:rPr>
-          <w:sz w:val="18"/>
-          <w:szCs w:val="18"/>
-        </w:rPr>
-        <w:t xml:space="preserve"> convolutifs de petite taille (typiquement 3 × 3) qui approximent la dérivée locale de l’image en deux dimensions ; ils mettent en évidence les variations brusques d’intensité, c’est-à-dire les contours. Plus simples et plus rapides que Canny, ils produise</w:t>
-      </w:r>
-      <w:r>
-        <w:rPr>
-          <w:sz w:val="18"/>
-          <w:szCs w:val="18"/>
-        </w:rPr>
-        <w:t>nt un gradient brut sans étape de suppression du bruit ni de seuillage adaptatif.</w:t>
+        <w:t xml:space="preserve"> Les opérateurs de Sobel et Prewitt sont des filtres convolutifs de petite taille (typiquement 3 × 3) qui approximent la dérivée locale de l’image en deux dimensions ; ils mettent en évidence les variations brusques d’intensité, c’est-à-dire les contours. Plus simples et plus rapides que Canny, ils produisent un gradient brut sans étape de suppression du bruit ni de seuillage adaptatif.</w:t>
       </w:r>
     </w:p>
   </w:footnote>
@@ -9547,21 +9338,7 @@
           <w:sz w:val="18"/>
           <w:szCs w:val="18"/>
         </w:rPr>
-        <w:t xml:space="preserve"> L’algorithme de Canny enchaîne quatre étapes : un lissage gaussien pour atténuer le bruit, un calcul de la dérivée locale de l’image en deux dimensions (le ‘gradient’, qui </w:t>
-      </w:r>
-      <w:r>
-        <w:rPr>
-          <w:sz w:val="18"/>
-          <w:szCs w:val="18"/>
-        </w:rPr>
-        <w:t>détecte les variations brusques d’intensité), une suppression des points qui ne sont pas des maxima locaux du gradient (afin de réduire chaque contour épais à une ligne d’un pixel) et un seuillage à deux valeurs (un contour fort relie les pixels qui dépass</w:t>
-      </w:r>
-      <w:r>
-        <w:rPr>
-          <w:sz w:val="18"/>
-          <w:szCs w:val="18"/>
-        </w:rPr>
-        <w:t>ent le seuil haut ; les pixels intermédiaires ne sont conservés que s’ils sont connectés à un contour fort).</w:t>
+        <w:t xml:space="preserve"> L’algorithme de Canny enchaîne quatre étapes : un lissage gaussien pour atténuer le bruit, un calcul de la dérivée locale de l’image en deux dimensions (le ‘gradient’, qui détecte les variations brusques d’intensité), une suppression des points qui ne sont pas des maxima locaux du gradient (afin de réduire chaque contour épais à une ligne d’un pixel) et un seuillage à deux valeurs (un contour fort relie les pixels qui dépassent le seuil haut ; les pixels intermédiaires ne sont conservés que s’ils sont connectés à un contour fort).</w:t>
       </w:r>
     </w:p>
   </w:footnote>
@@ -9582,21 +9359,7 @@
           <w:sz w:val="18"/>
           <w:szCs w:val="18"/>
         </w:rPr>
-        <w:t xml:space="preserve"> Le jerk est la dérivée temporelle de l’accélération, soit le ‘taux de changement d’accélération’. Dans l’étude du geste manuel, un mouvement faib</w:t>
-      </w:r>
-      <w:r>
-        <w:rPr>
-          <w:sz w:val="18"/>
-          <w:szCs w:val="18"/>
-        </w:rPr>
-        <w:t xml:space="preserve">le en jerk correspond à un geste fluide et bien planifié ; un mouvement riche en jerk traduit des saccades, des hésitations ou des tremblements. Cette mesure, centrale en neurologie du mouvement, peut être estimée a posteriori à partir du trait laissé sur </w:t>
-      </w:r>
-      <w:r>
-        <w:rPr>
-          <w:sz w:val="18"/>
-          <w:szCs w:val="18"/>
-        </w:rPr>
-        <w:t>le papier dans une certaine mesure.</w:t>
+        <w:t xml:space="preserve"> Le jerk est la dérivée temporelle de l’accélération, soit le ‘taux de changement d’accélération’. Dans l’étude du geste manuel, un mouvement faible en jerk correspond à un geste fluide et bien planifié ; un mouvement riche en jerk traduit des saccades, des hésitations ou des tremblements. Cette mesure, centrale en neurologie du mouvement, peut être estimée a posteriori à partir du trait laissé sur le papier dans une certaine mesure.</w:t>
       </w:r>
     </w:p>
   </w:footnote>
@@ -9617,14 +9380,7 @@
           <w:sz w:val="18"/>
           <w:szCs w:val="18"/>
         </w:rPr>
-        <w:t xml:space="preserve"> L’entropie d’ordre 2 est étroitement liée à l’information mutuelle locale : si deux pixels voisins varient indépendamment l’un de l’autre, l’entropie d’ordre 2 est égale à deux fois l’entropie d’ordre 1 ; si leurs vale</w:t>
-      </w:r>
-      <w:r>
-        <w:rPr>
-          <w:sz w:val="18"/>
-          <w:szCs w:val="18"/>
-        </w:rPr>
-        <w:t>urs sont fortement corrélées (image régulière), l’entropie d’ordre 2 est plus faible que cette somme, et la différence mesure l’information qu’un pixel apporte sur son voisin.</w:t>
+        <w:t xml:space="preserve"> L’entropie d’ordre 2 est étroitement liée à l’information mutuelle locale : si deux pixels voisins varient indépendamment l’un de l’autre, l’entropie d’ordre 2 est égale à deux fois l’entropie d’ordre 1 ; si leurs valeurs sont fortement corrélées (image régulière), l’entropie d’ordre 2 est plus faible que cette somme, et la différence mesure l’information qu’un pixel apporte sur son voisin.</w:t>
       </w:r>
     </w:p>
   </w:footnote>
@@ -9645,21 +9401,7 @@
           <w:sz w:val="18"/>
           <w:szCs w:val="18"/>
         </w:rPr>
-        <w:t xml:space="preserve"> La distance de Jensen-Shannon mesure la dissemblance entre deux distributions </w:t>
-      </w:r>
-      <w:r>
-        <w:rPr>
-          <w:sz w:val="18"/>
-          <w:szCs w:val="18"/>
-        </w:rPr>
-        <w:t xml:space="preserve">de probabilité ; elle vaut 0 si les distributions sont identiques et tend vers une valeur maximale lorsqu’elles sont totalement disjointes. Ici, on mesure à quel point la distribution observée s’écarte de la distribution complètement uniforme (l’aléatoire </w:t>
-      </w:r>
-      <w:r>
-        <w:rPr>
-          <w:sz w:val="18"/>
-          <w:szCs w:val="18"/>
-        </w:rPr>
-        <w:t>pur).</w:t>
+        <w:t xml:space="preserve"> La distance de Jensen-Shannon mesure la dissemblance entre deux distributions de probabilité ; elle vaut 0 si les distributions sont identiques et tend vers une valeur maximale lorsqu’elles sont totalement disjointes. Ici, on mesure à quel point la distribution observée s’écarte de la distribution complètement uniforme (l’aléatoire pur).</w:t>
       </w:r>
     </w:p>
   </w:footnote>
@@ -9680,21 +9422,7 @@
           <w:sz w:val="18"/>
           <w:szCs w:val="18"/>
         </w:rPr>
-        <w:t xml:space="preserve"> </w:t>
-      </w:r>
-      <w:r>
-        <w:rPr>
-          <w:sz w:val="18"/>
-          <w:szCs w:val="18"/>
-        </w:rPr>
-        <w:t xml:space="preserve">La complexité de Kolmogorov est définie indépendamment du langage de programmation : à une constante près qui ne dépend pas de l’image, sa valeur est la même que l’on choisisse un programme en Python, en C ou en machine de Turing. C’est cette indépendance </w:t>
-      </w:r>
-      <w:r>
-        <w:rPr>
-          <w:sz w:val="18"/>
-          <w:szCs w:val="18"/>
-        </w:rPr>
-        <w:t>qui en fait une notion mathématiquement bien définie.</w:t>
+        <w:t xml:space="preserve"> La complexité de Kolmogorov est définie indépendamment du langage de programmation : à une constante près qui ne dépend pas de l’image, sa valeur est la même que l’on choisisse un programme en Python, en C ou en machine de Turing. C’est cette indépendance qui en fait une notion mathématiquement bien définie.</w:t>
       </w:r>
     </w:p>
   </w:footnote>
@@ -9715,14 +9443,7 @@
           <w:sz w:val="18"/>
           <w:szCs w:val="18"/>
         </w:rPr>
-        <w:t xml:space="preserve"> La naissance (birth) d’une structure est la valeur du seuil ε à laquelle elle apparaît pour la première fois dans la filtration ; sa mort (death) est la valeur ε’ &gt; ε à laquelle elle est absorbée par </w:t>
-      </w:r>
-      <w:r>
-        <w:rPr>
-          <w:sz w:val="18"/>
-          <w:szCs w:val="18"/>
-        </w:rPr>
-        <w:t>une structure plus grande ou disparaît. La différence ε’ − ε est sa persistance. Les structures persistantes (longue durée de vie) reflètent des organisations robustes de l’image ; les structures de courte persistance correspondent généralement au bruit.</w:t>
+        <w:t xml:space="preserve"> La naissance (birth) d’une structure est la valeur du seuil ε à laquelle elle apparaît pour la première fois dans la filtration ; sa mort (death) est la valeur ε’ &gt; ε à laquelle elle est absorbée par une structure plus grande ou disparaît. La différence ε’ − ε est sa persistance. Les structures persistantes (longue durée de vie) reflètent des organisations robustes de l’image ; les structures de courte persistance correspondent généralement au bruit.</w:t>
       </w:r>
     </w:p>
   </w:footnote>
@@ -9743,14 +9464,7 @@
           <w:sz w:val="18"/>
           <w:szCs w:val="18"/>
         </w:rPr>
-        <w:t xml:space="preserve"> Les images et paysages de persistance sont deux manières de transformer un diagramme de persistance (par nature non-vectoriel) en un vecteur de taille fixe, compatible avec les algorithmes d’apprentissage automatique. L’image de persistance représente le </w:t>
-      </w:r>
-      <w:r>
-        <w:rPr>
-          <w:sz w:val="18"/>
-          <w:szCs w:val="18"/>
-        </w:rPr>
-        <w:t>diagramme comme une carte de densité dans un plan ; le paysage de persistance le traduit en une famille de fonctions par morceaux ordonnées par persistance décroissante.</w:t>
+        <w:t xml:space="preserve"> Les images et paysages de persistance sont deux manières de transformer un diagramme de persistance (par nature non-vectoriel) en un vecteur de taille fixe, compatible avec les algorithmes d’apprentissage automatique. L’image de persistance représente le diagramme comme une carte de densité dans un plan ; le paysage de persistance le traduit en une famille de fonctions par morceaux ordonnées par persistance décroissante.</w:t>
       </w:r>
     </w:p>
   </w:footnote>
@@ -9771,21 +9485,7 @@
           <w:sz w:val="18"/>
           <w:szCs w:val="18"/>
         </w:rPr>
-        <w:t xml:space="preserve"> La modularité d’un découpage de graphe est la différence entre la densité d’arêtes à</w:t>
-      </w:r>
-      <w:r>
-        <w:rPr>
-          <w:sz w:val="18"/>
-          <w:szCs w:val="18"/>
-        </w:rPr>
-        <w:t xml:space="preserve"> l’intérieur des sous-groupes proposés et celle qu’on observerait dans un graphe aléatoire de même taille. L’algorithme de Louvain ajuste itérativement le découpage pour maximiser cette modularité. C’est aujourd’hui l’algorithme de détection de communautés</w:t>
-      </w:r>
-      <w:r>
-        <w:rPr>
-          <w:sz w:val="18"/>
-          <w:szCs w:val="18"/>
-        </w:rPr>
-        <w:t xml:space="preserve"> le plus utilisé sur les grands réseaux, pour sa rapidité et la qualité de ses partitions.</w:t>
+        <w:t xml:space="preserve"> La modularité d’un découpage de graphe est la différence entre la densité d’arêtes à l’intérieur des sous-groupes proposés et celle qu’on observerait dans un graphe aléatoire de même taille. L’algorithme de Louvain ajuste itérativement le découpage pour maximiser cette modularité. C’est aujourd’hui l’algorithme de détection de communautés le plus utilisé sur les grands réseaux, pour sa rapidité et la qualité de ses partitions.</w:t>
       </w:r>
     </w:p>
   </w:footnote>
@@ -9806,14 +9506,7 @@
           <w:sz w:val="18"/>
           <w:szCs w:val="18"/>
         </w:rPr>
-        <w:t xml:space="preserve"> Dans un réseau de neurones sur graphes, chaque nœud porte un vecteur de caractéristiques qui est mis à jour à chaque couche en agrégeant les vecteurs de ses voisin</w:t>
-      </w:r>
-      <w:r>
-        <w:rPr>
-          <w:sz w:val="18"/>
-          <w:szCs w:val="18"/>
-        </w:rPr>
-        <w:t>s immédiats. Après plusieurs couches d’agrégation, chaque nœud encode l’information de son voisinage à plusieurs sauts, ce qui permet au modèle de tenir compte de la structure relationnelle pour classifier ou regrouper.</w:t>
+        <w:t xml:space="preserve"> Dans un réseau de neurones sur graphes, chaque nœud porte un vecteur de caractéristiques qui est mis à jour à chaque couche en agrégeant les vecteurs de ses voisins immédiats. Après plusieurs couches d’agrégation, chaque nœud encode l’information de son voisinage à plusieurs sauts, ce qui permet au modèle de tenir compte de la structure relationnelle pour classifier ou regrouper.</w:t>
       </w:r>
     </w:p>
   </w:footnote>
@@ -9834,21 +9527,7 @@
           <w:sz w:val="18"/>
           <w:szCs w:val="18"/>
         </w:rPr>
-        <w:t xml:space="preserve"> La matrice de Gram d’un ensemble d</w:t>
-      </w:r>
-      <w:r>
-        <w:rPr>
-          <w:sz w:val="18"/>
-          <w:szCs w:val="18"/>
-        </w:rPr>
-        <w:t xml:space="preserve">e vecteurs est le tableau de tous leurs produits scalaires deux à deux. Dans le contexte des CNN, on la calcule sur les activations d’une couche en traitant chaque feature map (carte produite par un filtre) comme un vecteur : la matrice obtenue mesure les </w:t>
-      </w:r>
-      <w:r>
-        <w:rPr>
-          <w:sz w:val="18"/>
-          <w:szCs w:val="18"/>
-        </w:rPr>
-        <w:t>corrélations entre filtres indépendamment de leur position spatiale. C’est précisément cette absence de localisation qui en fait un descripteur de style et non de contenu.</w:t>
+        <w:t xml:space="preserve"> La matrice de Gram d’un ensemble de vecteurs est le tableau de tous leurs produits scalaires deux à deux. Dans le contexte des CNN, on la calcule sur les activations d’une couche en traitant chaque feature map (carte produite par un filtre) comme un vecteur : la matrice obtenue mesure les corrélations entre filtres indépendamment de leur position spatiale. C’est précisément cette absence de localisation qui en fait un descripteur de style et non de contenu.</w:t>
       </w:r>
     </w:p>
   </w:footnote>
@@ -9869,21 +9548,7 @@
           <w:sz w:val="18"/>
           <w:szCs w:val="18"/>
         </w:rPr>
-        <w:t xml:space="preserve"> ResNet introduit des connexions résiduelles : chaque bloc du réseau apprend non pa</w:t>
-      </w:r>
-      <w:r>
-        <w:rPr>
-          <w:sz w:val="18"/>
-          <w:szCs w:val="18"/>
-        </w:rPr>
-        <w:t>s la transformation complète f(x) du signal d’entrée x, mais l’écart f(x) − x. Cette astuce architecturale permet d’entraîner des réseaux beaucoup plus profonds (jusqu’à plusieurs centaines de couches) en stabilisant la propagation du gradient pendant l’ap</w:t>
-      </w:r>
-      <w:r>
-        <w:rPr>
-          <w:sz w:val="18"/>
-          <w:szCs w:val="18"/>
-        </w:rPr>
-        <w:t>prentissage.</w:t>
+        <w:t xml:space="preserve"> ResNet introduit des connexions résiduelles : chaque bloc du réseau apprend non pas la transformation complète f(x) du signal d’entrée x, mais l’écart f(x) − x. Cette astuce architecturale permet d’entraîner des réseaux beaucoup plus profonds (jusqu’à plusieurs centaines de couches) en stabilisant la propagation du gradient pendant l’apprentissage.</w:t>
       </w:r>
     </w:p>
   </w:footnote>
@@ -9904,14 +9569,7 @@
           <w:sz w:val="18"/>
           <w:szCs w:val="18"/>
         </w:rPr>
-        <w:t xml:space="preserve"> Le mécanisme d’attention (Vaswani et al., 2017) calcule, pour chaque élément d’une séquence : mot d’une phrase, patch d’image, un score d’affinité avec tous les autres éléments. Ces scores, normalisés, déterminent quels autres éléments le mo</w:t>
-      </w:r>
-      <w:r>
-        <w:rPr>
-          <w:sz w:val="18"/>
-          <w:szCs w:val="18"/>
-        </w:rPr>
-        <w:t>dèle prend en compte pour traiter celui-là. C’est ce mécanisme qui permet aux Transformers de capter des relations à longue distance dans une image, là où les CNN ne combinent que des informations spatialement voisines.</w:t>
+        <w:t xml:space="preserve"> Le mécanisme d’attention (Vaswani et al., 2017) calcule, pour chaque élément d’une séquence : mot d’une phrase, patch d’image, un score d’affinité avec tous les autres éléments. Ces scores, normalisés, déterminent quels autres éléments le modèle prend en compte pour traiter celui-là. C’est ce mécanisme qui permet aux Transformers de capter des relations à longue distance dans une image, là où les CNN ne combinent que des informations spatialement voisines.</w:t>
       </w:r>
     </w:p>
   </w:footnote>
@@ -9932,28 +9590,7 @@
           <w:sz w:val="18"/>
           <w:szCs w:val="18"/>
         </w:rPr>
-        <w:t xml:space="preserve"> Littéralement transfert d’apprenti</w:t>
-      </w:r>
-      <w:r>
-        <w:rPr>
-          <w:sz w:val="18"/>
-          <w:szCs w:val="18"/>
-        </w:rPr>
-        <w:t>ssage. Le terme français existe mais l’usage anglais reste dominant dans la littérature francophone. Le principe est de tirer parti des représentations visuelles génériques apprises par un modèle sur un très grand corpus (typiquement des images photographi</w:t>
-      </w:r>
-      <w:r>
-        <w:rPr>
-          <w:sz w:val="18"/>
-          <w:szCs w:val="18"/>
-        </w:rPr>
-        <w:t xml:space="preserve">ques courantes) pour résoudre un nouveau problème, en n’ayant à ajuster que les dernières couches du modèle avec un petit nombre d’exemples spécifiques. Cette stratégie réduit considérablement les besoins en données d’entraînement mais transfère aussi les </w:t>
-      </w:r>
-      <w:r>
-        <w:rPr>
-          <w:sz w:val="18"/>
-          <w:szCs w:val="18"/>
-        </w:rPr>
-        <w:t>biais du corpus initial.</w:t>
+        <w:t xml:space="preserve"> Littéralement transfert d’apprentissage. Le terme français existe mais l’usage anglais reste dominant dans la littérature francophone. Le principe est de tirer parti des représentations visuelles génériques apprises par un modèle sur un très grand corpus (typiquement des images photographiques courantes) pour résoudre un nouveau problème, en n’ayant à ajuster que les dernières couches du modèle avec un petit nombre d’exemples spécifiques. Cette stratégie réduit considérablement les besoins en données d’entraînement mais transfère aussi les biais du corpus initial.</w:t>
       </w:r>
     </w:p>
   </w:footnote>
@@ -9974,14 +9611,7 @@
           <w:sz w:val="18"/>
           <w:szCs w:val="18"/>
         </w:rPr>
-        <w:t xml:space="preserve"> ImageNet (Deng et al., 2009) est une base de données de plus de quatorze millions d’images photographiques étiquetées manuellement selon une taxonomie de plus de 20 000 catégories d’objets. La compétition annuelle ILSVRC organisé</w:t>
-      </w:r>
-      <w:r>
-        <w:rPr>
-          <w:sz w:val="18"/>
-          <w:szCs w:val="18"/>
-        </w:rPr>
-        <w:t>e sur un sous-ensemble de cette base a été le moteur principal du développement des CNN entre 2012 et 2017.</w:t>
+        <w:t xml:space="preserve"> ImageNet (Deng et al., 2009) est une base de données de plus de quatorze millions d’images photographiques étiquetées manuellement selon une taxonomie de plus de 20 000 catégories d’objets. La compétition annuelle ILSVRC organisée sur un sous-ensemble de cette base a été le moteur principal du développement des CNN entre 2012 et 2017.</w:t>
       </w:r>
     </w:p>
   </w:footnote>
@@ -10002,21 +9632,7 @@
           <w:sz w:val="18"/>
           <w:szCs w:val="18"/>
         </w:rPr>
-        <w:t xml:space="preserve"> La valeur de Shapley est issue de la théorie des jeux coopératifs (Shapley, 1953). Elle répartit équitablement le gain d’un jeu entre plusieurs jo</w:t>
-      </w:r>
-      <w:r>
-        <w:rPr>
-          <w:sz w:val="18"/>
-          <w:szCs w:val="18"/>
-        </w:rPr>
-        <w:t>ueurs en fonction de leur contribution marginale moyenne, calculée sur toutes les manières possibles d’ajouter ce joueur à un sous-groupe préexistant. Appliquée à un modèle prédictif, chaque caractéristique de l’image joue le rôle d’un joueur, et sa valeur</w:t>
-      </w:r>
-      <w:r>
-        <w:rPr>
-          <w:sz w:val="18"/>
-          <w:szCs w:val="18"/>
-        </w:rPr>
-        <w:t xml:space="preserve"> de Shapley mesure sa contribution moyenne à la prédiction.</w:t>
+        <w:t xml:space="preserve"> La valeur de Shapley est issue de la théorie des jeux coopératifs (Shapley, 1953). Elle répartit équitablement le gain d’un jeu entre plusieurs joueurs en fonction de leur contribution marginale moyenne, calculée sur toutes les manières possibles d’ajouter ce joueur à un sous-groupe préexistant. Appliquée à un modèle prédictif, chaque caractéristique de l’image joue le rôle d’un joueur, et sa valeur de Shapley mesure sa contribution moyenne à la prédiction.</w:t>
       </w:r>
     </w:p>
   </w:footnote>
@@ -10037,14 +9653,7 @@
           <w:sz w:val="18"/>
           <w:szCs w:val="18"/>
         </w:rPr>
-        <w:t xml:space="preserve"> L’augmentation de données consiste à enrichir artificiellement le corpus d’entraînement en générant des variantes des images originales (rotations, recadrages, ajustements de couleurs, ajouts de</w:t>
-      </w:r>
-      <w:r>
-        <w:rPr>
-          <w:sz w:val="18"/>
-          <w:szCs w:val="18"/>
-        </w:rPr>
-        <w:t xml:space="preserve"> bruit, retournements miroir). Ces variantes obligent le modèle à apprendre des caractéristiques invariantes aux transformations appliquées et améliorent sa capacité de généralisation à des images nouvelles.</w:t>
+        <w:t xml:space="preserve"> L’augmentation de données consiste à enrichir artificiellement le corpus d’entraînement en générant des variantes des images originales (rotations, recadrages, ajustements de couleurs, ajouts de bruit, retournements miroir). Ces variantes obligent le modèle à apprendre des caractéristiques invariantes aux transformations appliquées et améliorent sa capacité de généralisation à des images nouvelles.</w:t>
       </w:r>
     </w:p>
   </w:footnote>
@@ -10065,21 +9674,7 @@
           <w:sz w:val="18"/>
           <w:szCs w:val="18"/>
         </w:rPr>
-        <w:t xml:space="preserve"> Un exemple adversarial est une image légèremen</w:t>
-      </w:r>
-      <w:r>
-        <w:rPr>
-          <w:sz w:val="18"/>
-          <w:szCs w:val="18"/>
-        </w:rPr>
-        <w:t xml:space="preserve">t perturbée, d’une quantité imperceptible à l’œil humain, qui fait basculer la prédiction du modèle vers une catégorie erronée. Goodfellow, Shlens et Szegedy (2015) ont introduit la méthode FGSM (Fast Gradient Sign Method) qui produit ces perturbations en </w:t>
-      </w:r>
-      <w:r>
-        <w:rPr>
-          <w:sz w:val="18"/>
-          <w:szCs w:val="18"/>
-        </w:rPr>
-        <w:t>suivant le gradient de la fonction de perte. La résistance d’un modèle à de telles perturbations mesure sa robustesse.</w:t>
+        <w:t xml:space="preserve"> Un exemple adversarial est une image légèrement perturbée, d’une quantité imperceptible à l’œil humain, qui fait basculer la prédiction du modèle vers une catégorie erronée. Goodfellow, Shlens et Szegedy (2015) ont introduit la méthode FGSM (Fast Gradient Sign Method) qui produit ces perturbations en suivant le gradient de la fonction de perte. La résistance d’un modèle à de telles perturbations mesure sa robustesse.</w:t>
       </w:r>
     </w:p>
   </w:footnote>
@@ -10100,21 +9695,7 @@
           <w:sz w:val="18"/>
           <w:szCs w:val="18"/>
         </w:rPr>
-        <w:t xml:space="preserve"> En IA générative, on parle d’hallucination lorsqu’un modèle de langage produit avec aplomb une information fausse : un nom d’auteur att</w:t>
-      </w:r>
-      <w:r>
-        <w:rPr>
-          <w:sz w:val="18"/>
-          <w:szCs w:val="18"/>
-        </w:rPr>
-        <w:t>ribué à tort à une œuvre, une référence bibliographique fabriquée, une description d’un élément absent de l’image. Le phénomène est inhérent au mode de production statistique des modèles et concerne, même sur les modèles à l’état de l’art, un pourcentage n</w:t>
-      </w:r>
-      <w:r>
-        <w:rPr>
-          <w:sz w:val="18"/>
-          <w:szCs w:val="18"/>
-        </w:rPr>
-        <w:t>on négligeable des réponses.</w:t>
+        <w:t xml:space="preserve"> En IA générative, on parle d’hallucination lorsqu’un modèle de langage produit avec aplomb une information fausse : un nom d’auteur attribué à tort à une œuvre, une référence bibliographique fabriquée, une description d’un élément absent de l’image. Le phénomène est inhérent au mode de production statistique des modèles et concerne, même sur les modèles à l’état de l’art, un pourcentage non négligeable des réponses.</w:t>
       </w:r>
     </w:p>
   </w:footnote>
@@ -10135,21 +9716,7 @@
           <w:sz w:val="18"/>
           <w:szCs w:val="18"/>
         </w:rPr>
-        <w:t xml:space="preserve"> </w:t>
-      </w:r>
-      <w:r>
-        <w:rPr>
-          <w:sz w:val="18"/>
-          <w:szCs w:val="18"/>
-        </w:rPr>
-        <w:t>L’algorithme k-means partitionne un ensemble de points en k groupes (k étant choisi à l’avance) par itération de deux étapes : (1) assigner chaque point au centre de groupe le plus proche ; (2) recalculer chaque centre comme la moyenne des points qui lui s</w:t>
-      </w:r>
-      <w:r>
-        <w:rPr>
-          <w:sz w:val="18"/>
-          <w:szCs w:val="18"/>
-        </w:rPr>
-        <w:t>ont assignés. La méthode converge vers un optimum local de la distance intra-groupe en quelques itérations.</w:t>
+        <w:t xml:space="preserve"> L’algorithme k-means partitionne un ensemble de points en k groupes (k étant choisi à l’avance) par itération de deux étapes : (1) assigner chaque point au centre de groupe le plus proche ; (2) recalculer chaque centre comme la moyenne des points qui lui sont assignés. La méthode converge vers un optimum local de la distance intra-groupe en quelques itérations.</w:t>
       </w:r>
     </w:p>
   </w:footnote>
@@ -10170,14 +9737,7 @@
           <w:sz w:val="18"/>
           <w:szCs w:val="18"/>
         </w:rPr>
-        <w:t xml:space="preserve"> Un groupe dense est un ensemble de points qui sont mutuellement proches dans l’espace des descripteurs, en comparaison avec la densité environnant</w:t>
-      </w:r>
-      <w:r>
-        <w:rPr>
-          <w:sz w:val="18"/>
-          <w:szCs w:val="18"/>
-        </w:rPr>
-        <w:t>e. Concrètement, HDBSCAN identifie des zones où la concentration de points est significativement plus élevée que la moyenne ; les points isolés dans des zones peu peuplées sont signalés comme aberrants plutôt que rattachés de force à un groupe.</w:t>
+        <w:t xml:space="preserve"> Un groupe dense est un ensemble de points qui sont mutuellement proches dans l’espace des descripteurs, en comparaison avec la densité environnante. Concrètement, HDBSCAN identifie des zones où la concentration de points est significativement plus élevée que la moyenne ; les points isolés dans des zones peu peuplées sont signalés comme aberrants plutôt que rattachés de force à un groupe.</w:t>
       </w:r>
     </w:p>
   </w:footnote>
@@ -10198,21 +9758,7 @@
           <w:sz w:val="18"/>
           <w:szCs w:val="18"/>
         </w:rPr>
-        <w:t xml:space="preserve"> t-SNE mod</w:t>
-      </w:r>
-      <w:r>
-        <w:rPr>
-          <w:sz w:val="18"/>
-          <w:szCs w:val="18"/>
-        </w:rPr>
-        <w:t>élise les similarités entre points par des distributions de probabilité (gaussiennes dans l’espace d’origine, t de Student dans la projection) et ajuste les positions projetées pour rendre ces distributions aussi proches que possible. UMAP repose de son cô</w:t>
-      </w:r>
-      <w:r>
-        <w:rPr>
-          <w:sz w:val="18"/>
-          <w:szCs w:val="18"/>
-        </w:rPr>
-        <w:t>té sur une formalisation de la structure de voisinage par la théorie des variétés ; il produit des projections comparables à t-SNE mais plus rapides et préserve un peu mieux la structure globale du nuage de points.</w:t>
+        <w:t xml:space="preserve"> t-SNE modélise les similarités entre points par des distributions de probabilité (gaussiennes dans l’espace d’origine, t de Student dans la projection) et ajuste les positions projetées pour rendre ces distributions aussi proches que possible. UMAP repose de son côté sur une formalisation de la structure de voisinage par la théorie des variétés ; il produit des projections comparables à t-SNE mais plus rapides et préserve un peu mieux la structure globale du nuage de points.</w:t>
       </w:r>
     </w:p>
   </w:footnote>
@@ -10233,21 +9779,7 @@
           <w:sz w:val="18"/>
           <w:szCs w:val="18"/>
         </w:rPr>
-        <w:t xml:space="preserve"> Le traitement automatique des langues (</w:t>
-      </w:r>
-      <w:r>
-        <w:rPr>
-          <w:sz w:val="18"/>
-          <w:szCs w:val="18"/>
-        </w:rPr>
-        <w:t>TAL ; Natural Language Processing ou NLP en anglais) regroupe les méthodes informatiques d’analyse et de génération de texte : extraction d’entités nommées, classification thématique, résumé automatique, traduction, et plus largement toute manipulation alg</w:t>
-      </w:r>
-      <w:r>
-        <w:rPr>
-          <w:sz w:val="18"/>
-          <w:szCs w:val="18"/>
-        </w:rPr>
-        <w:t>orithmique d’énoncés en langue naturelle.</w:t>
+        <w:t xml:space="preserve"> Le traitement automatique des langues (TAL ; Natural Language Processing ou NLP en anglais) regroupe les méthodes informatiques d’analyse et de génération de texte : extraction d’entités nommées, classification thématique, résumé automatique, traduction, et plus largement toute manipulation algorithmique d’énoncés en langue naturelle.</w:t>
       </w:r>
     </w:p>
   </w:footnote>
@@ -10268,14 +9800,7 @@
           <w:sz w:val="18"/>
           <w:szCs w:val="18"/>
         </w:rPr>
-        <w:t xml:space="preserve"> En cladistique, une synapomorphie est un caractère dérivé partagé par deux objets ou plus, hérité d’un ancêtre commun mais absent des ancêtres plus éloignés. C’est sur la distribution de ces caractères que repose</w:t>
-      </w:r>
-      <w:r>
-        <w:rPr>
-          <w:sz w:val="18"/>
-          <w:szCs w:val="18"/>
-        </w:rPr>
-        <w:t xml:space="preserve"> la reconstruction des arbres : deux objets partageant de nombreuses synapomorphies sont considérés comme apparentés.</w:t>
+        <w:t xml:space="preserve"> En cladistique, une synapomorphie est un caractère dérivé partagé par deux objets ou plus, hérité d’un ancêtre commun mais absent des ancêtres plus éloignés. C’est sur la distribution de ces caractères que repose la reconstruction des arbres : deux objets partageant de nombreuses synapomorphies sont considérés comme apparentés.</w:t>
       </w:r>
     </w:p>
   </w:footnote>
@@ -10296,14 +9821,7 @@
           <w:sz w:val="18"/>
           <w:szCs w:val="18"/>
         </w:rPr>
-        <w:t xml:space="preserve"> PAUP (Phylogenetic Analysis Using Parsimony) est l’un des logiciels les plus utilisés pour les reconstructions phylogénétiques par maxim</w:t>
-      </w:r>
-      <w:r>
-        <w:rPr>
-          <w:sz w:val="18"/>
-          <w:szCs w:val="18"/>
-        </w:rPr>
-        <w:t>um de parcimonie ; il offre également des fonctions de Neighbor-Joining et d’inférence bayésienne, ainsi que des outils de bootstrap intégrés.</w:t>
+        <w:t xml:space="preserve"> PAUP (Phylogenetic Analysis Using Parsimony) est l’un des logiciels les plus utilisés pour les reconstructions phylogénétiques par maximum de parcimonie ; il offre également des fonctions de Neighbor-Joining et d’inférence bayésienne, ainsi que des outils de bootstrap intégrés.</w:t>
       </w:r>
     </w:p>
   </w:footnote>
@@ -10324,14 +9842,7 @@
           <w:sz w:val="18"/>
           <w:szCs w:val="18"/>
         </w:rPr>
-        <w:t xml:space="preserve"> L’algorithme Neighbor-Joining (Saitou et Nei, 1987) construit un arbre en regroupant itérativement les paires d</w:t>
-      </w:r>
-      <w:r>
-        <w:rPr>
-          <w:sz w:val="18"/>
-          <w:szCs w:val="18"/>
-        </w:rPr>
-        <w:t>’objets dont la distance corrigée est la plus faible. Très rapide, il est largement utilisé en phylogénétique moléculaire et constitue une alternative efficace aux méthodes par parcimonie maximale, plus coûteuses en calcul.</w:t>
+        <w:t xml:space="preserve"> L’algorithme Neighbor-Joining (Saitou et Nei, 1987) construit un arbre en regroupant itérativement les paires d’objets dont la distance corrigée est la plus faible. Très rapide, il est largement utilisé en phylogénétique moléculaire et constitue une alternative efficace aux méthodes par parcimonie maximale, plus coûteuses en calcul.</w:t>
       </w:r>
     </w:p>
   </w:footnote>
@@ -10352,21 +9863,7 @@
           <w:sz w:val="18"/>
           <w:szCs w:val="18"/>
         </w:rPr>
-        <w:t xml:space="preserve"> La split decomposition (Bandel</w:t>
-      </w:r>
-      <w:r>
-        <w:rPr>
-          <w:sz w:val="18"/>
-          <w:szCs w:val="18"/>
-        </w:rPr>
-        <w:t>t et Dress, 1992) généralise la notion d’arbre à celle de réseau phylogénétique, dans lequel un nœud peut avoir plusieurs ancêtres immédiats. Cette représentation est particulièrement adaptée aux traditions évolutives non strictement arborescentes, par exe</w:t>
-      </w:r>
-      <w:r>
-        <w:rPr>
-          <w:sz w:val="18"/>
-          <w:szCs w:val="18"/>
-        </w:rPr>
-        <w:t>mple les traditions manuscrites où un copiste consulte plusieurs sources, ou les influences artistiques croisées entre courants.</w:t>
+        <w:t xml:space="preserve"> La split decomposition (Bandelt et Dress, 1992) généralise la notion d’arbre à celle de réseau phylogénétique, dans lequel un nœud peut avoir plusieurs ancêtres immédiats. Cette représentation est particulièrement adaptée aux traditions évolutives non strictement arborescentes, par exemple les traditions manuscrites où un copiste consulte plusieurs sources, ou les influences artistiques croisées entre courants.</w:t>
       </w:r>
     </w:p>
   </w:footnote>
@@ -10387,21 +9884,7 @@
           <w:sz w:val="18"/>
           <w:szCs w:val="18"/>
         </w:rPr>
-        <w:t xml:space="preserve"> Le bootstrap statistique (Efron, 1979) consiste à rejouer une analyse sur de nombreux sous-échantillons tirés au sort, avec r</w:t>
-      </w:r>
-      <w:r>
-        <w:rPr>
-          <w:sz w:val="18"/>
-          <w:szCs w:val="18"/>
-        </w:rPr>
-        <w:t>emise, des données initiales. Appliqué à la phylogénétique (Felsenstein, 1985), il revient à reconstruire un grand nombre d’arbres en sous-échantillonnant les caractères ; la fréquence à laquelle une même branche apparaît dans ces arbres mesure sa robustes</w:t>
-      </w:r>
-      <w:r>
-        <w:rPr>
-          <w:sz w:val="18"/>
-          <w:szCs w:val="18"/>
-        </w:rPr>
-        <w:t>se. Une branche présente dans plus de 70 à 80 % des réplications est généralement considérée comme statistiquement fiable.</w:t>
+        <w:t xml:space="preserve"> Le bootstrap statistique (Efron, 1979) consiste à rejouer une analyse sur de nombreux sous-échantillons tirés au sort, avec remise, des données initiales. Appliqué à la phylogénétique (Felsenstein, 1985), il revient à reconstruire un grand nombre d’arbres en sous-échantillonnant les caractères ; la fréquence à laquelle une même branche apparaît dans ces arbres mesure sa robustesse. Une branche présente dans plus de 70 à 80 % des réplications est généralement considérée comme statistiquement fiable.</w:t>
       </w:r>
     </w:p>
   </w:footnote>
@@ -10764,6 +10247,13 @@
     <w:lsdException w:name="Placeholder Text" w:semiHidden="1"/>
     <w:lsdException w:name="Light Shading"/>
     <w:lsdException w:name="Light List"/>
+    <w:lsdException w:name="Light Grid"/>
+    <w:lsdException w:name="Medium Shading 1"/>
+    <w:lsdException w:name="Medium Shading 2"/>
+    <w:lsdException w:name="Medium List 1"/>
+    <w:lsdException w:name="Medium List 2"/>
+    <w:lsdException w:name="Medium Grid 1"/>
+    <w:lsdException w:name="Medium Grid 2"/>
     <w:lsdException w:name="Medium Grid 3"/>
     <w:lsdException w:name="Dark List"/>
     <w:lsdException w:name="Colorful Shading"/>

</xml_diff>